<commit_message>
enforce body page numbering after toc
</commit_message>
<xml_diff>
--- a/docs/deep-learning-architecture-report-demo.docx
+++ b/docs/deep-learning-architecture-report-demo.docx
@@ -38,7 +38,7 @@
           <w:b/>
           <w:sz w:val="36"/>
         </w:rPr>
-        <w:t>《深度学习课程》</w:t>
+        <w:t>《深度学习》</w:t>
       </w:r>
     </w:p>
     <w:p>
@@ -91,7 +91,7 @@
         <w:rPr>
           <w:sz w:val="26"/>
         </w:rPr>
-        <w:t>深度学习模型发展历程与最新架构调研报告</w:t>
+        <w:t>深度学习模型发展历程与最新架构调研</w:t>
       </w:r>
     </w:p>
     <w:p>
@@ -117,13 +117,7 @@
         <w:rPr>
           <w:sz w:val="24"/>
         </w:rPr>
-        <w:t xml:space="preserve">    </w:t>
-      </w:r>
-      <w:r>
-        <w:rPr>
-          <w:sz w:val="24"/>
-        </w:rPr>
-        <w:t>未提供</w:t>
+        <w:t xml:space="preserve">    ________________________________</w:t>
       </w:r>
     </w:p>
     <w:p>
@@ -149,13 +143,7 @@
         <w:rPr>
           <w:sz w:val="24"/>
         </w:rPr>
-        <w:t xml:space="preserve">    </w:t>
-      </w:r>
-      <w:r>
-        <w:rPr>
-          <w:sz w:val="24"/>
-        </w:rPr>
-        <w:t>未提供</w:t>
+        <w:t xml:space="preserve">    ________________________________</w:t>
       </w:r>
     </w:p>
     <w:p>
@@ -182,13 +170,7 @@
         <w:rPr>
           <w:sz w:val="24"/>
         </w:rPr>
-        <w:t xml:space="preserve">    </w:t>
-      </w:r>
-      <w:r>
-        <w:rPr>
-          <w:sz w:val="24"/>
-        </w:rPr>
-        <w:t>未提供</w:t>
+        <w:t xml:space="preserve">    ________________________________</w:t>
       </w:r>
     </w:p>
     <w:p>
@@ -215,13 +197,7 @@
         <w:rPr>
           <w:sz w:val="24"/>
         </w:rPr>
-        <w:t xml:space="preserve">    </w:t>
-      </w:r>
-      <w:r>
-        <w:rPr>
-          <w:sz w:val="24"/>
-        </w:rPr>
-        <w:t>未提供</w:t>
+        <w:t xml:space="preserve">    ________________________________</w:t>
       </w:r>
     </w:p>
     <w:p>
@@ -255,7 +231,7 @@
         <w:rPr>
           <w:sz w:val="24"/>
         </w:rPr>
-        <w:t>未提供</w:t>
+        <w:t>________________________________</w:t>
       </w:r>
     </w:p>
     <w:p>
@@ -273,7 +249,7 @@
         <w:rPr>
           <w:sz w:val="24"/>
         </w:rPr>
-        <w:t>2026</w:t>
+        <w:t xml:space="preserve">2026 </w:t>
       </w:r>
       <w:r>
         <w:rPr>
@@ -285,7 +261,7 @@
         <w:rPr>
           <w:sz w:val="24"/>
         </w:rPr>
-        <w:t>6</w:t>
+        <w:t xml:space="preserve"> 6 </w:t>
       </w:r>
       <w:r>
         <w:rPr>
@@ -297,7 +273,7 @@
         <w:rPr>
           <w:sz w:val="24"/>
         </w:rPr>
-        <w:t>12</w:t>
+        <w:t xml:space="preserve"> 12 </w:t>
       </w:r>
       <w:r>
         <w:rPr>
@@ -372,7 +348,7 @@
       <w:r>
         <w:fldChar w:fldCharType="separate"/>
       </w:r>
-      <w:hyperlink w:anchor="_Toc232181181" w:history="1">
+      <w:hyperlink w:anchor="_Toc232187408" w:history="1">
         <w:r>
           <w:rPr>
             <w:rStyle w:val="af2"/>
@@ -441,7 +417,7 @@
             <w:noProof/>
             <w:webHidden/>
           </w:rPr>
-          <w:instrText xml:space="preserve"> PAGEREF _Toc232181181 \h </w:instrText>
+          <w:instrText xml:space="preserve"> PAGEREF _Toc232187408 \h </w:instrText>
         </w:r>
         <w:r>
           <w:rPr>
@@ -461,7 +437,7 @@
             <w:noProof/>
             <w:webHidden/>
           </w:rPr>
-          <w:t>2</w:t>
+          <w:t>1</w:t>
         </w:r>
         <w:r>
           <w:rPr>
@@ -482,7 +458,7 @@
           <w14:ligatures w14:val="standardContextual"/>
         </w:rPr>
       </w:pPr>
-      <w:hyperlink w:anchor="_Toc232181182" w:history="1">
+      <w:hyperlink w:anchor="_Toc232187409" w:history="1">
         <w:r>
           <w:rPr>
             <w:rStyle w:val="af2"/>
@@ -523,7 +499,7 @@
             <w:noProof/>
             <w:webHidden/>
           </w:rPr>
-          <w:instrText xml:space="preserve"> PAGEREF _Toc232181182 \h </w:instrText>
+          <w:instrText xml:space="preserve"> PAGEREF _Toc232187409 \h </w:instrText>
         </w:r>
         <w:r>
           <w:rPr>
@@ -543,7 +519,7 @@
             <w:noProof/>
             <w:webHidden/>
           </w:rPr>
-          <w:t>2</w:t>
+          <w:t>1</w:t>
         </w:r>
         <w:r>
           <w:rPr>
@@ -565,7 +541,7 @@
           <w14:ligatures w14:val="standardContextual"/>
         </w:rPr>
       </w:pPr>
-      <w:hyperlink w:anchor="_Toc232181183" w:history="1">
+      <w:hyperlink w:anchor="_Toc232187410" w:history="1">
         <w:r>
           <w:rPr>
             <w:rStyle w:val="af2"/>
@@ -599,7 +575,7 @@
             <w:noProof/>
             <w:webHidden/>
           </w:rPr>
-          <w:instrText xml:space="preserve"> PAGEREF _Toc232181183 \h </w:instrText>
+          <w:instrText xml:space="preserve"> PAGEREF _Toc232187410 \h </w:instrText>
         </w:r>
         <w:r>
           <w:rPr>
@@ -619,7 +595,7 @@
             <w:noProof/>
             <w:webHidden/>
           </w:rPr>
-          <w:t>2</w:t>
+          <w:t>1</w:t>
         </w:r>
         <w:r>
           <w:rPr>
@@ -641,7 +617,7 @@
           <w14:ligatures w14:val="standardContextual"/>
         </w:rPr>
       </w:pPr>
-      <w:hyperlink w:anchor="_Toc232181184" w:history="1">
+      <w:hyperlink w:anchor="_Toc232187411" w:history="1">
         <w:r>
           <w:rPr>
             <w:rStyle w:val="af2"/>
@@ -675,7 +651,7 @@
             <w:noProof/>
             <w:webHidden/>
           </w:rPr>
-          <w:instrText xml:space="preserve"> PAGEREF _Toc232181184 \h </w:instrText>
+          <w:instrText xml:space="preserve"> PAGEREF _Toc232187411 \h </w:instrText>
         </w:r>
         <w:r>
           <w:rPr>
@@ -695,7 +671,7 @@
             <w:noProof/>
             <w:webHidden/>
           </w:rPr>
-          <w:t>3</w:t>
+          <w:t>2</w:t>
         </w:r>
         <w:r>
           <w:rPr>
@@ -717,7 +693,7 @@
           <w14:ligatures w14:val="standardContextual"/>
         </w:rPr>
       </w:pPr>
-      <w:hyperlink w:anchor="_Toc232181185" w:history="1">
+      <w:hyperlink w:anchor="_Toc232187412" w:history="1">
         <w:r>
           <w:rPr>
             <w:rStyle w:val="af2"/>
@@ -765,7 +741,7 @@
             <w:noProof/>
             <w:webHidden/>
           </w:rPr>
-          <w:instrText xml:space="preserve"> PAGEREF _Toc232181185 \h </w:instrText>
+          <w:instrText xml:space="preserve"> PAGEREF _Toc232187412 \h </w:instrText>
         </w:r>
         <w:r>
           <w:rPr>
@@ -785,7 +761,7 @@
             <w:noProof/>
             <w:webHidden/>
           </w:rPr>
-          <w:t>3</w:t>
+          <w:t>2</w:t>
         </w:r>
         <w:r>
           <w:rPr>
@@ -807,7 +783,7 @@
           <w14:ligatures w14:val="standardContextual"/>
         </w:rPr>
       </w:pPr>
-      <w:hyperlink w:anchor="_Toc232181186" w:history="1">
+      <w:hyperlink w:anchor="_Toc232187413" w:history="1">
         <w:r>
           <w:rPr>
             <w:rStyle w:val="af2"/>
@@ -841,7 +817,7 @@
             <w:noProof/>
             <w:webHidden/>
           </w:rPr>
-          <w:instrText xml:space="preserve"> PAGEREF _Toc232181186 \h </w:instrText>
+          <w:instrText xml:space="preserve"> PAGEREF _Toc232187413 \h </w:instrText>
         </w:r>
         <w:r>
           <w:rPr>
@@ -861,7 +837,7 @@
             <w:noProof/>
             <w:webHidden/>
           </w:rPr>
-          <w:t>4</w:t>
+          <w:t>3</w:t>
         </w:r>
         <w:r>
           <w:rPr>
@@ -882,7 +858,7 @@
           <w14:ligatures w14:val="standardContextual"/>
         </w:rPr>
       </w:pPr>
-      <w:hyperlink w:anchor="_Toc232181187" w:history="1">
+      <w:hyperlink w:anchor="_Toc232187414" w:history="1">
         <w:r>
           <w:rPr>
             <w:rStyle w:val="af2"/>
@@ -923,7 +899,7 @@
             <w:noProof/>
             <w:webHidden/>
           </w:rPr>
-          <w:instrText xml:space="preserve"> PAGEREF _Toc232181187 \h </w:instrText>
+          <w:instrText xml:space="preserve"> PAGEREF _Toc232187414 \h </w:instrText>
         </w:r>
         <w:r>
           <w:rPr>
@@ -943,7 +919,7 @@
             <w:noProof/>
             <w:webHidden/>
           </w:rPr>
-          <w:t>4</w:t>
+          <w:t>3</w:t>
         </w:r>
         <w:r>
           <w:rPr>
@@ -965,7 +941,7 @@
           <w14:ligatures w14:val="standardContextual"/>
         </w:rPr>
       </w:pPr>
-      <w:hyperlink w:anchor="_Toc232181188" w:history="1">
+      <w:hyperlink w:anchor="_Toc232187415" w:history="1">
         <w:r>
           <w:rPr>
             <w:rStyle w:val="af2"/>
@@ -999,7 +975,7 @@
             <w:noProof/>
             <w:webHidden/>
           </w:rPr>
-          <w:instrText xml:space="preserve"> PAGEREF _Toc232181188 \h </w:instrText>
+          <w:instrText xml:space="preserve"> PAGEREF _Toc232187415 \h </w:instrText>
         </w:r>
         <w:r>
           <w:rPr>
@@ -1019,7 +995,7 @@
             <w:noProof/>
             <w:webHidden/>
           </w:rPr>
-          <w:t>4</w:t>
+          <w:t>3</w:t>
         </w:r>
         <w:r>
           <w:rPr>
@@ -1041,7 +1017,7 @@
           <w14:ligatures w14:val="standardContextual"/>
         </w:rPr>
       </w:pPr>
-      <w:hyperlink w:anchor="_Toc232181189" w:history="1">
+      <w:hyperlink w:anchor="_Toc232187416" w:history="1">
         <w:r>
           <w:rPr>
             <w:rStyle w:val="af2"/>
@@ -1075,7 +1051,7 @@
             <w:noProof/>
             <w:webHidden/>
           </w:rPr>
-          <w:instrText xml:space="preserve"> PAGEREF _Toc232181189 \h </w:instrText>
+          <w:instrText xml:space="preserve"> PAGEREF _Toc232187416 \h </w:instrText>
         </w:r>
         <w:r>
           <w:rPr>
@@ -1095,7 +1071,7 @@
             <w:noProof/>
             <w:webHidden/>
           </w:rPr>
-          <w:t>5</w:t>
+          <w:t>4</w:t>
         </w:r>
         <w:r>
           <w:rPr>
@@ -1117,7 +1093,7 @@
           <w14:ligatures w14:val="standardContextual"/>
         </w:rPr>
       </w:pPr>
-      <w:hyperlink w:anchor="_Toc232181190" w:history="1">
+      <w:hyperlink w:anchor="_Toc232187417" w:history="1">
         <w:r>
           <w:rPr>
             <w:rStyle w:val="af2"/>
@@ -1151,7 +1127,7 @@
             <w:noProof/>
             <w:webHidden/>
           </w:rPr>
-          <w:instrText xml:space="preserve"> PAGEREF _Toc232181190 \h </w:instrText>
+          <w:instrText xml:space="preserve"> PAGEREF _Toc232187417 \h </w:instrText>
         </w:r>
         <w:r>
           <w:rPr>
@@ -1171,7 +1147,7 @@
             <w:noProof/>
             <w:webHidden/>
           </w:rPr>
-          <w:t>5</w:t>
+          <w:t>4</w:t>
         </w:r>
         <w:r>
           <w:rPr>
@@ -1193,7 +1169,7 @@
           <w14:ligatures w14:val="standardContextual"/>
         </w:rPr>
       </w:pPr>
-      <w:hyperlink w:anchor="_Toc232181191" w:history="1">
+      <w:hyperlink w:anchor="_Toc232187418" w:history="1">
         <w:r>
           <w:rPr>
             <w:rStyle w:val="af2"/>
@@ -1276,7 +1252,7 @@
             <w:noProof/>
             <w:webHidden/>
           </w:rPr>
-          <w:instrText xml:space="preserve"> PAGEREF _Toc232181191 \h </w:instrText>
+          <w:instrText xml:space="preserve"> PAGEREF _Toc232187418 \h </w:instrText>
         </w:r>
         <w:r>
           <w:rPr>
@@ -1296,7 +1272,7 @@
             <w:noProof/>
             <w:webHidden/>
           </w:rPr>
-          <w:t>5</w:t>
+          <w:t>4</w:t>
         </w:r>
         <w:r>
           <w:rPr>
@@ -1317,7 +1293,7 @@
           <w14:ligatures w14:val="standardContextual"/>
         </w:rPr>
       </w:pPr>
-      <w:hyperlink w:anchor="_Toc232181192" w:history="1">
+      <w:hyperlink w:anchor="_Toc232187419" w:history="1">
         <w:r>
           <w:rPr>
             <w:rStyle w:val="af2"/>
@@ -1358,7 +1334,7 @@
             <w:noProof/>
             <w:webHidden/>
           </w:rPr>
-          <w:instrText xml:space="preserve"> PAGEREF _Toc232181192 \h </w:instrText>
+          <w:instrText xml:space="preserve"> PAGEREF _Toc232187419 \h </w:instrText>
         </w:r>
         <w:r>
           <w:rPr>
@@ -1378,7 +1354,7 @@
             <w:noProof/>
             <w:webHidden/>
           </w:rPr>
-          <w:t>7</w:t>
+          <w:t>6</w:t>
         </w:r>
         <w:r>
           <w:rPr>
@@ -1400,7 +1376,7 @@
           <w14:ligatures w14:val="standardContextual"/>
         </w:rPr>
       </w:pPr>
-      <w:hyperlink w:anchor="_Toc232181193" w:history="1">
+      <w:hyperlink w:anchor="_Toc232187420" w:history="1">
         <w:r>
           <w:rPr>
             <w:rStyle w:val="af2"/>
@@ -1434,7 +1410,7 @@
             <w:noProof/>
             <w:webHidden/>
           </w:rPr>
-          <w:instrText xml:space="preserve"> PAGEREF _Toc232181193 \h </w:instrText>
+          <w:instrText xml:space="preserve"> PAGEREF _Toc232187420 \h </w:instrText>
         </w:r>
         <w:r>
           <w:rPr>
@@ -1454,7 +1430,7 @@
             <w:noProof/>
             <w:webHidden/>
           </w:rPr>
-          <w:t>7</w:t>
+          <w:t>6</w:t>
         </w:r>
         <w:r>
           <w:rPr>
@@ -1476,7 +1452,7 @@
           <w14:ligatures w14:val="standardContextual"/>
         </w:rPr>
       </w:pPr>
-      <w:hyperlink w:anchor="_Toc232181194" w:history="1">
+      <w:hyperlink w:anchor="_Toc232187421" w:history="1">
         <w:r>
           <w:rPr>
             <w:rStyle w:val="af2"/>
@@ -1510,7 +1486,7 @@
             <w:noProof/>
             <w:webHidden/>
           </w:rPr>
-          <w:instrText xml:space="preserve"> PAGEREF _Toc232181194 \h </w:instrText>
+          <w:instrText xml:space="preserve"> PAGEREF _Toc232187421 \h </w:instrText>
         </w:r>
         <w:r>
           <w:rPr>
@@ -1530,7 +1506,7 @@
             <w:noProof/>
             <w:webHidden/>
           </w:rPr>
-          <w:t>7</w:t>
+          <w:t>6</w:t>
         </w:r>
         <w:r>
           <w:rPr>
@@ -1552,7 +1528,7 @@
           <w14:ligatures w14:val="standardContextual"/>
         </w:rPr>
       </w:pPr>
-      <w:hyperlink w:anchor="_Toc232181195" w:history="1">
+      <w:hyperlink w:anchor="_Toc232187422" w:history="1">
         <w:r>
           <w:rPr>
             <w:rStyle w:val="af2"/>
@@ -1586,7 +1562,7 @@
             <w:noProof/>
             <w:webHidden/>
           </w:rPr>
-          <w:instrText xml:space="preserve"> PAGEREF _Toc232181195 \h </w:instrText>
+          <w:instrText xml:space="preserve"> PAGEREF _Toc232187422 \h </w:instrText>
         </w:r>
         <w:r>
           <w:rPr>
@@ -1606,7 +1582,7 @@
             <w:noProof/>
             <w:webHidden/>
           </w:rPr>
-          <w:t>7</w:t>
+          <w:t>6</w:t>
         </w:r>
         <w:r>
           <w:rPr>
@@ -1627,7 +1603,7 @@
           <w14:ligatures w14:val="standardContextual"/>
         </w:rPr>
       </w:pPr>
-      <w:hyperlink w:anchor="_Toc232181196" w:history="1">
+      <w:hyperlink w:anchor="_Toc232187423" w:history="1">
         <w:r>
           <w:rPr>
             <w:rStyle w:val="af2"/>
@@ -1668,7 +1644,7 @@
             <w:noProof/>
             <w:webHidden/>
           </w:rPr>
-          <w:instrText xml:space="preserve"> PAGEREF _Toc232181196 \h </w:instrText>
+          <w:instrText xml:space="preserve"> PAGEREF _Toc232187423 \h </w:instrText>
         </w:r>
         <w:r>
           <w:rPr>
@@ -1688,7 +1664,7 @@
             <w:noProof/>
             <w:webHidden/>
           </w:rPr>
-          <w:t>8</w:t>
+          <w:t>7</w:t>
         </w:r>
         <w:r>
           <w:rPr>
@@ -1709,7 +1685,7 @@
           <w14:ligatures w14:val="standardContextual"/>
         </w:rPr>
       </w:pPr>
-      <w:hyperlink w:anchor="_Toc232181197" w:history="1">
+      <w:hyperlink w:anchor="_Toc232187424" w:history="1">
         <w:r>
           <w:rPr>
             <w:rStyle w:val="af2"/>
@@ -1736,7 +1712,7 @@
             <w:noProof/>
             <w:webHidden/>
           </w:rPr>
-          <w:instrText xml:space="preserve"> PAGEREF _Toc232181197 \h </w:instrText>
+          <w:instrText xml:space="preserve"> PAGEREF _Toc232187424 \h </w:instrText>
         </w:r>
         <w:r>
           <w:rPr>
@@ -1756,7 +1732,7 @@
             <w:noProof/>
             <w:webHidden/>
           </w:rPr>
-          <w:t>9</w:t>
+          <w:t>8</w:t>
         </w:r>
         <w:r>
           <w:rPr>
@@ -1776,9 +1752,16 @@
       </w:r>
     </w:p>
     <w:p>
-      <w:r>
-        <w:br w:type="page"/>
-      </w:r>
+      <w:pPr>
+        <w:sectPr>
+          <w:footerReference w:type="default" r:id="rId8"/>
+          <w:pgSz w:w="11906" w:h="16838"/>
+          <w:pgMar w:top="1440" w:right="1474" w:bottom="1440" w:left="1701" w:header="851" w:footer="992" w:gutter="0"/>
+          <w:pgNumType w:start="1"/>
+          <w:cols w:space="425"/>
+          <w:docGrid w:type="lines" w:linePitch="312"/>
+        </w:sectPr>
+      </w:pPr>
     </w:p>
     <w:p>
       <w:pPr>
@@ -1786,7 +1769,7 @@
         <w:spacing w:before="240" w:after="120"/>
         <w:jc w:val="center"/>
       </w:pPr>
-      <w:bookmarkStart w:id="0" w:name="_Toc232181181"/>
+      <w:bookmarkStart w:id="0" w:name="_Toc232187408"/>
       <w:r>
         <w:lastRenderedPageBreak/>
         <w:t>第一章</w:t>
@@ -2204,7 +2187,7 @@
         <w:spacing w:before="240" w:after="120"/>
         <w:jc w:val="center"/>
       </w:pPr>
-      <w:bookmarkStart w:id="1" w:name="_Toc232181182"/>
+      <w:bookmarkStart w:id="1" w:name="_Toc232187409"/>
       <w:r>
         <w:t>第二章</w:t>
       </w:r>
@@ -2221,7 +2204,7 @@
         <w:pStyle w:val="21"/>
         <w:spacing w:before="200" w:after="80"/>
       </w:pPr>
-      <w:bookmarkStart w:id="2" w:name="_Toc232181183"/>
+      <w:bookmarkStart w:id="2" w:name="_Toc232187410"/>
       <w:r>
         <w:t xml:space="preserve">2.1 </w:t>
       </w:r>
@@ -2365,7 +2348,7 @@
         <w:pStyle w:val="21"/>
         <w:spacing w:before="200" w:after="80"/>
       </w:pPr>
-      <w:bookmarkStart w:id="3" w:name="_Toc232181184"/>
+      <w:bookmarkStart w:id="3" w:name="_Toc232187411"/>
       <w:r>
         <w:lastRenderedPageBreak/>
         <w:t>2.2 CNN</w:t>
@@ -2487,7 +2470,7 @@
         <w:pStyle w:val="21"/>
         <w:spacing w:before="200" w:after="80"/>
       </w:pPr>
-      <w:bookmarkStart w:id="4" w:name="_Toc232181185"/>
+      <w:bookmarkStart w:id="4" w:name="_Toc232187412"/>
       <w:r>
         <w:t xml:space="preserve">2.3 </w:t>
       </w:r>
@@ -2619,7 +2602,7 @@
           <w:noProof/>
         </w:rPr>
         <w:drawing>
-          <wp:inline distT="0" distB="0" distL="0" distR="0" wp14:anchorId="5B9B0431" wp14:editId="64FCAABC">
+          <wp:inline distT="0" distB="0" distL="0" distR="0" wp14:anchorId="5AFC036A" wp14:editId="111BD12D">
             <wp:extent cx="4968000" cy="2795986"/>
             <wp:effectExtent l="0" t="0" r="0" b="0"/>
             <wp:docPr id="1" name="Picture 1"/>
@@ -2631,1214 +2614,6 @@
                 <pic:pic xmlns:pic="http://schemas.openxmlformats.org/drawingml/2006/picture">
                   <pic:nvPicPr>
                     <pic:cNvPr id="0" name="ai-architecture-evolution.png"/>
-                    <pic:cNvPicPr/>
-                  </pic:nvPicPr>
-                  <pic:blipFill>
-                    <a:blip r:embed="rId8"/>
-                    <a:stretch>
-                      <a:fillRect/>
-                    </a:stretch>
-                  </pic:blipFill>
-                  <pic:spPr>
-                    <a:xfrm>
-                      <a:off x="0" y="0"/>
-                      <a:ext cx="4968000" cy="2795986"/>
-                    </a:xfrm>
-                    <a:prstGeom prst="rect">
-                      <a:avLst/>
-                    </a:prstGeom>
-                  </pic:spPr>
-                </pic:pic>
-              </a:graphicData>
-            </a:graphic>
-          </wp:inline>
-        </w:drawing>
-      </w:r>
-    </w:p>
-    <w:p>
-      <w:pPr>
-        <w:spacing w:after="120"/>
-        <w:jc w:val="center"/>
-      </w:pPr>
-      <w:r>
-        <w:t>图</w:t>
-      </w:r>
-      <w:r>
-        <w:t xml:space="preserve">2.1 </w:t>
-      </w:r>
-      <w:r>
-        <w:t>深度学习模型架构演化概念图</w:t>
-      </w:r>
-    </w:p>
-    <w:p>
-      <w:pPr>
-        <w:spacing w:after="120" w:line="300" w:lineRule="auto"/>
-        <w:ind w:firstLine="420"/>
-      </w:pPr>
-      <w:r>
-        <w:t>图中将深度学习模型演化概括为八个阶段。它不是严格的历史年表，而是强调每个阶段解决</w:t>
-      </w:r>
-      <w:r>
-        <w:lastRenderedPageBreak/>
-        <w:t>的主要问题：从可学习分类器，到可训练深层网络，再到空间层级、序列记忆、并行注意力、基础模型、稀疏路由和长上下文效率。</w:t>
-      </w:r>
-    </w:p>
-    <w:p>
-      <w:pPr>
-        <w:pStyle w:val="21"/>
-        <w:spacing w:before="200" w:after="80"/>
-      </w:pPr>
-      <w:bookmarkStart w:id="5" w:name="_Toc232181186"/>
-      <w:r>
-        <w:t xml:space="preserve">2.4 Transformer </w:t>
-      </w:r>
-      <w:r>
-        <w:t>与预训练范式</w:t>
-      </w:r>
-      <w:bookmarkEnd w:id="5"/>
-    </w:p>
-    <w:p>
-      <w:pPr>
-        <w:spacing w:after="120" w:line="300" w:lineRule="auto"/>
-        <w:ind w:firstLine="420"/>
-      </w:pPr>
-      <w:r>
-        <w:t xml:space="preserve">Transformer </w:t>
-      </w:r>
-      <w:r>
-        <w:t>的突破在于用自注意力取代循环结构，使序列建模可以更充分地并行化，并让模型直接学习任意</w:t>
-      </w:r>
-      <w:r>
-        <w:t xml:space="preserve"> token </w:t>
-      </w:r>
-      <w:r>
-        <w:t>之间的依赖关系</w:t>
-      </w:r>
-      <w:r>
-        <w:rPr>
-          <w:sz w:val="18"/>
-          <w:vertAlign w:val="superscript"/>
-        </w:rPr>
-        <w:t>[8]</w:t>
-      </w:r>
-      <w:r>
-        <w:t>。</w:t>
-      </w:r>
-      <w:r>
-        <w:t xml:space="preserve">BERT </w:t>
-      </w:r>
-      <w:r>
-        <w:t>展示了大规模无监督预训练加下游微调的有效性，强调双向上下文表示</w:t>
-      </w:r>
-      <w:r>
-        <w:rPr>
-          <w:sz w:val="18"/>
-          <w:vertAlign w:val="superscript"/>
-        </w:rPr>
-        <w:t>[9]</w:t>
-      </w:r>
-      <w:r>
-        <w:t>；</w:t>
-      </w:r>
-      <w:r>
-        <w:t xml:space="preserve">GPT-3 </w:t>
-      </w:r>
-      <w:r>
-        <w:t>则进一步展示了规模化语言模型在少样本提示下的泛化能力</w:t>
-      </w:r>
-      <w:r>
-        <w:rPr>
-          <w:sz w:val="18"/>
-          <w:vertAlign w:val="superscript"/>
-        </w:rPr>
-        <w:t>[10]</w:t>
-      </w:r>
-      <w:r>
-        <w:t>。这一阶段的变化非常关键：模型不再只是为某个单一任务从零训练，而是先在大规模数据上形成通用表示，再通过提示、微调或对齐服务不同任务。</w:t>
-      </w:r>
-    </w:p>
-    <w:p>
-      <w:pPr>
-        <w:spacing w:after="120" w:line="300" w:lineRule="auto"/>
-        <w:ind w:firstLine="420"/>
-      </w:pPr>
-      <w:r>
-        <w:t xml:space="preserve">Transformer </w:t>
-      </w:r>
-      <w:r>
-        <w:t>也跨出了语言领域。</w:t>
-      </w:r>
-      <w:r>
-        <w:t xml:space="preserve">Vision Transformer </w:t>
-      </w:r>
-      <w:r>
-        <w:t>将图像切成</w:t>
-      </w:r>
-      <w:r>
-        <w:t xml:space="preserve"> patch</w:t>
-      </w:r>
-      <w:r>
-        <w:t>，并把视觉问题转换成</w:t>
-      </w:r>
-      <w:r>
-        <w:t xml:space="preserve"> token </w:t>
-      </w:r>
-      <w:r>
-        <w:t>序列建模问题</w:t>
-      </w:r>
-      <w:r>
-        <w:rPr>
-          <w:sz w:val="18"/>
-          <w:vertAlign w:val="superscript"/>
-        </w:rPr>
-        <w:t>[11]</w:t>
-      </w:r>
-      <w:r>
-        <w:t>。扩散模型则在生成任务中形成另一条主线，</w:t>
-      </w:r>
-      <w:r>
-        <w:t xml:space="preserve">DDPM </w:t>
-      </w:r>
-      <w:r>
-        <w:t>通过逐步去噪实现高质量生成</w:t>
-      </w:r>
-      <w:r>
-        <w:rPr>
-          <w:sz w:val="18"/>
-          <w:vertAlign w:val="superscript"/>
-        </w:rPr>
-        <w:t>[12]</w:t>
-      </w:r>
-      <w:r>
-        <w:t>，</w:t>
-      </w:r>
-      <w:r>
-        <w:t xml:space="preserve">DiT </w:t>
-      </w:r>
-      <w:r>
-        <w:t>又把</w:t>
-      </w:r>
-      <w:r>
-        <w:t xml:space="preserve"> Transformer </w:t>
-      </w:r>
-      <w:r>
-        <w:t>引入扩散模型主干，进一步说明</w:t>
-      </w:r>
-      <w:r>
-        <w:t xml:space="preserve"> token </w:t>
-      </w:r>
-      <w:r>
-        <w:t>化和注意力结构正在成为多模态建模的通用接口</w:t>
-      </w:r>
-      <w:r>
-        <w:rPr>
-          <w:sz w:val="18"/>
-          <w:vertAlign w:val="superscript"/>
-        </w:rPr>
-        <w:t>[13]</w:t>
-      </w:r>
-      <w:r>
-        <w:t>。</w:t>
-      </w:r>
-    </w:p>
-    <w:tbl>
-      <w:tblPr>
-        <w:tblStyle w:val="af"/>
-        <w:tblW w:w="0" w:type="auto"/>
-        <w:jc w:val="center"/>
-        <w:tblLook w:val="04A0" w:firstRow="1" w:lastRow="0" w:firstColumn="1" w:lastColumn="0" w:noHBand="0" w:noVBand="1"/>
-      </w:tblPr>
-      <w:tblGrid>
-        <w:gridCol w:w="2181"/>
-        <w:gridCol w:w="2180"/>
-        <w:gridCol w:w="2180"/>
-        <w:gridCol w:w="2180"/>
-      </w:tblGrid>
-      <w:tr>
-        <w:trPr>
-          <w:jc w:val="center"/>
-        </w:trPr>
-        <w:tc>
-          <w:tcPr>
-            <w:tcW w:w="2183" w:type="dxa"/>
-            <w:shd w:val="clear" w:color="auto" w:fill="D9EAF7"/>
-            <w:vAlign w:val="center"/>
-          </w:tcPr>
-          <w:p>
-            <w:pPr>
-              <w:jc w:val="center"/>
-            </w:pPr>
-            <w:r>
-              <w:rPr>
-                <w:b/>
-              </w:rPr>
-              <w:t>阶段</w:t>
-            </w:r>
-          </w:p>
-        </w:tc>
-        <w:tc>
-          <w:tcPr>
-            <w:tcW w:w="2183" w:type="dxa"/>
-            <w:shd w:val="clear" w:color="auto" w:fill="D9EAF7"/>
-            <w:vAlign w:val="center"/>
-          </w:tcPr>
-          <w:p>
-            <w:pPr>
-              <w:jc w:val="center"/>
-            </w:pPr>
-            <w:r>
-              <w:rPr>
-                <w:b/>
-              </w:rPr>
-              <w:t>主要结构</w:t>
-            </w:r>
-          </w:p>
-        </w:tc>
-        <w:tc>
-          <w:tcPr>
-            <w:tcW w:w="2183" w:type="dxa"/>
-            <w:shd w:val="clear" w:color="auto" w:fill="D9EAF7"/>
-            <w:vAlign w:val="center"/>
-          </w:tcPr>
-          <w:p>
-            <w:pPr>
-              <w:jc w:val="center"/>
-            </w:pPr>
-            <w:r>
-              <w:rPr>
-                <w:b/>
-              </w:rPr>
-              <w:t>解决的瓶颈</w:t>
-            </w:r>
-          </w:p>
-        </w:tc>
-        <w:tc>
-          <w:tcPr>
-            <w:tcW w:w="2183" w:type="dxa"/>
-            <w:shd w:val="clear" w:color="auto" w:fill="D9EAF7"/>
-            <w:vAlign w:val="center"/>
-          </w:tcPr>
-          <w:p>
-            <w:pPr>
-              <w:jc w:val="center"/>
-            </w:pPr>
-            <w:r>
-              <w:rPr>
-                <w:b/>
-              </w:rPr>
-              <w:t>新问题</w:t>
-            </w:r>
-          </w:p>
-        </w:tc>
-      </w:tr>
-      <w:tr>
-        <w:trPr>
-          <w:jc w:val="center"/>
-        </w:trPr>
-        <w:tc>
-          <w:tcPr>
-            <w:tcW w:w="2183" w:type="dxa"/>
-            <w:vAlign w:val="center"/>
-          </w:tcPr>
-          <w:p>
-            <w:pPr>
-              <w:jc w:val="center"/>
-            </w:pPr>
-            <w:r>
-              <w:rPr>
-                <w:sz w:val="20"/>
-              </w:rPr>
-              <w:t>感知机</w:t>
-            </w:r>
-            <w:r>
-              <w:rPr>
-                <w:sz w:val="20"/>
-              </w:rPr>
-              <w:t>/</w:t>
-            </w:r>
-            <w:r>
-              <w:rPr>
-                <w:sz w:val="20"/>
-              </w:rPr>
-              <w:t>浅层网络</w:t>
-            </w:r>
-          </w:p>
-        </w:tc>
-        <w:tc>
-          <w:tcPr>
-            <w:tcW w:w="2183" w:type="dxa"/>
-            <w:vAlign w:val="center"/>
-          </w:tcPr>
-          <w:p>
-            <w:pPr>
-              <w:jc w:val="center"/>
-            </w:pPr>
-            <w:r>
-              <w:rPr>
-                <w:sz w:val="20"/>
-              </w:rPr>
-              <w:t>线性分类器、简单神经元</w:t>
-            </w:r>
-          </w:p>
-        </w:tc>
-        <w:tc>
-          <w:tcPr>
-            <w:tcW w:w="2183" w:type="dxa"/>
-            <w:vAlign w:val="center"/>
-          </w:tcPr>
-          <w:p>
-            <w:pPr>
-              <w:jc w:val="center"/>
-            </w:pPr>
-            <w:r>
-              <w:rPr>
-                <w:sz w:val="20"/>
-              </w:rPr>
-              <w:t>从规则到学习</w:t>
-            </w:r>
-          </w:p>
-        </w:tc>
-        <w:tc>
-          <w:tcPr>
-            <w:tcW w:w="2183" w:type="dxa"/>
-            <w:vAlign w:val="center"/>
-          </w:tcPr>
-          <w:p>
-            <w:pPr>
-              <w:jc w:val="center"/>
-            </w:pPr>
-            <w:r>
-              <w:rPr>
-                <w:sz w:val="20"/>
-              </w:rPr>
-              <w:t>表示能力弱</w:t>
-            </w:r>
-          </w:p>
-        </w:tc>
-      </w:tr>
-      <w:tr>
-        <w:trPr>
-          <w:jc w:val="center"/>
-        </w:trPr>
-        <w:tc>
-          <w:tcPr>
-            <w:tcW w:w="2183" w:type="dxa"/>
-            <w:vAlign w:val="center"/>
-          </w:tcPr>
-          <w:p>
-            <w:pPr>
-              <w:jc w:val="center"/>
-            </w:pPr>
-            <w:r>
-              <w:rPr>
-                <w:sz w:val="20"/>
-              </w:rPr>
-              <w:t>CNN/ResNet</w:t>
-            </w:r>
-          </w:p>
-        </w:tc>
-        <w:tc>
-          <w:tcPr>
-            <w:tcW w:w="2183" w:type="dxa"/>
-            <w:vAlign w:val="center"/>
-          </w:tcPr>
-          <w:p>
-            <w:pPr>
-              <w:jc w:val="center"/>
-            </w:pPr>
-            <w:r>
-              <w:rPr>
-                <w:sz w:val="20"/>
-              </w:rPr>
-              <w:t>卷积、残差连接</w:t>
-            </w:r>
-          </w:p>
-        </w:tc>
-        <w:tc>
-          <w:tcPr>
-            <w:tcW w:w="2183" w:type="dxa"/>
-            <w:vAlign w:val="center"/>
-          </w:tcPr>
-          <w:p>
-            <w:pPr>
-              <w:jc w:val="center"/>
-            </w:pPr>
-            <w:r>
-              <w:rPr>
-                <w:sz w:val="20"/>
-              </w:rPr>
-              <w:t>空间层级与深层优化</w:t>
-            </w:r>
-          </w:p>
-        </w:tc>
-        <w:tc>
-          <w:tcPr>
-            <w:tcW w:w="2183" w:type="dxa"/>
-            <w:vAlign w:val="center"/>
-          </w:tcPr>
-          <w:p>
-            <w:pPr>
-              <w:jc w:val="center"/>
-            </w:pPr>
-            <w:r>
-              <w:rPr>
-                <w:sz w:val="20"/>
-              </w:rPr>
-              <w:t>跨模态统一性不足</w:t>
-            </w:r>
-          </w:p>
-        </w:tc>
-      </w:tr>
-      <w:tr>
-        <w:trPr>
-          <w:jc w:val="center"/>
-        </w:trPr>
-        <w:tc>
-          <w:tcPr>
-            <w:tcW w:w="2183" w:type="dxa"/>
-            <w:vAlign w:val="center"/>
-          </w:tcPr>
-          <w:p>
-            <w:pPr>
-              <w:jc w:val="center"/>
-            </w:pPr>
-            <w:r>
-              <w:rPr>
-                <w:sz w:val="20"/>
-              </w:rPr>
-              <w:t>RNN/LSTM</w:t>
-            </w:r>
-          </w:p>
-        </w:tc>
-        <w:tc>
-          <w:tcPr>
-            <w:tcW w:w="2183" w:type="dxa"/>
-            <w:vAlign w:val="center"/>
-          </w:tcPr>
-          <w:p>
-            <w:pPr>
-              <w:jc w:val="center"/>
-            </w:pPr>
-            <w:r>
-              <w:rPr>
-                <w:sz w:val="20"/>
-              </w:rPr>
-              <w:t>循环与门控记忆</w:t>
-            </w:r>
-          </w:p>
-        </w:tc>
-        <w:tc>
-          <w:tcPr>
-            <w:tcW w:w="2183" w:type="dxa"/>
-            <w:vAlign w:val="center"/>
-          </w:tcPr>
-          <w:p>
-            <w:pPr>
-              <w:jc w:val="center"/>
-            </w:pPr>
-            <w:r>
-              <w:rPr>
-                <w:sz w:val="20"/>
-              </w:rPr>
-              <w:t>序列依赖</w:t>
-            </w:r>
-          </w:p>
-        </w:tc>
-        <w:tc>
-          <w:tcPr>
-            <w:tcW w:w="2183" w:type="dxa"/>
-            <w:vAlign w:val="center"/>
-          </w:tcPr>
-          <w:p>
-            <w:pPr>
-              <w:jc w:val="center"/>
-            </w:pPr>
-            <w:r>
-              <w:rPr>
-                <w:sz w:val="20"/>
-              </w:rPr>
-              <w:t>并行效率低</w:t>
-            </w:r>
-          </w:p>
-        </w:tc>
-      </w:tr>
-      <w:tr>
-        <w:trPr>
-          <w:jc w:val="center"/>
-        </w:trPr>
-        <w:tc>
-          <w:tcPr>
-            <w:tcW w:w="2183" w:type="dxa"/>
-            <w:vAlign w:val="center"/>
-          </w:tcPr>
-          <w:p>
-            <w:pPr>
-              <w:jc w:val="center"/>
-            </w:pPr>
-            <w:r>
-              <w:rPr>
-                <w:sz w:val="20"/>
-              </w:rPr>
-              <w:t>Transformer</w:t>
-            </w:r>
-          </w:p>
-        </w:tc>
-        <w:tc>
-          <w:tcPr>
-            <w:tcW w:w="2183" w:type="dxa"/>
-            <w:vAlign w:val="center"/>
-          </w:tcPr>
-          <w:p>
-            <w:pPr>
-              <w:jc w:val="center"/>
-            </w:pPr>
-            <w:r>
-              <w:rPr>
-                <w:sz w:val="20"/>
-              </w:rPr>
-              <w:t>自注意力、残差、归一化</w:t>
-            </w:r>
-          </w:p>
-        </w:tc>
-        <w:tc>
-          <w:tcPr>
-            <w:tcW w:w="2183" w:type="dxa"/>
-            <w:vAlign w:val="center"/>
-          </w:tcPr>
-          <w:p>
-            <w:pPr>
-              <w:jc w:val="center"/>
-            </w:pPr>
-            <w:r>
-              <w:rPr>
-                <w:sz w:val="20"/>
-              </w:rPr>
-              <w:t>全局上下文与并行训练</w:t>
-            </w:r>
-          </w:p>
-        </w:tc>
-        <w:tc>
-          <w:tcPr>
-            <w:tcW w:w="2183" w:type="dxa"/>
-            <w:vAlign w:val="center"/>
-          </w:tcPr>
-          <w:p>
-            <w:pPr>
-              <w:jc w:val="center"/>
-            </w:pPr>
-            <w:r>
-              <w:rPr>
-                <w:sz w:val="20"/>
-              </w:rPr>
-              <w:t>长上下文计算代价高</w:t>
-            </w:r>
-          </w:p>
-        </w:tc>
-      </w:tr>
-      <w:tr>
-        <w:trPr>
-          <w:jc w:val="center"/>
-        </w:trPr>
-        <w:tc>
-          <w:tcPr>
-            <w:tcW w:w="2183" w:type="dxa"/>
-            <w:vAlign w:val="center"/>
-          </w:tcPr>
-          <w:p>
-            <w:pPr>
-              <w:jc w:val="center"/>
-            </w:pPr>
-            <w:r>
-              <w:rPr>
-                <w:sz w:val="20"/>
-              </w:rPr>
-              <w:t>基础模型</w:t>
-            </w:r>
-          </w:p>
-        </w:tc>
-        <w:tc>
-          <w:tcPr>
-            <w:tcW w:w="2183" w:type="dxa"/>
-            <w:vAlign w:val="center"/>
-          </w:tcPr>
-          <w:p>
-            <w:pPr>
-              <w:jc w:val="center"/>
-            </w:pPr>
-            <w:r>
-              <w:rPr>
-                <w:sz w:val="20"/>
-              </w:rPr>
-              <w:t>大规模预训练、提示学习</w:t>
-            </w:r>
-          </w:p>
-        </w:tc>
-        <w:tc>
-          <w:tcPr>
-            <w:tcW w:w="2183" w:type="dxa"/>
-            <w:vAlign w:val="center"/>
-          </w:tcPr>
-          <w:p>
-            <w:pPr>
-              <w:jc w:val="center"/>
-            </w:pPr>
-            <w:r>
-              <w:rPr>
-                <w:sz w:val="20"/>
-              </w:rPr>
-              <w:t>跨任务泛化</w:t>
-            </w:r>
-          </w:p>
-        </w:tc>
-        <w:tc>
-          <w:tcPr>
-            <w:tcW w:w="2183" w:type="dxa"/>
-            <w:vAlign w:val="center"/>
-          </w:tcPr>
-          <w:p>
-            <w:pPr>
-              <w:jc w:val="center"/>
-            </w:pPr>
-            <w:r>
-              <w:rPr>
-                <w:sz w:val="20"/>
-              </w:rPr>
-              <w:t>成本、对齐与可靠性</w:t>
-            </w:r>
-          </w:p>
-        </w:tc>
-      </w:tr>
-    </w:tbl>
-    <w:p/>
-    <w:p>
-      <w:pPr>
-        <w:pStyle w:val="1"/>
-        <w:spacing w:before="240" w:after="120"/>
-        <w:jc w:val="center"/>
-      </w:pPr>
-      <w:bookmarkStart w:id="6" w:name="_Toc232181187"/>
-      <w:r>
-        <w:t>第三章</w:t>
-      </w:r>
-      <w:r>
-        <w:t xml:space="preserve"> </w:t>
-      </w:r>
-      <w:r>
-        <w:t>目前最新的深度学习模型架构</w:t>
-      </w:r>
-      <w:bookmarkEnd w:id="6"/>
-    </w:p>
-    <w:p>
-      <w:pPr>
-        <w:pStyle w:val="21"/>
-        <w:spacing w:before="200" w:after="80"/>
-      </w:pPr>
-      <w:bookmarkStart w:id="7" w:name="_Toc232181188"/>
-      <w:r>
-        <w:t xml:space="preserve">3.1 Dense Transformer </w:t>
-      </w:r>
-      <w:r>
-        <w:t>仍是主干，但不再是唯一答案</w:t>
-      </w:r>
-      <w:bookmarkEnd w:id="7"/>
-    </w:p>
-    <w:p>
-      <w:pPr>
-        <w:spacing w:after="120" w:line="300" w:lineRule="auto"/>
-        <w:ind w:firstLine="420"/>
-      </w:pPr>
-      <w:r>
-        <w:t>截至</w:t>
-      </w:r>
-      <w:r>
-        <w:t xml:space="preserve"> 2026 </w:t>
-      </w:r>
-      <w:r>
-        <w:t>年，</w:t>
-      </w:r>
-      <w:r>
-        <w:t xml:space="preserve">Transformer </w:t>
-      </w:r>
-      <w:r>
-        <w:t>仍然是语言模型、多模态模型和扩散生成模型的核心主干之一。原因很直接：它的自注意力机制通用、并行友好，工程生态成熟，并能与大规模预训练很好结合。但是它的代价也很明显：注意力计算随序列长度增长而变重，大模型全参数激活导致推理成本高，多模态输入和工具调用又进一步放大上下文长度压力。</w:t>
-      </w:r>
-    </w:p>
-    <w:p>
-      <w:pPr>
-        <w:spacing w:after="120" w:line="300" w:lineRule="auto"/>
-        <w:ind w:firstLine="420"/>
-      </w:pPr>
-      <w:r>
-        <w:t>因此，所谓</w:t>
-      </w:r>
-      <w:r>
-        <w:t>“</w:t>
-      </w:r>
-      <w:r>
-        <w:t>最新架构</w:t>
-      </w:r>
-      <w:r>
-        <w:t>”</w:t>
-      </w:r>
-      <w:r>
-        <w:t>更准确地说是后</w:t>
-      </w:r>
-      <w:r>
-        <w:t xml:space="preserve"> Transformer </w:t>
-      </w:r>
-      <w:r>
-        <w:t>时代的架构族群：</w:t>
-      </w:r>
-      <w:r>
-        <w:t xml:space="preserve">Dense Transformer </w:t>
-      </w:r>
-      <w:r>
-        <w:t>作为基线仍在演进；</w:t>
-      </w:r>
-      <w:r>
-        <w:t xml:space="preserve">MoE </w:t>
-      </w:r>
-      <w:r>
-        <w:t>用条件计算提高参数容量与成本比；</w:t>
-      </w:r>
-      <w:r>
-        <w:t xml:space="preserve">SSM/Mamba </w:t>
-      </w:r>
-      <w:r>
-        <w:t>试图用线性时间序列建模改善长上下文效率；多模态基础模型则把视觉、文本、视频、语音和工具使用统一到更复杂的系统中。</w:t>
-      </w:r>
-    </w:p>
-    <w:p>
-      <w:pPr>
-        <w:pStyle w:val="21"/>
-        <w:spacing w:before="200" w:after="80"/>
-      </w:pPr>
-      <w:bookmarkStart w:id="8" w:name="_Toc232181189"/>
-      <w:r>
-        <w:lastRenderedPageBreak/>
-        <w:t>3.2 MoE</w:t>
-      </w:r>
-      <w:r>
-        <w:t>：用稀疏激活换取更大容量</w:t>
-      </w:r>
-      <w:bookmarkEnd w:id="8"/>
-    </w:p>
-    <w:p>
-      <w:pPr>
-        <w:spacing w:after="120" w:line="300" w:lineRule="auto"/>
-        <w:ind w:firstLine="420"/>
-      </w:pPr>
-      <w:r>
-        <w:t xml:space="preserve">Mixture of Experts </w:t>
-      </w:r>
-      <w:r>
-        <w:t>的核心想法是让每个</w:t>
-      </w:r>
-      <w:r>
-        <w:t xml:space="preserve"> token </w:t>
-      </w:r>
-      <w:r>
-        <w:t>只激活部分专家网络，从而在总参数规模很大时控制单次计算成本。</w:t>
-      </w:r>
-      <w:r>
-        <w:t xml:space="preserve">Switch Transformer </w:t>
-      </w:r>
-      <w:r>
-        <w:t>展示了用简单稀疏路由扩展到超大参数规模的可行性</w:t>
-      </w:r>
-      <w:r>
-        <w:rPr>
-          <w:sz w:val="18"/>
-          <w:vertAlign w:val="superscript"/>
-        </w:rPr>
-        <w:t>[14]</w:t>
-      </w:r>
-      <w:r>
-        <w:t>。与稀疏专家路线并行，</w:t>
-      </w:r>
-      <w:r>
-        <w:t xml:space="preserve">Mamba </w:t>
-      </w:r>
-      <w:r>
-        <w:t>和</w:t>
-      </w:r>
-      <w:r>
-        <w:t xml:space="preserve"> Mamba-2 </w:t>
-      </w:r>
-      <w:r>
-        <w:t>又从状态空间模型角度重新讨论长序列效率</w:t>
-      </w:r>
-      <w:r>
-        <w:rPr>
-          <w:sz w:val="18"/>
-          <w:vertAlign w:val="superscript"/>
-        </w:rPr>
-        <w:t>[15-16]</w:t>
-      </w:r>
-      <w:r>
-        <w:t>。到</w:t>
-      </w:r>
-      <w:r>
-        <w:t xml:space="preserve"> DeepSeek-V3 </w:t>
-      </w:r>
-      <w:r>
-        <w:t>这类技术报告中，</w:t>
-      </w:r>
-      <w:r>
-        <w:t xml:space="preserve">MoE </w:t>
-      </w:r>
-      <w:r>
-        <w:t>已经成为前沿大语言模型的重要路线之一，其目标不是简单堆参数，而是提高</w:t>
-      </w:r>
-      <w:r>
-        <w:t>“</w:t>
-      </w:r>
-      <w:r>
-        <w:t>模型容量</w:t>
-      </w:r>
-      <w:r>
-        <w:t>/</w:t>
-      </w:r>
-      <w:r>
-        <w:t>实际计算量</w:t>
-      </w:r>
-      <w:r>
-        <w:t>”</w:t>
-      </w:r>
-      <w:r>
-        <w:t>的比值</w:t>
-      </w:r>
-      <w:r>
-        <w:rPr>
-          <w:sz w:val="18"/>
-          <w:vertAlign w:val="superscript"/>
-        </w:rPr>
-        <w:t>[17]</w:t>
-      </w:r>
-      <w:r>
-        <w:t>。</w:t>
-      </w:r>
-    </w:p>
-    <w:p>
-      <w:pPr>
-        <w:spacing w:after="120" w:line="300" w:lineRule="auto"/>
-        <w:ind w:firstLine="420"/>
-      </w:pPr>
-      <w:r>
-        <w:t>但</w:t>
-      </w:r>
-      <w:r>
-        <w:t xml:space="preserve"> MoE </w:t>
-      </w:r>
-      <w:r>
-        <w:t>也带来新的工程问题：路由负载均衡、专家利用率、通信开销、训练稳定性和推理部署复杂度。我的判断是，</w:t>
-      </w:r>
-      <w:r>
-        <w:t xml:space="preserve">MoE </w:t>
-      </w:r>
-      <w:r>
-        <w:t>更像一种</w:t>
-      </w:r>
-      <w:r>
-        <w:t>“</w:t>
-      </w:r>
-      <w:r>
-        <w:t>系统架构</w:t>
-      </w:r>
-      <w:r>
-        <w:t>”</w:t>
-      </w:r>
-      <w:r>
-        <w:t>而不是单纯</w:t>
-      </w:r>
-      <w:r>
-        <w:t>“</w:t>
-      </w:r>
-      <w:r>
-        <w:t>网络层结构</w:t>
-      </w:r>
-      <w:r>
-        <w:t>”</w:t>
-      </w:r>
-      <w:r>
-        <w:t>：它把模型质量问题部分转化为调度、通信和并行计算问题。未来能否继续扩展，取决于硬件互联、编译器、推理框架和训练算法能否一起进步。</w:t>
-      </w:r>
-    </w:p>
-    <w:p>
-      <w:pPr>
-        <w:pStyle w:val="21"/>
-        <w:spacing w:before="200" w:after="80"/>
-      </w:pPr>
-      <w:bookmarkStart w:id="9" w:name="_Toc232181190"/>
-      <w:r>
-        <w:t>3.3 SSM/Mamba</w:t>
-      </w:r>
-      <w:r>
-        <w:t>：重新思考长序列效率</w:t>
-      </w:r>
-      <w:bookmarkEnd w:id="9"/>
-    </w:p>
-    <w:p>
-      <w:pPr>
-        <w:spacing w:after="120" w:line="300" w:lineRule="auto"/>
-        <w:ind w:firstLine="420"/>
-      </w:pPr>
-      <w:r>
-        <w:t>状态空间模型路线关注的是长序列建模效率。</w:t>
-      </w:r>
-      <w:r>
-        <w:t xml:space="preserve">Mamba </w:t>
-      </w:r>
-      <w:r>
-        <w:t>将选择性状态空间模型整合成端到端序列主干，强调线性时间扩展和硬件友好实现</w:t>
-      </w:r>
-      <w:r>
-        <w:rPr>
-          <w:sz w:val="18"/>
-          <w:vertAlign w:val="superscript"/>
-        </w:rPr>
-        <w:t>[15]</w:t>
-      </w:r>
-      <w:r>
-        <w:t>。</w:t>
-      </w:r>
-      <w:r>
-        <w:t xml:space="preserve">Mamba-2 </w:t>
-      </w:r>
-      <w:r>
-        <w:t>进一步从结构化状态空间对偶角度建立</w:t>
-      </w:r>
-      <w:r>
-        <w:t xml:space="preserve"> SSM </w:t>
-      </w:r>
-      <w:r>
-        <w:t>与注意力之间的联系，并报告更高效的算法设计</w:t>
-      </w:r>
-      <w:r>
-        <w:rPr>
-          <w:sz w:val="18"/>
-          <w:vertAlign w:val="superscript"/>
-        </w:rPr>
-        <w:t>[16]</w:t>
-      </w:r>
-      <w:r>
-        <w:t>。这条路线的重要性在于，它没有把</w:t>
-      </w:r>
-      <w:r>
-        <w:t xml:space="preserve"> Transformer </w:t>
-      </w:r>
-      <w:r>
-        <w:t>视为不可替代的终点，而是追问：长上下文建模到底需要完整二次注意力，还是可以用选择性状态传播实现更高性价比。</w:t>
-      </w:r>
-    </w:p>
-    <w:p>
-      <w:pPr>
-        <w:spacing w:after="120" w:line="300" w:lineRule="auto"/>
-        <w:ind w:firstLine="420"/>
-      </w:pPr>
-      <w:r>
-        <w:t>我认为</w:t>
-      </w:r>
-      <w:r>
-        <w:t xml:space="preserve"> SSM/Mamba </w:t>
-      </w:r>
-      <w:r>
-        <w:t>的未来价值不一定是完全取代</w:t>
-      </w:r>
-      <w:r>
-        <w:t xml:space="preserve"> Transformer</w:t>
-      </w:r>
-      <w:r>
-        <w:t>，而可能是形成混合架构。例如局部高频信息用状态扫描处理，关键跨段关系仍用注意力或检索机制补充。对于长视频、长文档、基因序列、日志序列和持续交互式智能体，这类结构的吸引力会越来越强。</w:t>
-      </w:r>
-    </w:p>
-    <w:p>
-      <w:pPr>
-        <w:pStyle w:val="21"/>
-        <w:spacing w:before="200" w:after="80"/>
-      </w:pPr>
-      <w:bookmarkStart w:id="10" w:name="_Toc232181191"/>
-      <w:r>
-        <w:t xml:space="preserve">3.4 </w:t>
-      </w:r>
-      <w:r>
-        <w:t>多模态基础模型：从</w:t>
-      </w:r>
-      <w:r>
-        <w:t>“</w:t>
-      </w:r>
-      <w:r>
-        <w:t>模型</w:t>
-      </w:r>
-      <w:r>
-        <w:t>”</w:t>
-      </w:r>
-      <w:r>
-        <w:t>走向</w:t>
-      </w:r>
-      <w:r>
-        <w:t>“</w:t>
-      </w:r>
-      <w:r>
-        <w:t>系统</w:t>
-      </w:r>
-      <w:r>
-        <w:t>”</w:t>
-      </w:r>
-      <w:bookmarkEnd w:id="10"/>
-    </w:p>
-    <w:p>
-      <w:pPr>
-        <w:spacing w:after="120" w:line="300" w:lineRule="auto"/>
-        <w:ind w:firstLine="420"/>
-      </w:pPr>
-      <w:r>
-        <w:t>最新深度学习架构的另一条主线是多模态基础模型。</w:t>
-      </w:r>
-      <w:r>
-        <w:t xml:space="preserve">Qwen3 </w:t>
-      </w:r>
-      <w:r>
-        <w:t>报告展示了</w:t>
-      </w:r>
-      <w:r>
-        <w:t xml:space="preserve"> dense </w:t>
-      </w:r>
-      <w:r>
-        <w:t>与</w:t>
-      </w:r>
-      <w:r>
-        <w:t xml:space="preserve"> MoE </w:t>
-      </w:r>
-      <w:r>
-        <w:t>等不同模型形态下的能力扩展</w:t>
-      </w:r>
-      <w:r>
-        <w:rPr>
-          <w:sz w:val="18"/>
-          <w:vertAlign w:val="superscript"/>
-        </w:rPr>
-        <w:t>[18]</w:t>
-      </w:r>
-      <w:r>
-        <w:t>；</w:t>
-      </w:r>
-      <w:r>
-        <w:t xml:space="preserve">Qwen3-VL </w:t>
-      </w:r>
-      <w:r>
-        <w:t>则将文本、图像和视频统一到视觉语言模型中，并支持长上下文、多图像和视频理解等能力</w:t>
-      </w:r>
-      <w:r>
-        <w:rPr>
-          <w:sz w:val="18"/>
-          <w:vertAlign w:val="superscript"/>
-        </w:rPr>
-        <w:t>[19]</w:t>
-      </w:r>
-      <w:r>
-        <w:t>。这说明前沿模型正在从</w:t>
-      </w:r>
-      <w:r>
-        <w:t>“</w:t>
-      </w:r>
-      <w:r>
-        <w:t>单一输入、单一输出</w:t>
-      </w:r>
-      <w:r>
-        <w:t>”</w:t>
-      </w:r>
-      <w:r>
-        <w:t>的网络，转向</w:t>
-      </w:r>
-      <w:r>
-        <w:t>“</w:t>
-      </w:r>
-      <w:r>
-        <w:t>多模态编码、跨模态对齐、长上下文记忆、工具调用和安全对齐</w:t>
-      </w:r>
-      <w:r>
-        <w:t>”</w:t>
-      </w:r>
-      <w:r>
-        <w:t>的系统。</w:t>
-      </w:r>
-    </w:p>
-    <w:p>
-      <w:pPr>
-        <w:spacing w:after="120" w:line="300" w:lineRule="auto"/>
-        <w:ind w:firstLine="420"/>
-      </w:pPr>
-      <w:r>
-        <w:t xml:space="preserve">2026 </w:t>
-      </w:r>
-      <w:r>
-        <w:t>年</w:t>
-      </w:r>
-      <w:r>
-        <w:t xml:space="preserve"> AI Index </w:t>
-      </w:r>
-      <w:r>
-        <w:t>也显示，前沿</w:t>
-      </w:r>
-      <w:r>
-        <w:t xml:space="preserve"> AI </w:t>
-      </w:r>
-      <w:r>
-        <w:t>能力仍在加速，产业界贡献了大多数</w:t>
-      </w:r>
-      <w:r>
-        <w:t xml:space="preserve"> notable frontier models</w:t>
-      </w:r>
-      <w:r>
-        <w:t>，模型在多模态推理、科学问题和代码任务上持续提升，但负责任</w:t>
-      </w:r>
-      <w:r>
-        <w:t xml:space="preserve"> AI </w:t>
-      </w:r>
-      <w:r>
-        <w:t>测量、基础设施能耗和治理能力仍然落后于能力增长</w:t>
-      </w:r>
-      <w:r>
-        <w:rPr>
-          <w:sz w:val="18"/>
-          <w:vertAlign w:val="superscript"/>
-        </w:rPr>
-        <w:t>[20]</w:t>
-      </w:r>
-      <w:r>
-        <w:t>。这提醒我们：最新架构不是只看</w:t>
-      </w:r>
-      <w:r>
-        <w:t xml:space="preserve"> benchmark </w:t>
-      </w:r>
-      <w:r>
-        <w:t>分数，还要看成本、透明度、可靠性和社会部署条件。</w:t>
-      </w:r>
-    </w:p>
-    <w:p>
-      <w:pPr>
-        <w:spacing w:before="120"/>
-        <w:jc w:val="center"/>
-      </w:pPr>
-      <w:r>
-        <w:rPr>
-          <w:noProof/>
-        </w:rPr>
-        <w:lastRenderedPageBreak/>
-        <w:drawing>
-          <wp:inline distT="0" distB="0" distL="0" distR="0" wp14:anchorId="4C2ECD75" wp14:editId="3A8CCF35">
-            <wp:extent cx="4968000" cy="2795986"/>
-            <wp:effectExtent l="0" t="0" r="0" b="0"/>
-            <wp:docPr id="2" name="Picture 2"/>
-            <wp:cNvGraphicFramePr>
-              <a:graphicFrameLocks xmlns:a="http://schemas.openxmlformats.org/drawingml/2006/main" noChangeAspect="1"/>
-            </wp:cNvGraphicFramePr>
-            <a:graphic xmlns:a="http://schemas.openxmlformats.org/drawingml/2006/main">
-              <a:graphicData uri="http://schemas.openxmlformats.org/drawingml/2006/picture">
-                <pic:pic xmlns:pic="http://schemas.openxmlformats.org/drawingml/2006/picture">
-                  <pic:nvPicPr>
-                    <pic:cNvPr id="0" name="ai-current-architecture-landscape.png"/>
                     <pic:cNvPicPr/>
                   </pic:nvPicPr>
                   <pic:blipFill>
@@ -3872,16 +2647,10 @@
         <w:t>图</w:t>
       </w:r>
       <w:r>
-        <w:t xml:space="preserve">3.1 </w:t>
-      </w:r>
-      <w:r>
-        <w:t>后</w:t>
-      </w:r>
-      <w:r>
-        <w:t xml:space="preserve"> Transformer </w:t>
-      </w:r>
-      <w:r>
-        <w:t>时代主要架构方向概念图</w:t>
+        <w:t xml:space="preserve">2.1 </w:t>
+      </w:r>
+      <w:r>
+        <w:t>深度学习模型架构演化概念图</w:t>
       </w:r>
     </w:p>
     <w:p>
@@ -3890,31 +2659,1144 @@
         <w:ind w:firstLine="420"/>
       </w:pPr>
       <w:r>
-        <w:t>这张图把后</w:t>
+        <w:t>图中将深度学习模型演化概括为八个阶段。它不是严格的历史年表，而是强调每个阶段解决</w:t>
+      </w:r>
+      <w:r>
+        <w:lastRenderedPageBreak/>
+        <w:t>的主要问题：从可学习分类器，到可训练深层网络，再到空间层级、序列记忆、并行注意力、基础模型、稀疏路由和长上下文效率。</w:t>
+      </w:r>
+    </w:p>
+    <w:p>
+      <w:pPr>
+        <w:pStyle w:val="21"/>
+        <w:spacing w:before="200" w:after="80"/>
+      </w:pPr>
+      <w:bookmarkStart w:id="5" w:name="_Toc232187413"/>
+      <w:r>
+        <w:t xml:space="preserve">2.4 Transformer </w:t>
+      </w:r>
+      <w:r>
+        <w:t>与预训练范式</w:t>
+      </w:r>
+      <w:bookmarkEnd w:id="5"/>
+    </w:p>
+    <w:p>
+      <w:pPr>
+        <w:spacing w:after="120" w:line="300" w:lineRule="auto"/>
+        <w:ind w:firstLine="420"/>
+      </w:pPr>
+      <w:r>
+        <w:t xml:space="preserve">Transformer </w:t>
+      </w:r>
+      <w:r>
+        <w:t>的突破在于用自注意力取代循环结构，使序列建模可以更充分地并行化，并让模型直接学习任意</w:t>
+      </w:r>
+      <w:r>
+        <w:t xml:space="preserve"> token </w:t>
+      </w:r>
+      <w:r>
+        <w:t>之间的依赖关系</w:t>
+      </w:r>
+      <w:r>
+        <w:rPr>
+          <w:sz w:val="18"/>
+          <w:vertAlign w:val="superscript"/>
+        </w:rPr>
+        <w:t>[8]</w:t>
+      </w:r>
+      <w:r>
+        <w:t>。</w:t>
+      </w:r>
+      <w:r>
+        <w:t xml:space="preserve">BERT </w:t>
+      </w:r>
+      <w:r>
+        <w:t>展示了大规模无监督预训练加下游微调的有效性，强调双向上下文表示</w:t>
+      </w:r>
+      <w:r>
+        <w:rPr>
+          <w:sz w:val="18"/>
+          <w:vertAlign w:val="superscript"/>
+        </w:rPr>
+        <w:t>[9]</w:t>
+      </w:r>
+      <w:r>
+        <w:t>；</w:t>
+      </w:r>
+      <w:r>
+        <w:t xml:space="preserve">GPT-3 </w:t>
+      </w:r>
+      <w:r>
+        <w:t>则进一步展示了规模化语言模型在少样本提示下的泛化能力</w:t>
+      </w:r>
+      <w:r>
+        <w:rPr>
+          <w:sz w:val="18"/>
+          <w:vertAlign w:val="superscript"/>
+        </w:rPr>
+        <w:t>[10]</w:t>
+      </w:r>
+      <w:r>
+        <w:t>。这一阶段的变化非常关键：模型不再只是为某个单一任务从零训练，而是先在大规模数据上形成通用表示，再通过提示、微调或对齐服务不同任务。</w:t>
+      </w:r>
+    </w:p>
+    <w:p>
+      <w:pPr>
+        <w:spacing w:after="120" w:line="300" w:lineRule="auto"/>
+        <w:ind w:firstLine="420"/>
+      </w:pPr>
+      <w:r>
+        <w:t xml:space="preserve">Transformer </w:t>
+      </w:r>
+      <w:r>
+        <w:t>也跨出了语言领域。</w:t>
+      </w:r>
+      <w:r>
+        <w:t xml:space="preserve">Vision Transformer </w:t>
+      </w:r>
+      <w:r>
+        <w:t>将图像切成</w:t>
+      </w:r>
+      <w:r>
+        <w:t xml:space="preserve"> patch</w:t>
+      </w:r>
+      <w:r>
+        <w:t>，并把视觉问题转换成</w:t>
+      </w:r>
+      <w:r>
+        <w:t xml:space="preserve"> token </w:t>
+      </w:r>
+      <w:r>
+        <w:t>序列建模问题</w:t>
+      </w:r>
+      <w:r>
+        <w:rPr>
+          <w:sz w:val="18"/>
+          <w:vertAlign w:val="superscript"/>
+        </w:rPr>
+        <w:t>[11]</w:t>
+      </w:r>
+      <w:r>
+        <w:t>。扩散模型则在生成任务中形成另一条主线，</w:t>
+      </w:r>
+      <w:r>
+        <w:t xml:space="preserve">DDPM </w:t>
+      </w:r>
+      <w:r>
+        <w:t>通过逐步去噪实现高质量生成</w:t>
+      </w:r>
+      <w:r>
+        <w:rPr>
+          <w:sz w:val="18"/>
+          <w:vertAlign w:val="superscript"/>
+        </w:rPr>
+        <w:t>[12]</w:t>
+      </w:r>
+      <w:r>
+        <w:t>，</w:t>
+      </w:r>
+      <w:r>
+        <w:t xml:space="preserve">DiT </w:t>
+      </w:r>
+      <w:r>
+        <w:t>又把</w:t>
       </w:r>
       <w:r>
         <w:t xml:space="preserve"> Transformer </w:t>
       </w:r>
       <w:r>
-        <w:t>时代的架构方向概括为四条并行路线：</w:t>
+        <w:t>引入扩散模型主干，进一步说明</w:t>
+      </w:r>
+      <w:r>
+        <w:t xml:space="preserve"> token </w:t>
+      </w:r>
+      <w:r>
+        <w:t>化和注意力结构正在成为多模态建模的通用接口</w:t>
+      </w:r>
+      <w:r>
+        <w:rPr>
+          <w:sz w:val="18"/>
+          <w:vertAlign w:val="superscript"/>
+        </w:rPr>
+        <w:t>[13]</w:t>
+      </w:r>
+      <w:r>
+        <w:t>。</w:t>
+      </w:r>
+    </w:p>
+    <w:tbl>
+      <w:tblPr>
+        <w:tblStyle w:val="af"/>
+        <w:tblW w:w="0" w:type="auto"/>
+        <w:jc w:val="center"/>
+        <w:tblLook w:val="04A0" w:firstRow="1" w:lastRow="0" w:firstColumn="1" w:lastColumn="0" w:noHBand="0" w:noVBand="1"/>
+      </w:tblPr>
+      <w:tblGrid>
+        <w:gridCol w:w="2181"/>
+        <w:gridCol w:w="2180"/>
+        <w:gridCol w:w="2180"/>
+        <w:gridCol w:w="2180"/>
+      </w:tblGrid>
+      <w:tr>
+        <w:trPr>
+          <w:jc w:val="center"/>
+        </w:trPr>
+        <w:tc>
+          <w:tcPr>
+            <w:tcW w:w="2183" w:type="dxa"/>
+            <w:shd w:val="clear" w:color="auto" w:fill="D9EAF7"/>
+            <w:vAlign w:val="center"/>
+          </w:tcPr>
+          <w:p>
+            <w:pPr>
+              <w:jc w:val="center"/>
+            </w:pPr>
+            <w:r>
+              <w:rPr>
+                <w:b/>
+              </w:rPr>
+              <w:t>阶段</w:t>
+            </w:r>
+          </w:p>
+        </w:tc>
+        <w:tc>
+          <w:tcPr>
+            <w:tcW w:w="2183" w:type="dxa"/>
+            <w:shd w:val="clear" w:color="auto" w:fill="D9EAF7"/>
+            <w:vAlign w:val="center"/>
+          </w:tcPr>
+          <w:p>
+            <w:pPr>
+              <w:jc w:val="center"/>
+            </w:pPr>
+            <w:r>
+              <w:rPr>
+                <w:b/>
+              </w:rPr>
+              <w:t>主要结构</w:t>
+            </w:r>
+          </w:p>
+        </w:tc>
+        <w:tc>
+          <w:tcPr>
+            <w:tcW w:w="2183" w:type="dxa"/>
+            <w:shd w:val="clear" w:color="auto" w:fill="D9EAF7"/>
+            <w:vAlign w:val="center"/>
+          </w:tcPr>
+          <w:p>
+            <w:pPr>
+              <w:jc w:val="center"/>
+            </w:pPr>
+            <w:r>
+              <w:rPr>
+                <w:b/>
+              </w:rPr>
+              <w:t>解决的瓶颈</w:t>
+            </w:r>
+          </w:p>
+        </w:tc>
+        <w:tc>
+          <w:tcPr>
+            <w:tcW w:w="2183" w:type="dxa"/>
+            <w:shd w:val="clear" w:color="auto" w:fill="D9EAF7"/>
+            <w:vAlign w:val="center"/>
+          </w:tcPr>
+          <w:p>
+            <w:pPr>
+              <w:jc w:val="center"/>
+            </w:pPr>
+            <w:r>
+              <w:rPr>
+                <w:b/>
+              </w:rPr>
+              <w:t>新问题</w:t>
+            </w:r>
+          </w:p>
+        </w:tc>
+      </w:tr>
+      <w:tr>
+        <w:trPr>
+          <w:jc w:val="center"/>
+        </w:trPr>
+        <w:tc>
+          <w:tcPr>
+            <w:tcW w:w="2183" w:type="dxa"/>
+            <w:vAlign w:val="center"/>
+          </w:tcPr>
+          <w:p>
+            <w:pPr>
+              <w:jc w:val="center"/>
+            </w:pPr>
+            <w:r>
+              <w:rPr>
+                <w:sz w:val="20"/>
+              </w:rPr>
+              <w:t>感知机</w:t>
+            </w:r>
+            <w:r>
+              <w:rPr>
+                <w:sz w:val="20"/>
+              </w:rPr>
+              <w:t>/</w:t>
+            </w:r>
+            <w:r>
+              <w:rPr>
+                <w:sz w:val="20"/>
+              </w:rPr>
+              <w:t>浅层网络</w:t>
+            </w:r>
+          </w:p>
+        </w:tc>
+        <w:tc>
+          <w:tcPr>
+            <w:tcW w:w="2183" w:type="dxa"/>
+            <w:vAlign w:val="center"/>
+          </w:tcPr>
+          <w:p>
+            <w:pPr>
+              <w:jc w:val="center"/>
+            </w:pPr>
+            <w:r>
+              <w:rPr>
+                <w:sz w:val="20"/>
+              </w:rPr>
+              <w:t>线性分类器、简单神经元</w:t>
+            </w:r>
+          </w:p>
+        </w:tc>
+        <w:tc>
+          <w:tcPr>
+            <w:tcW w:w="2183" w:type="dxa"/>
+            <w:vAlign w:val="center"/>
+          </w:tcPr>
+          <w:p>
+            <w:pPr>
+              <w:jc w:val="center"/>
+            </w:pPr>
+            <w:r>
+              <w:rPr>
+                <w:sz w:val="20"/>
+              </w:rPr>
+              <w:t>从规则到学习</w:t>
+            </w:r>
+          </w:p>
+        </w:tc>
+        <w:tc>
+          <w:tcPr>
+            <w:tcW w:w="2183" w:type="dxa"/>
+            <w:vAlign w:val="center"/>
+          </w:tcPr>
+          <w:p>
+            <w:pPr>
+              <w:jc w:val="center"/>
+            </w:pPr>
+            <w:r>
+              <w:rPr>
+                <w:sz w:val="20"/>
+              </w:rPr>
+              <w:t>表示能力弱</w:t>
+            </w:r>
+          </w:p>
+        </w:tc>
+      </w:tr>
+      <w:tr>
+        <w:trPr>
+          <w:jc w:val="center"/>
+        </w:trPr>
+        <w:tc>
+          <w:tcPr>
+            <w:tcW w:w="2183" w:type="dxa"/>
+            <w:vAlign w:val="center"/>
+          </w:tcPr>
+          <w:p>
+            <w:pPr>
+              <w:jc w:val="center"/>
+            </w:pPr>
+            <w:r>
+              <w:rPr>
+                <w:sz w:val="20"/>
+              </w:rPr>
+              <w:t>CNN/ResNet</w:t>
+            </w:r>
+          </w:p>
+        </w:tc>
+        <w:tc>
+          <w:tcPr>
+            <w:tcW w:w="2183" w:type="dxa"/>
+            <w:vAlign w:val="center"/>
+          </w:tcPr>
+          <w:p>
+            <w:pPr>
+              <w:jc w:val="center"/>
+            </w:pPr>
+            <w:r>
+              <w:rPr>
+                <w:sz w:val="20"/>
+              </w:rPr>
+              <w:t>卷积、残差连接</w:t>
+            </w:r>
+          </w:p>
+        </w:tc>
+        <w:tc>
+          <w:tcPr>
+            <w:tcW w:w="2183" w:type="dxa"/>
+            <w:vAlign w:val="center"/>
+          </w:tcPr>
+          <w:p>
+            <w:pPr>
+              <w:jc w:val="center"/>
+            </w:pPr>
+            <w:r>
+              <w:rPr>
+                <w:sz w:val="20"/>
+              </w:rPr>
+              <w:t>空间层级与深层优化</w:t>
+            </w:r>
+          </w:p>
+        </w:tc>
+        <w:tc>
+          <w:tcPr>
+            <w:tcW w:w="2183" w:type="dxa"/>
+            <w:vAlign w:val="center"/>
+          </w:tcPr>
+          <w:p>
+            <w:pPr>
+              <w:jc w:val="center"/>
+            </w:pPr>
+            <w:r>
+              <w:rPr>
+                <w:sz w:val="20"/>
+              </w:rPr>
+              <w:t>跨模态统一性不足</w:t>
+            </w:r>
+          </w:p>
+        </w:tc>
+      </w:tr>
+      <w:tr>
+        <w:trPr>
+          <w:jc w:val="center"/>
+        </w:trPr>
+        <w:tc>
+          <w:tcPr>
+            <w:tcW w:w="2183" w:type="dxa"/>
+            <w:vAlign w:val="center"/>
+          </w:tcPr>
+          <w:p>
+            <w:pPr>
+              <w:jc w:val="center"/>
+            </w:pPr>
+            <w:r>
+              <w:rPr>
+                <w:sz w:val="20"/>
+              </w:rPr>
+              <w:t>RNN/LSTM</w:t>
+            </w:r>
+          </w:p>
+        </w:tc>
+        <w:tc>
+          <w:tcPr>
+            <w:tcW w:w="2183" w:type="dxa"/>
+            <w:vAlign w:val="center"/>
+          </w:tcPr>
+          <w:p>
+            <w:pPr>
+              <w:jc w:val="center"/>
+            </w:pPr>
+            <w:r>
+              <w:rPr>
+                <w:sz w:val="20"/>
+              </w:rPr>
+              <w:t>循环与门控记忆</w:t>
+            </w:r>
+          </w:p>
+        </w:tc>
+        <w:tc>
+          <w:tcPr>
+            <w:tcW w:w="2183" w:type="dxa"/>
+            <w:vAlign w:val="center"/>
+          </w:tcPr>
+          <w:p>
+            <w:pPr>
+              <w:jc w:val="center"/>
+            </w:pPr>
+            <w:r>
+              <w:rPr>
+                <w:sz w:val="20"/>
+              </w:rPr>
+              <w:t>序列依赖</w:t>
+            </w:r>
+          </w:p>
+        </w:tc>
+        <w:tc>
+          <w:tcPr>
+            <w:tcW w:w="2183" w:type="dxa"/>
+            <w:vAlign w:val="center"/>
+          </w:tcPr>
+          <w:p>
+            <w:pPr>
+              <w:jc w:val="center"/>
+            </w:pPr>
+            <w:r>
+              <w:rPr>
+                <w:sz w:val="20"/>
+              </w:rPr>
+              <w:t>并行效率低</w:t>
+            </w:r>
+          </w:p>
+        </w:tc>
+      </w:tr>
+      <w:tr>
+        <w:trPr>
+          <w:jc w:val="center"/>
+        </w:trPr>
+        <w:tc>
+          <w:tcPr>
+            <w:tcW w:w="2183" w:type="dxa"/>
+            <w:vAlign w:val="center"/>
+          </w:tcPr>
+          <w:p>
+            <w:pPr>
+              <w:jc w:val="center"/>
+            </w:pPr>
+            <w:r>
+              <w:rPr>
+                <w:sz w:val="20"/>
+              </w:rPr>
+              <w:t>Transformer</w:t>
+            </w:r>
+          </w:p>
+        </w:tc>
+        <w:tc>
+          <w:tcPr>
+            <w:tcW w:w="2183" w:type="dxa"/>
+            <w:vAlign w:val="center"/>
+          </w:tcPr>
+          <w:p>
+            <w:pPr>
+              <w:jc w:val="center"/>
+            </w:pPr>
+            <w:r>
+              <w:rPr>
+                <w:sz w:val="20"/>
+              </w:rPr>
+              <w:t>自注意力、残差、归一化</w:t>
+            </w:r>
+          </w:p>
+        </w:tc>
+        <w:tc>
+          <w:tcPr>
+            <w:tcW w:w="2183" w:type="dxa"/>
+            <w:vAlign w:val="center"/>
+          </w:tcPr>
+          <w:p>
+            <w:pPr>
+              <w:jc w:val="center"/>
+            </w:pPr>
+            <w:r>
+              <w:rPr>
+                <w:sz w:val="20"/>
+              </w:rPr>
+              <w:t>全局上下文与并行训练</w:t>
+            </w:r>
+          </w:p>
+        </w:tc>
+        <w:tc>
+          <w:tcPr>
+            <w:tcW w:w="2183" w:type="dxa"/>
+            <w:vAlign w:val="center"/>
+          </w:tcPr>
+          <w:p>
+            <w:pPr>
+              <w:jc w:val="center"/>
+            </w:pPr>
+            <w:r>
+              <w:rPr>
+                <w:sz w:val="20"/>
+              </w:rPr>
+              <w:t>长上下文计算代价高</w:t>
+            </w:r>
+          </w:p>
+        </w:tc>
+      </w:tr>
+      <w:tr>
+        <w:trPr>
+          <w:jc w:val="center"/>
+        </w:trPr>
+        <w:tc>
+          <w:tcPr>
+            <w:tcW w:w="2183" w:type="dxa"/>
+            <w:vAlign w:val="center"/>
+          </w:tcPr>
+          <w:p>
+            <w:pPr>
+              <w:jc w:val="center"/>
+            </w:pPr>
+            <w:r>
+              <w:rPr>
+                <w:sz w:val="20"/>
+              </w:rPr>
+              <w:t>基础模型</w:t>
+            </w:r>
+          </w:p>
+        </w:tc>
+        <w:tc>
+          <w:tcPr>
+            <w:tcW w:w="2183" w:type="dxa"/>
+            <w:vAlign w:val="center"/>
+          </w:tcPr>
+          <w:p>
+            <w:pPr>
+              <w:jc w:val="center"/>
+            </w:pPr>
+            <w:r>
+              <w:rPr>
+                <w:sz w:val="20"/>
+              </w:rPr>
+              <w:t>大规模预训练、提示学习</w:t>
+            </w:r>
+          </w:p>
+        </w:tc>
+        <w:tc>
+          <w:tcPr>
+            <w:tcW w:w="2183" w:type="dxa"/>
+            <w:vAlign w:val="center"/>
+          </w:tcPr>
+          <w:p>
+            <w:pPr>
+              <w:jc w:val="center"/>
+            </w:pPr>
+            <w:r>
+              <w:rPr>
+                <w:sz w:val="20"/>
+              </w:rPr>
+              <w:t>跨任务泛化</w:t>
+            </w:r>
+          </w:p>
+        </w:tc>
+        <w:tc>
+          <w:tcPr>
+            <w:tcW w:w="2183" w:type="dxa"/>
+            <w:vAlign w:val="center"/>
+          </w:tcPr>
+          <w:p>
+            <w:pPr>
+              <w:jc w:val="center"/>
+            </w:pPr>
+            <w:r>
+              <w:rPr>
+                <w:sz w:val="20"/>
+              </w:rPr>
+              <w:t>成本、对齐与可靠性</w:t>
+            </w:r>
+          </w:p>
+        </w:tc>
+      </w:tr>
+    </w:tbl>
+    <w:p/>
+    <w:p>
+      <w:pPr>
+        <w:pStyle w:val="1"/>
+        <w:spacing w:before="240" w:after="120"/>
+        <w:jc w:val="center"/>
+      </w:pPr>
+      <w:bookmarkStart w:id="6" w:name="_Toc232187414"/>
+      <w:r>
+        <w:t>第三章</w:t>
+      </w:r>
+      <w:r>
+        <w:t xml:space="preserve"> </w:t>
+      </w:r>
+      <w:r>
+        <w:t>目前最新的深度学习模型架构</w:t>
+      </w:r>
+      <w:bookmarkEnd w:id="6"/>
+    </w:p>
+    <w:p>
+      <w:pPr>
+        <w:pStyle w:val="21"/>
+        <w:spacing w:before="200" w:after="80"/>
+      </w:pPr>
+      <w:bookmarkStart w:id="7" w:name="_Toc232187415"/>
+      <w:r>
+        <w:t xml:space="preserve">3.1 Dense Transformer </w:t>
+      </w:r>
+      <w:r>
+        <w:t>仍是主干，但不再是唯一答案</w:t>
+      </w:r>
+      <w:bookmarkEnd w:id="7"/>
+    </w:p>
+    <w:p>
+      <w:pPr>
+        <w:spacing w:after="120" w:line="300" w:lineRule="auto"/>
+        <w:ind w:firstLine="420"/>
+      </w:pPr>
+      <w:r>
+        <w:t>截至</w:t>
+      </w:r>
+      <w:r>
+        <w:t xml:space="preserve"> 2026 </w:t>
+      </w:r>
+      <w:r>
+        <w:t>年，</w:t>
+      </w:r>
+      <w:r>
+        <w:t xml:space="preserve">Transformer </w:t>
+      </w:r>
+      <w:r>
+        <w:t>仍然是语言模型、多模态模型和扩散生成模型的核心主干之一。原因很直接：它的自注意力机制通用、并行友好，工程生态成熟，并能与大规模预训练很好结合。但是它的代价也很明显：注意力计算随序列长度增长而变重，大模型全参数激活导致推理成本高，多模态输入和工具调用又进一步放大上下文长度压力。</w:t>
+      </w:r>
+    </w:p>
+    <w:p>
+      <w:pPr>
+        <w:spacing w:after="120" w:line="300" w:lineRule="auto"/>
+        <w:ind w:firstLine="420"/>
+      </w:pPr>
+      <w:r>
+        <w:t>因此，所谓</w:t>
+      </w:r>
+      <w:r>
+        <w:t>“</w:t>
+      </w:r>
+      <w:r>
+        <w:t>最新架构</w:t>
+      </w:r>
+      <w:r>
+        <w:t>”</w:t>
+      </w:r>
+      <w:r>
+        <w:t>更准确地说是后</w:t>
+      </w:r>
+      <w:r>
+        <w:t xml:space="preserve"> Transformer </w:t>
+      </w:r>
+      <w:r>
+        <w:t>时代的架构族群：</w:t>
       </w:r>
       <w:r>
         <w:t xml:space="preserve">Dense Transformer </w:t>
       </w:r>
       <w:r>
-        <w:t>保持通用性，</w:t>
+        <w:t>作为基线仍在演进；</w:t>
       </w:r>
       <w:r>
         <w:t xml:space="preserve">MoE </w:t>
       </w:r>
       <w:r>
-        <w:t>追求稀疏激活，</w:t>
+        <w:t>用条件计算提高参数容量与成本比；</w:t>
       </w:r>
       <w:r>
         <w:t xml:space="preserve">SSM/Mamba </w:t>
       </w:r>
       <w:r>
-        <w:t>追求长序列效率，多模态基础模型追求跨模态统一。图中的检索、工具与安全对齐提醒我们，现代深度学习已经越来越像一个端到端系统，而不是孤立的神经网络层堆叠。</w:t>
+        <w:t>试图用线性时间序列建模改善长上下文效率；多模态基础模型则把视觉、文本、视频、语音和工具使用统一到更复杂的系统中。</w:t>
+      </w:r>
+    </w:p>
+    <w:p>
+      <w:pPr>
+        <w:pStyle w:val="21"/>
+        <w:spacing w:before="200" w:after="80"/>
+      </w:pPr>
+      <w:bookmarkStart w:id="8" w:name="_Toc232187416"/>
+      <w:r>
+        <w:lastRenderedPageBreak/>
+        <w:t>3.2 MoE</w:t>
+      </w:r>
+      <w:r>
+        <w:t>：用稀疏激活换取更大容量</w:t>
+      </w:r>
+      <w:bookmarkEnd w:id="8"/>
+    </w:p>
+    <w:p>
+      <w:pPr>
+        <w:spacing w:after="120" w:line="300" w:lineRule="auto"/>
+        <w:ind w:firstLine="420"/>
+      </w:pPr>
+      <w:r>
+        <w:t xml:space="preserve">Mixture of Experts </w:t>
+      </w:r>
+      <w:r>
+        <w:t>的核心想法是让每个</w:t>
+      </w:r>
+      <w:r>
+        <w:t xml:space="preserve"> token </w:t>
+      </w:r>
+      <w:r>
+        <w:t>只激活部分专家网络，从而在总参数规模很大时控制单次计算成本。</w:t>
+      </w:r>
+      <w:r>
+        <w:t xml:space="preserve">Switch Transformer </w:t>
+      </w:r>
+      <w:r>
+        <w:t>展示了用简单稀疏路由扩展到超大参数规模的可行性</w:t>
+      </w:r>
+      <w:r>
+        <w:rPr>
+          <w:sz w:val="18"/>
+          <w:vertAlign w:val="superscript"/>
+        </w:rPr>
+        <w:t>[14]</w:t>
+      </w:r>
+      <w:r>
+        <w:t>。与稀疏专家路线并行，</w:t>
+      </w:r>
+      <w:r>
+        <w:t xml:space="preserve">Mamba </w:t>
+      </w:r>
+      <w:r>
+        <w:t>和</w:t>
+      </w:r>
+      <w:r>
+        <w:t xml:space="preserve"> Mamba-2 </w:t>
+      </w:r>
+      <w:r>
+        <w:t>又从状态空间模型角度重新讨论长序列效率</w:t>
+      </w:r>
+      <w:r>
+        <w:rPr>
+          <w:sz w:val="18"/>
+          <w:vertAlign w:val="superscript"/>
+        </w:rPr>
+        <w:t>[15-16]</w:t>
+      </w:r>
+      <w:r>
+        <w:t>。到</w:t>
+      </w:r>
+      <w:r>
+        <w:t xml:space="preserve"> DeepSeek-V3 </w:t>
+      </w:r>
+      <w:r>
+        <w:t>这类技术报告中，</w:t>
+      </w:r>
+      <w:r>
+        <w:t xml:space="preserve">MoE </w:t>
+      </w:r>
+      <w:r>
+        <w:t>已经成为前沿大语言模型的重要路线之一，其目标不是简单堆参数，而是提高</w:t>
+      </w:r>
+      <w:r>
+        <w:t>“</w:t>
+      </w:r>
+      <w:r>
+        <w:t>模型容量</w:t>
+      </w:r>
+      <w:r>
+        <w:t>/</w:t>
+      </w:r>
+      <w:r>
+        <w:t>实际计算量</w:t>
+      </w:r>
+      <w:r>
+        <w:t>”</w:t>
+      </w:r>
+      <w:r>
+        <w:t>的比值</w:t>
+      </w:r>
+      <w:r>
+        <w:rPr>
+          <w:sz w:val="18"/>
+          <w:vertAlign w:val="superscript"/>
+        </w:rPr>
+        <w:t>[17]</w:t>
+      </w:r>
+      <w:r>
+        <w:t>。</w:t>
+      </w:r>
+    </w:p>
+    <w:p>
+      <w:pPr>
+        <w:spacing w:after="120" w:line="300" w:lineRule="auto"/>
+        <w:ind w:firstLine="420"/>
+      </w:pPr>
+      <w:r>
+        <w:t>但</w:t>
+      </w:r>
+      <w:r>
+        <w:t xml:space="preserve"> MoE </w:t>
+      </w:r>
+      <w:r>
+        <w:t>也带来新的工程问题：路由负载均衡、专家利用率、通信开销、训练稳定性和推理部署复杂度。我的判断是，</w:t>
+      </w:r>
+      <w:r>
+        <w:t xml:space="preserve">MoE </w:t>
+      </w:r>
+      <w:r>
+        <w:t>更像一种</w:t>
+      </w:r>
+      <w:r>
+        <w:t>“</w:t>
+      </w:r>
+      <w:r>
+        <w:t>系统架构</w:t>
+      </w:r>
+      <w:r>
+        <w:t>”</w:t>
+      </w:r>
+      <w:r>
+        <w:t>而不是单纯</w:t>
+      </w:r>
+      <w:r>
+        <w:t>“</w:t>
+      </w:r>
+      <w:r>
+        <w:t>网络层结构</w:t>
+      </w:r>
+      <w:r>
+        <w:t>”</w:t>
+      </w:r>
+      <w:r>
+        <w:t>：它把模型质量问题部分转化为调度、通信和并行计算问题。未来能否继续扩展，取决于硬件互联、编译器、推理框架和训练算法能否一起进步。</w:t>
+      </w:r>
+    </w:p>
+    <w:p>
+      <w:pPr>
+        <w:pStyle w:val="21"/>
+        <w:spacing w:before="200" w:after="80"/>
+      </w:pPr>
+      <w:bookmarkStart w:id="9" w:name="_Toc232187417"/>
+      <w:r>
+        <w:t>3.3 SSM/Mamba</w:t>
+      </w:r>
+      <w:r>
+        <w:t>：重新思考长序列效率</w:t>
+      </w:r>
+      <w:bookmarkEnd w:id="9"/>
+    </w:p>
+    <w:p>
+      <w:pPr>
+        <w:spacing w:after="120" w:line="300" w:lineRule="auto"/>
+        <w:ind w:firstLine="420"/>
+      </w:pPr>
+      <w:r>
+        <w:t>状态空间模型路线关注的是长序列建模效率。</w:t>
+      </w:r>
+      <w:r>
+        <w:t xml:space="preserve">Mamba </w:t>
+      </w:r>
+      <w:r>
+        <w:t>将选择性状态空间模型整合成端到端序列主干，强调线性时间扩展和硬件友好实现</w:t>
+      </w:r>
+      <w:r>
+        <w:rPr>
+          <w:sz w:val="18"/>
+          <w:vertAlign w:val="superscript"/>
+        </w:rPr>
+        <w:t>[15]</w:t>
+      </w:r>
+      <w:r>
+        <w:t>。</w:t>
+      </w:r>
+      <w:r>
+        <w:t xml:space="preserve">Mamba-2 </w:t>
+      </w:r>
+      <w:r>
+        <w:t>进一步从结构化状态空间对偶角度建立</w:t>
+      </w:r>
+      <w:r>
+        <w:t xml:space="preserve"> SSM </w:t>
+      </w:r>
+      <w:r>
+        <w:t>与注意力之间的联系，并报告更高效的算法设计</w:t>
+      </w:r>
+      <w:r>
+        <w:rPr>
+          <w:sz w:val="18"/>
+          <w:vertAlign w:val="superscript"/>
+        </w:rPr>
+        <w:t>[16]</w:t>
+      </w:r>
+      <w:r>
+        <w:t>。这条路线的重要性在于，它没有把</w:t>
+      </w:r>
+      <w:r>
+        <w:t xml:space="preserve"> Transformer </w:t>
+      </w:r>
+      <w:r>
+        <w:t>视为不可替代的终点，而是追问：长上下文建模到底需要完整二次注意力，还是可以用选择性状态传播实现更高性价比。</w:t>
+      </w:r>
+    </w:p>
+    <w:p>
+      <w:pPr>
+        <w:spacing w:after="120" w:line="300" w:lineRule="auto"/>
+        <w:ind w:firstLine="420"/>
+      </w:pPr>
+      <w:r>
+        <w:t>我认为</w:t>
+      </w:r>
+      <w:r>
+        <w:t xml:space="preserve"> SSM/Mamba </w:t>
+      </w:r>
+      <w:r>
+        <w:t>的未来价值不一定是完全取代</w:t>
+      </w:r>
+      <w:r>
+        <w:t xml:space="preserve"> Transformer</w:t>
+      </w:r>
+      <w:r>
+        <w:t>，而可能是形成混合架构。例如局部高频信息用状态扫描处理，关键跨段关系仍用注意力或检索机制补充。对于长视频、长文档、基因序列、日志序列和持续交互式智能体，这类结构的吸引力会越来越强。</w:t>
+      </w:r>
+    </w:p>
+    <w:p>
+      <w:pPr>
+        <w:pStyle w:val="21"/>
+        <w:spacing w:before="200" w:after="80"/>
+      </w:pPr>
+      <w:bookmarkStart w:id="10" w:name="_Toc232187418"/>
+      <w:r>
+        <w:t xml:space="preserve">3.4 </w:t>
+      </w:r>
+      <w:r>
+        <w:t>多模态基础模型：从</w:t>
+      </w:r>
+      <w:r>
+        <w:t>“</w:t>
+      </w:r>
+      <w:r>
+        <w:t>模型</w:t>
+      </w:r>
+      <w:r>
+        <w:t>”</w:t>
+      </w:r>
+      <w:r>
+        <w:t>走向</w:t>
+      </w:r>
+      <w:r>
+        <w:t>“</w:t>
+      </w:r>
+      <w:r>
+        <w:t>系统</w:t>
+      </w:r>
+      <w:r>
+        <w:t>”</w:t>
+      </w:r>
+      <w:bookmarkEnd w:id="10"/>
+    </w:p>
+    <w:p>
+      <w:pPr>
+        <w:spacing w:after="120" w:line="300" w:lineRule="auto"/>
+        <w:ind w:firstLine="420"/>
+      </w:pPr>
+      <w:r>
+        <w:t>最新深度学习架构的另一条主线是多模态基础模型。</w:t>
+      </w:r>
+      <w:r>
+        <w:t xml:space="preserve">Qwen3 </w:t>
+      </w:r>
+      <w:r>
+        <w:t>报告展示了</w:t>
+      </w:r>
+      <w:r>
+        <w:t xml:space="preserve"> dense </w:t>
+      </w:r>
+      <w:r>
+        <w:t>与</w:t>
+      </w:r>
+      <w:r>
+        <w:t xml:space="preserve"> MoE </w:t>
+      </w:r>
+      <w:r>
+        <w:t>等不同模型形态下的能力扩展</w:t>
+      </w:r>
+      <w:r>
+        <w:rPr>
+          <w:sz w:val="18"/>
+          <w:vertAlign w:val="superscript"/>
+        </w:rPr>
+        <w:t>[18]</w:t>
+      </w:r>
+      <w:r>
+        <w:t>；</w:t>
+      </w:r>
+      <w:r>
+        <w:t xml:space="preserve">Qwen3-VL </w:t>
+      </w:r>
+      <w:r>
+        <w:t>则将文本、图像和视频统一到视觉语言模型中，并支持长上下文、多图像和视频理解等能力</w:t>
+      </w:r>
+      <w:r>
+        <w:rPr>
+          <w:sz w:val="18"/>
+          <w:vertAlign w:val="superscript"/>
+        </w:rPr>
+        <w:t>[19]</w:t>
+      </w:r>
+      <w:r>
+        <w:t>。这说明前沿模型正在从</w:t>
+      </w:r>
+      <w:r>
+        <w:t>“</w:t>
+      </w:r>
+      <w:r>
+        <w:t>单一输入、单一输出</w:t>
+      </w:r>
+      <w:r>
+        <w:t>”</w:t>
+      </w:r>
+      <w:r>
+        <w:t>的网络，转向</w:t>
+      </w:r>
+      <w:r>
+        <w:t>“</w:t>
+      </w:r>
+      <w:r>
+        <w:t>多模态编码、跨模态对齐、长上下文记忆、工具调用和安全对齐</w:t>
+      </w:r>
+      <w:r>
+        <w:t>”</w:t>
+      </w:r>
+      <w:r>
+        <w:t>的系统。</w:t>
+      </w:r>
+    </w:p>
+    <w:p>
+      <w:pPr>
+        <w:spacing w:after="120" w:line="300" w:lineRule="auto"/>
+        <w:ind w:firstLine="420"/>
+      </w:pPr>
+      <w:r>
+        <w:t xml:space="preserve">2026 </w:t>
+      </w:r>
+      <w:r>
+        <w:t>年</w:t>
+      </w:r>
+      <w:r>
+        <w:t xml:space="preserve"> AI Index </w:t>
+      </w:r>
+      <w:r>
+        <w:t>也显示，前沿</w:t>
+      </w:r>
+      <w:r>
+        <w:t xml:space="preserve"> AI </w:t>
+      </w:r>
+      <w:r>
+        <w:t>能力仍在加速，产业界贡献了大多数</w:t>
+      </w:r>
+      <w:r>
+        <w:t xml:space="preserve"> notable frontier models</w:t>
+      </w:r>
+      <w:r>
+        <w:t>，模型在多模态推理、科学问题和代码任务上持续提升，但负责任</w:t>
+      </w:r>
+      <w:r>
+        <w:t xml:space="preserve"> AI </w:t>
+      </w:r>
+      <w:r>
+        <w:t>测量、基础设施能耗和治理能力仍然落后于能力增长</w:t>
+      </w:r>
+      <w:r>
+        <w:rPr>
+          <w:sz w:val="18"/>
+          <w:vertAlign w:val="superscript"/>
+        </w:rPr>
+        <w:t>[20]</w:t>
+      </w:r>
+      <w:r>
+        <w:t>。这提醒我们：最新架构不是只看</w:t>
+      </w:r>
+      <w:r>
+        <w:t xml:space="preserve"> benchmark </w:t>
+      </w:r>
+      <w:r>
+        <w:t>分数，还要看成本、透明度、可靠性和社会部署条件。</w:t>
       </w:r>
     </w:p>
     <w:p>
@@ -3926,8 +3808,109 @@
         <w:rPr>
           <w:noProof/>
         </w:rPr>
+        <w:lastRenderedPageBreak/>
         <w:drawing>
-          <wp:inline distT="0" distB="0" distL="0" distR="0" wp14:anchorId="46F5E597" wp14:editId="6275BAAE">
+          <wp:inline distT="0" distB="0" distL="0" distR="0" wp14:anchorId="733472C0" wp14:editId="3E2333ED">
+            <wp:extent cx="4968000" cy="2795986"/>
+            <wp:effectExtent l="0" t="0" r="0" b="0"/>
+            <wp:docPr id="2" name="Picture 2"/>
+            <wp:cNvGraphicFramePr>
+              <a:graphicFrameLocks xmlns:a="http://schemas.openxmlformats.org/drawingml/2006/main" noChangeAspect="1"/>
+            </wp:cNvGraphicFramePr>
+            <a:graphic xmlns:a="http://schemas.openxmlformats.org/drawingml/2006/main">
+              <a:graphicData uri="http://schemas.openxmlformats.org/drawingml/2006/picture">
+                <pic:pic xmlns:pic="http://schemas.openxmlformats.org/drawingml/2006/picture">
+                  <pic:nvPicPr>
+                    <pic:cNvPr id="0" name="ai-current-architecture-landscape.png"/>
+                    <pic:cNvPicPr/>
+                  </pic:nvPicPr>
+                  <pic:blipFill>
+                    <a:blip r:embed="rId10"/>
+                    <a:stretch>
+                      <a:fillRect/>
+                    </a:stretch>
+                  </pic:blipFill>
+                  <pic:spPr>
+                    <a:xfrm>
+                      <a:off x="0" y="0"/>
+                      <a:ext cx="4968000" cy="2795986"/>
+                    </a:xfrm>
+                    <a:prstGeom prst="rect">
+                      <a:avLst/>
+                    </a:prstGeom>
+                  </pic:spPr>
+                </pic:pic>
+              </a:graphicData>
+            </a:graphic>
+          </wp:inline>
+        </w:drawing>
+      </w:r>
+    </w:p>
+    <w:p>
+      <w:pPr>
+        <w:spacing w:after="120"/>
+        <w:jc w:val="center"/>
+      </w:pPr>
+      <w:r>
+        <w:t>图</w:t>
+      </w:r>
+      <w:r>
+        <w:t xml:space="preserve">3.1 </w:t>
+      </w:r>
+      <w:r>
+        <w:t>后</w:t>
+      </w:r>
+      <w:r>
+        <w:t xml:space="preserve"> Transformer </w:t>
+      </w:r>
+      <w:r>
+        <w:t>时代主要架构方向概念图</w:t>
+      </w:r>
+    </w:p>
+    <w:p>
+      <w:pPr>
+        <w:spacing w:after="120" w:line="300" w:lineRule="auto"/>
+        <w:ind w:firstLine="420"/>
+      </w:pPr>
+      <w:r>
+        <w:t>这张图把后</w:t>
+      </w:r>
+      <w:r>
+        <w:t xml:space="preserve"> Transformer </w:t>
+      </w:r>
+      <w:r>
+        <w:t>时代的架构方向概括为四条并行路线：</w:t>
+      </w:r>
+      <w:r>
+        <w:t xml:space="preserve">Dense Transformer </w:t>
+      </w:r>
+      <w:r>
+        <w:t>保持通用性，</w:t>
+      </w:r>
+      <w:r>
+        <w:t xml:space="preserve">MoE </w:t>
+      </w:r>
+      <w:r>
+        <w:t>追求稀疏激活，</w:t>
+      </w:r>
+      <w:r>
+        <w:t xml:space="preserve">SSM/Mamba </w:t>
+      </w:r>
+      <w:r>
+        <w:t>追求长序列效率，多模态基础模型追求跨模态统一。图中的检索、工具与安全对齐提醒我们，现代深度学习已经越来越像一个端到端系统，而不是孤立的神经网络层堆叠。</w:t>
+      </w:r>
+    </w:p>
+    <w:p>
+      <w:pPr>
+        <w:spacing w:before="120"/>
+        <w:jc w:val="center"/>
+      </w:pPr>
+      <w:r>
+        <w:rPr>
+          <w:noProof/>
+        </w:rPr>
+        <w:drawing>
+          <wp:inline distT="0" distB="0" distL="0" distR="0" wp14:anchorId="678BCE75" wp14:editId="797C43A7">
             <wp:extent cx="4752000" cy="2645443"/>
             <wp:effectExtent l="0" t="0" r="0" b="0"/>
             <wp:docPr id="3" name="Picture 3"/>
@@ -3942,7 +3925,7 @@
                     <pic:cNvPicPr/>
                   </pic:nvPicPr>
                   <pic:blipFill>
-                    <a:blip r:embed="rId10"/>
+                    <a:blip r:embed="rId11"/>
                     <a:stretch>
                       <a:fillRect/>
                     </a:stretch>
@@ -4466,7 +4449,7 @@
         <w:spacing w:before="240" w:after="120"/>
         <w:jc w:val="center"/>
       </w:pPr>
-      <w:bookmarkStart w:id="11" w:name="_Toc232181192"/>
+      <w:bookmarkStart w:id="11" w:name="_Toc232187419"/>
       <w:r>
         <w:t>第四章</w:t>
       </w:r>
@@ -4483,7 +4466,7 @@
         <w:pStyle w:val="21"/>
         <w:spacing w:before="200" w:after="80"/>
       </w:pPr>
-      <w:bookmarkStart w:id="12" w:name="_Toc232181193"/>
+      <w:bookmarkStart w:id="12" w:name="_Toc232187420"/>
       <w:r>
         <w:t xml:space="preserve">4.1 </w:t>
       </w:r>
@@ -4551,7 +4534,7 @@
         <w:pStyle w:val="21"/>
         <w:spacing w:before="200" w:after="80"/>
       </w:pPr>
-      <w:bookmarkStart w:id="13" w:name="_Toc232181194"/>
+      <w:bookmarkStart w:id="13" w:name="_Toc232187421"/>
       <w:r>
         <w:t xml:space="preserve">4.2 </w:t>
       </w:r>
@@ -4619,7 +4602,7 @@
         <w:pStyle w:val="21"/>
         <w:spacing w:before="200" w:after="80"/>
       </w:pPr>
-      <w:bookmarkStart w:id="14" w:name="_Toc232181195"/>
+      <w:bookmarkStart w:id="14" w:name="_Toc232187422"/>
       <w:r>
         <w:t xml:space="preserve">4.3 </w:t>
       </w:r>
@@ -5168,7 +5151,7 @@
         <w:spacing w:before="240" w:after="120"/>
         <w:jc w:val="center"/>
       </w:pPr>
-      <w:bookmarkStart w:id="15" w:name="_Toc232181196"/>
+      <w:bookmarkStart w:id="15" w:name="_Toc232187423"/>
       <w:r>
         <w:t>第五章</w:t>
       </w:r>
@@ -5257,7 +5240,7 @@
         <w:spacing w:before="240" w:after="120"/>
         <w:jc w:val="center"/>
       </w:pPr>
-      <w:bookmarkStart w:id="16" w:name="_Toc232181197"/>
+      <w:bookmarkStart w:id="16" w:name="_Toc232187424"/>
       <w:r>
         <w:lastRenderedPageBreak/>
         <w:t>参考文献</w:t>
@@ -5285,7 +5268,13 @@
         <w:rPr>
           <w:sz w:val="20"/>
         </w:rPr>
-        <w:t>[2] Rosenblatt F. The perceptron: A probabilistic model for information storage and organization in the brain[J]. Psychological Review, 1958, 65(6): 386-408. DOI: 10.1037/h0042519.</w:t>
+        <w:t xml:space="preserve">[2] Rosenblatt F. The </w:t>
+      </w:r>
+      <w:r>
+        <w:rPr>
+          <w:sz w:val="20"/>
+        </w:rPr>
+        <w:t>perceptron: A probabilistic model for information storage and organization in the brain[J]. Psychological Review, 1958, 65(6): 386-408. DOI: 10.1037/h0042519.</w:t>
       </w:r>
     </w:p>
     <w:p>
@@ -5506,7 +5495,6 @@
       </w:r>
     </w:p>
     <w:sectPr>
-      <w:footerReference w:type="default" r:id="rId11"/>
       <w:pgSz w:w="11906" w:h="16838"/>
       <w:pgMar w:top="1440" w:right="1474" w:bottom="1440" w:left="1701" w:header="851" w:footer="992" w:gutter="0"/>
       <w:pgNumType w:start="1"/>

</xml_diff>

<commit_message>
hide front matter page numbers
</commit_message>
<xml_diff>
--- a/docs/deep-learning-architecture-report-demo.docx
+++ b/docs/deep-learning-architecture-report-demo.docx
@@ -290,7 +290,6 @@
           <w:szCs w:val="28"/>
         </w:rPr>
         <w:sectPr>
-          <w:footerReference w:type="default" r:id="rId7"/>
           <w:pgSz w:w="11906" w:h="16838"/>
           <w:pgMar w:top="1440" w:right="1474" w:bottom="1440" w:left="1701" w:header="851" w:footer="992" w:gutter="0"/>
           <w:cols w:space="425"/>
@@ -348,7 +347,7 @@
       <w:r>
         <w:fldChar w:fldCharType="separate"/>
       </w:r>
-      <w:hyperlink w:anchor="_Toc232187408" w:history="1">
+      <w:hyperlink w:anchor="_Toc232188021" w:history="1">
         <w:r>
           <w:rPr>
             <w:rStyle w:val="af2"/>
@@ -417,7 +416,7 @@
             <w:noProof/>
             <w:webHidden/>
           </w:rPr>
-          <w:instrText xml:space="preserve"> PAGEREF _Toc232187408 \h </w:instrText>
+          <w:instrText xml:space="preserve"> PAGEREF _Toc232188021 \h </w:instrText>
         </w:r>
         <w:r>
           <w:rPr>
@@ -458,7 +457,7 @@
           <w14:ligatures w14:val="standardContextual"/>
         </w:rPr>
       </w:pPr>
-      <w:hyperlink w:anchor="_Toc232187409" w:history="1">
+      <w:hyperlink w:anchor="_Toc232188022" w:history="1">
         <w:r>
           <w:rPr>
             <w:rStyle w:val="af2"/>
@@ -499,7 +498,7 @@
             <w:noProof/>
             <w:webHidden/>
           </w:rPr>
-          <w:instrText xml:space="preserve"> PAGEREF _Toc232187409 \h </w:instrText>
+          <w:instrText xml:space="preserve"> PAGEREF _Toc232188022 \h </w:instrText>
         </w:r>
         <w:r>
           <w:rPr>
@@ -541,7 +540,7 @@
           <w14:ligatures w14:val="standardContextual"/>
         </w:rPr>
       </w:pPr>
-      <w:hyperlink w:anchor="_Toc232187410" w:history="1">
+      <w:hyperlink w:anchor="_Toc232188023" w:history="1">
         <w:r>
           <w:rPr>
             <w:rStyle w:val="af2"/>
@@ -575,7 +574,7 @@
             <w:noProof/>
             <w:webHidden/>
           </w:rPr>
-          <w:instrText xml:space="preserve"> PAGEREF _Toc232187410 \h </w:instrText>
+          <w:instrText xml:space="preserve"> PAGEREF _Toc232188023 \h </w:instrText>
         </w:r>
         <w:r>
           <w:rPr>
@@ -617,7 +616,7 @@
           <w14:ligatures w14:val="standardContextual"/>
         </w:rPr>
       </w:pPr>
-      <w:hyperlink w:anchor="_Toc232187411" w:history="1">
+      <w:hyperlink w:anchor="_Toc232188024" w:history="1">
         <w:r>
           <w:rPr>
             <w:rStyle w:val="af2"/>
@@ -651,7 +650,7 @@
             <w:noProof/>
             <w:webHidden/>
           </w:rPr>
-          <w:instrText xml:space="preserve"> PAGEREF _Toc232187411 \h </w:instrText>
+          <w:instrText xml:space="preserve"> PAGEREF _Toc232188024 \h </w:instrText>
         </w:r>
         <w:r>
           <w:rPr>
@@ -693,7 +692,7 @@
           <w14:ligatures w14:val="standardContextual"/>
         </w:rPr>
       </w:pPr>
-      <w:hyperlink w:anchor="_Toc232187412" w:history="1">
+      <w:hyperlink w:anchor="_Toc232188025" w:history="1">
         <w:r>
           <w:rPr>
             <w:rStyle w:val="af2"/>
@@ -741,7 +740,7 @@
             <w:noProof/>
             <w:webHidden/>
           </w:rPr>
-          <w:instrText xml:space="preserve"> PAGEREF _Toc232187412 \h </w:instrText>
+          <w:instrText xml:space="preserve"> PAGEREF _Toc232188025 \h </w:instrText>
         </w:r>
         <w:r>
           <w:rPr>
@@ -783,7 +782,7 @@
           <w14:ligatures w14:val="standardContextual"/>
         </w:rPr>
       </w:pPr>
-      <w:hyperlink w:anchor="_Toc232187413" w:history="1">
+      <w:hyperlink w:anchor="_Toc232188026" w:history="1">
         <w:r>
           <w:rPr>
             <w:rStyle w:val="af2"/>
@@ -817,7 +816,7 @@
             <w:noProof/>
             <w:webHidden/>
           </w:rPr>
-          <w:instrText xml:space="preserve"> PAGEREF _Toc232187413 \h </w:instrText>
+          <w:instrText xml:space="preserve"> PAGEREF _Toc232188026 \h </w:instrText>
         </w:r>
         <w:r>
           <w:rPr>
@@ -858,7 +857,7 @@
           <w14:ligatures w14:val="standardContextual"/>
         </w:rPr>
       </w:pPr>
-      <w:hyperlink w:anchor="_Toc232187414" w:history="1">
+      <w:hyperlink w:anchor="_Toc232188027" w:history="1">
         <w:r>
           <w:rPr>
             <w:rStyle w:val="af2"/>
@@ -899,7 +898,7 @@
             <w:noProof/>
             <w:webHidden/>
           </w:rPr>
-          <w:instrText xml:space="preserve"> PAGEREF _Toc232187414 \h </w:instrText>
+          <w:instrText xml:space="preserve"> PAGEREF _Toc232188027 \h </w:instrText>
         </w:r>
         <w:r>
           <w:rPr>
@@ -941,7 +940,7 @@
           <w14:ligatures w14:val="standardContextual"/>
         </w:rPr>
       </w:pPr>
-      <w:hyperlink w:anchor="_Toc232187415" w:history="1">
+      <w:hyperlink w:anchor="_Toc232188028" w:history="1">
         <w:r>
           <w:rPr>
             <w:rStyle w:val="af2"/>
@@ -975,7 +974,7 @@
             <w:noProof/>
             <w:webHidden/>
           </w:rPr>
-          <w:instrText xml:space="preserve"> PAGEREF _Toc232187415 \h </w:instrText>
+          <w:instrText xml:space="preserve"> PAGEREF _Toc232188028 \h </w:instrText>
         </w:r>
         <w:r>
           <w:rPr>
@@ -1017,7 +1016,7 @@
           <w14:ligatures w14:val="standardContextual"/>
         </w:rPr>
       </w:pPr>
-      <w:hyperlink w:anchor="_Toc232187416" w:history="1">
+      <w:hyperlink w:anchor="_Toc232188029" w:history="1">
         <w:r>
           <w:rPr>
             <w:rStyle w:val="af2"/>
@@ -1051,7 +1050,7 @@
             <w:noProof/>
             <w:webHidden/>
           </w:rPr>
-          <w:instrText xml:space="preserve"> PAGEREF _Toc232187416 \h </w:instrText>
+          <w:instrText xml:space="preserve"> PAGEREF _Toc232188029 \h </w:instrText>
         </w:r>
         <w:r>
           <w:rPr>
@@ -1093,7 +1092,7 @@
           <w14:ligatures w14:val="standardContextual"/>
         </w:rPr>
       </w:pPr>
-      <w:hyperlink w:anchor="_Toc232187417" w:history="1">
+      <w:hyperlink w:anchor="_Toc232188030" w:history="1">
         <w:r>
           <w:rPr>
             <w:rStyle w:val="af2"/>
@@ -1127,7 +1126,7 @@
             <w:noProof/>
             <w:webHidden/>
           </w:rPr>
-          <w:instrText xml:space="preserve"> PAGEREF _Toc232187417 \h </w:instrText>
+          <w:instrText xml:space="preserve"> PAGEREF _Toc232188030 \h </w:instrText>
         </w:r>
         <w:r>
           <w:rPr>
@@ -1169,7 +1168,7 @@
           <w14:ligatures w14:val="standardContextual"/>
         </w:rPr>
       </w:pPr>
-      <w:hyperlink w:anchor="_Toc232187418" w:history="1">
+      <w:hyperlink w:anchor="_Toc232188031" w:history="1">
         <w:r>
           <w:rPr>
             <w:rStyle w:val="af2"/>
@@ -1252,7 +1251,7 @@
             <w:noProof/>
             <w:webHidden/>
           </w:rPr>
-          <w:instrText xml:space="preserve"> PAGEREF _Toc232187418 \h </w:instrText>
+          <w:instrText xml:space="preserve"> PAGEREF _Toc232188031 \h </w:instrText>
         </w:r>
         <w:r>
           <w:rPr>
@@ -1293,7 +1292,7 @@
           <w14:ligatures w14:val="standardContextual"/>
         </w:rPr>
       </w:pPr>
-      <w:hyperlink w:anchor="_Toc232187419" w:history="1">
+      <w:hyperlink w:anchor="_Toc232188032" w:history="1">
         <w:r>
           <w:rPr>
             <w:rStyle w:val="af2"/>
@@ -1334,7 +1333,7 @@
             <w:noProof/>
             <w:webHidden/>
           </w:rPr>
-          <w:instrText xml:space="preserve"> PAGEREF _Toc232187419 \h </w:instrText>
+          <w:instrText xml:space="preserve"> PAGEREF _Toc232188032 \h </w:instrText>
         </w:r>
         <w:r>
           <w:rPr>
@@ -1376,7 +1375,7 @@
           <w14:ligatures w14:val="standardContextual"/>
         </w:rPr>
       </w:pPr>
-      <w:hyperlink w:anchor="_Toc232187420" w:history="1">
+      <w:hyperlink w:anchor="_Toc232188033" w:history="1">
         <w:r>
           <w:rPr>
             <w:rStyle w:val="af2"/>
@@ -1410,7 +1409,7 @@
             <w:noProof/>
             <w:webHidden/>
           </w:rPr>
-          <w:instrText xml:space="preserve"> PAGEREF _Toc232187420 \h </w:instrText>
+          <w:instrText xml:space="preserve"> PAGEREF _Toc232188033 \h </w:instrText>
         </w:r>
         <w:r>
           <w:rPr>
@@ -1452,7 +1451,7 @@
           <w14:ligatures w14:val="standardContextual"/>
         </w:rPr>
       </w:pPr>
-      <w:hyperlink w:anchor="_Toc232187421" w:history="1">
+      <w:hyperlink w:anchor="_Toc232188034" w:history="1">
         <w:r>
           <w:rPr>
             <w:rStyle w:val="af2"/>
@@ -1486,7 +1485,7 @@
             <w:noProof/>
             <w:webHidden/>
           </w:rPr>
-          <w:instrText xml:space="preserve"> PAGEREF _Toc232187421 \h </w:instrText>
+          <w:instrText xml:space="preserve"> PAGEREF _Toc232188034 \h </w:instrText>
         </w:r>
         <w:r>
           <w:rPr>
@@ -1528,7 +1527,7 @@
           <w14:ligatures w14:val="standardContextual"/>
         </w:rPr>
       </w:pPr>
-      <w:hyperlink w:anchor="_Toc232187422" w:history="1">
+      <w:hyperlink w:anchor="_Toc232188035" w:history="1">
         <w:r>
           <w:rPr>
             <w:rStyle w:val="af2"/>
@@ -1562,7 +1561,7 @@
             <w:noProof/>
             <w:webHidden/>
           </w:rPr>
-          <w:instrText xml:space="preserve"> PAGEREF _Toc232187422 \h </w:instrText>
+          <w:instrText xml:space="preserve"> PAGEREF _Toc232188035 \h </w:instrText>
         </w:r>
         <w:r>
           <w:rPr>
@@ -1603,7 +1602,7 @@
           <w14:ligatures w14:val="standardContextual"/>
         </w:rPr>
       </w:pPr>
-      <w:hyperlink w:anchor="_Toc232187423" w:history="1">
+      <w:hyperlink w:anchor="_Toc232188036" w:history="1">
         <w:r>
           <w:rPr>
             <w:rStyle w:val="af2"/>
@@ -1644,7 +1643,7 @@
             <w:noProof/>
             <w:webHidden/>
           </w:rPr>
-          <w:instrText xml:space="preserve"> PAGEREF _Toc232187423 \h </w:instrText>
+          <w:instrText xml:space="preserve"> PAGEREF _Toc232188036 \h </w:instrText>
         </w:r>
         <w:r>
           <w:rPr>
@@ -1685,7 +1684,7 @@
           <w14:ligatures w14:val="standardContextual"/>
         </w:rPr>
       </w:pPr>
-      <w:hyperlink w:anchor="_Toc232187424" w:history="1">
+      <w:hyperlink w:anchor="_Toc232188037" w:history="1">
         <w:r>
           <w:rPr>
             <w:rStyle w:val="af2"/>
@@ -1712,7 +1711,7 @@
             <w:noProof/>
             <w:webHidden/>
           </w:rPr>
-          <w:instrText xml:space="preserve"> PAGEREF _Toc232187424 \h </w:instrText>
+          <w:instrText xml:space="preserve"> PAGEREF _Toc232188037 \h </w:instrText>
         </w:r>
         <w:r>
           <w:rPr>
@@ -1754,7 +1753,7 @@
     <w:p>
       <w:pPr>
         <w:sectPr>
-          <w:footerReference w:type="default" r:id="rId8"/>
+          <w:footerReference w:type="default" r:id="rId7"/>
           <w:pgSz w:w="11906" w:h="16838"/>
           <w:pgMar w:top="1440" w:right="1474" w:bottom="1440" w:left="1701" w:header="851" w:footer="992" w:gutter="0"/>
           <w:pgNumType w:start="1"/>
@@ -1769,7 +1768,7 @@
         <w:spacing w:before="240" w:after="120"/>
         <w:jc w:val="center"/>
       </w:pPr>
-      <w:bookmarkStart w:id="0" w:name="_Toc232187408"/>
+      <w:bookmarkStart w:id="0" w:name="_Toc232188021"/>
       <w:r>
         <w:lastRenderedPageBreak/>
         <w:t>第一章</w:t>
@@ -2187,7 +2186,7 @@
         <w:spacing w:before="240" w:after="120"/>
         <w:jc w:val="center"/>
       </w:pPr>
-      <w:bookmarkStart w:id="1" w:name="_Toc232187409"/>
+      <w:bookmarkStart w:id="1" w:name="_Toc232188022"/>
       <w:r>
         <w:t>第二章</w:t>
       </w:r>
@@ -2204,7 +2203,7 @@
         <w:pStyle w:val="21"/>
         <w:spacing w:before="200" w:after="80"/>
       </w:pPr>
-      <w:bookmarkStart w:id="2" w:name="_Toc232187410"/>
+      <w:bookmarkStart w:id="2" w:name="_Toc232188023"/>
       <w:r>
         <w:t xml:space="preserve">2.1 </w:t>
       </w:r>
@@ -2348,7 +2347,7 @@
         <w:pStyle w:val="21"/>
         <w:spacing w:before="200" w:after="80"/>
       </w:pPr>
-      <w:bookmarkStart w:id="3" w:name="_Toc232187411"/>
+      <w:bookmarkStart w:id="3" w:name="_Toc232188024"/>
       <w:r>
         <w:lastRenderedPageBreak/>
         <w:t>2.2 CNN</w:t>
@@ -2470,7 +2469,7 @@
         <w:pStyle w:val="21"/>
         <w:spacing w:before="200" w:after="80"/>
       </w:pPr>
-      <w:bookmarkStart w:id="4" w:name="_Toc232187412"/>
+      <w:bookmarkStart w:id="4" w:name="_Toc232188025"/>
       <w:r>
         <w:t xml:space="preserve">2.3 </w:t>
       </w:r>
@@ -2602,7 +2601,7 @@
           <w:noProof/>
         </w:rPr>
         <w:drawing>
-          <wp:inline distT="0" distB="0" distL="0" distR="0" wp14:anchorId="5AFC036A" wp14:editId="111BD12D">
+          <wp:inline distT="0" distB="0" distL="0" distR="0" wp14:anchorId="588F0134" wp14:editId="012E1EBB">
             <wp:extent cx="4968000" cy="2795986"/>
             <wp:effectExtent l="0" t="0" r="0" b="0"/>
             <wp:docPr id="1" name="Picture 1"/>
@@ -2614,6 +2613,1214 @@
                 <pic:pic xmlns:pic="http://schemas.openxmlformats.org/drawingml/2006/picture">
                   <pic:nvPicPr>
                     <pic:cNvPr id="0" name="ai-architecture-evolution.png"/>
+                    <pic:cNvPicPr/>
+                  </pic:nvPicPr>
+                  <pic:blipFill>
+                    <a:blip r:embed="rId8"/>
+                    <a:stretch>
+                      <a:fillRect/>
+                    </a:stretch>
+                  </pic:blipFill>
+                  <pic:spPr>
+                    <a:xfrm>
+                      <a:off x="0" y="0"/>
+                      <a:ext cx="4968000" cy="2795986"/>
+                    </a:xfrm>
+                    <a:prstGeom prst="rect">
+                      <a:avLst/>
+                    </a:prstGeom>
+                  </pic:spPr>
+                </pic:pic>
+              </a:graphicData>
+            </a:graphic>
+          </wp:inline>
+        </w:drawing>
+      </w:r>
+    </w:p>
+    <w:p>
+      <w:pPr>
+        <w:spacing w:after="120"/>
+        <w:jc w:val="center"/>
+      </w:pPr>
+      <w:r>
+        <w:t>图</w:t>
+      </w:r>
+      <w:r>
+        <w:t xml:space="preserve">2.1 </w:t>
+      </w:r>
+      <w:r>
+        <w:t>深度学习模型架构演化概念图</w:t>
+      </w:r>
+    </w:p>
+    <w:p>
+      <w:pPr>
+        <w:spacing w:after="120" w:line="300" w:lineRule="auto"/>
+        <w:ind w:firstLine="420"/>
+      </w:pPr>
+      <w:r>
+        <w:t>图中将深度学习模型演化概括为八个阶段。它不是严格的历史年表，而是强调每个阶段解决</w:t>
+      </w:r>
+      <w:r>
+        <w:lastRenderedPageBreak/>
+        <w:t>的主要问题：从可学习分类器，到可训练深层网络，再到空间层级、序列记忆、并行注意力、基础模型、稀疏路由和长上下文效率。</w:t>
+      </w:r>
+    </w:p>
+    <w:p>
+      <w:pPr>
+        <w:pStyle w:val="21"/>
+        <w:spacing w:before="200" w:after="80"/>
+      </w:pPr>
+      <w:bookmarkStart w:id="5" w:name="_Toc232188026"/>
+      <w:r>
+        <w:t xml:space="preserve">2.4 Transformer </w:t>
+      </w:r>
+      <w:r>
+        <w:t>与预训练范式</w:t>
+      </w:r>
+      <w:bookmarkEnd w:id="5"/>
+    </w:p>
+    <w:p>
+      <w:pPr>
+        <w:spacing w:after="120" w:line="300" w:lineRule="auto"/>
+        <w:ind w:firstLine="420"/>
+      </w:pPr>
+      <w:r>
+        <w:t xml:space="preserve">Transformer </w:t>
+      </w:r>
+      <w:r>
+        <w:t>的突破在于用自注意力取代循环结构，使序列建模可以更充分地并行化，并让模型直接学习任意</w:t>
+      </w:r>
+      <w:r>
+        <w:t xml:space="preserve"> token </w:t>
+      </w:r>
+      <w:r>
+        <w:t>之间的依赖关系</w:t>
+      </w:r>
+      <w:r>
+        <w:rPr>
+          <w:sz w:val="18"/>
+          <w:vertAlign w:val="superscript"/>
+        </w:rPr>
+        <w:t>[8]</w:t>
+      </w:r>
+      <w:r>
+        <w:t>。</w:t>
+      </w:r>
+      <w:r>
+        <w:t xml:space="preserve">BERT </w:t>
+      </w:r>
+      <w:r>
+        <w:t>展示了大规模无监督预训练加下游微调的有效性，强调双向上下文表示</w:t>
+      </w:r>
+      <w:r>
+        <w:rPr>
+          <w:sz w:val="18"/>
+          <w:vertAlign w:val="superscript"/>
+        </w:rPr>
+        <w:t>[9]</w:t>
+      </w:r>
+      <w:r>
+        <w:t>；</w:t>
+      </w:r>
+      <w:r>
+        <w:t xml:space="preserve">GPT-3 </w:t>
+      </w:r>
+      <w:r>
+        <w:t>则进一步展示了规模化语言模型在少样本提示下的泛化能力</w:t>
+      </w:r>
+      <w:r>
+        <w:rPr>
+          <w:sz w:val="18"/>
+          <w:vertAlign w:val="superscript"/>
+        </w:rPr>
+        <w:t>[10]</w:t>
+      </w:r>
+      <w:r>
+        <w:t>。这一阶段的变化非常关键：模型不再只是为某个单一任务从零训练，而是先在大规模数据上形成通用表示，再通过提示、微调或对齐服务不同任务。</w:t>
+      </w:r>
+    </w:p>
+    <w:p>
+      <w:pPr>
+        <w:spacing w:after="120" w:line="300" w:lineRule="auto"/>
+        <w:ind w:firstLine="420"/>
+      </w:pPr>
+      <w:r>
+        <w:t xml:space="preserve">Transformer </w:t>
+      </w:r>
+      <w:r>
+        <w:t>也跨出了语言领域。</w:t>
+      </w:r>
+      <w:r>
+        <w:t xml:space="preserve">Vision Transformer </w:t>
+      </w:r>
+      <w:r>
+        <w:t>将图像切成</w:t>
+      </w:r>
+      <w:r>
+        <w:t xml:space="preserve"> patch</w:t>
+      </w:r>
+      <w:r>
+        <w:t>，并把视觉问题转换成</w:t>
+      </w:r>
+      <w:r>
+        <w:t xml:space="preserve"> token </w:t>
+      </w:r>
+      <w:r>
+        <w:t>序列建模问题</w:t>
+      </w:r>
+      <w:r>
+        <w:rPr>
+          <w:sz w:val="18"/>
+          <w:vertAlign w:val="superscript"/>
+        </w:rPr>
+        <w:t>[11]</w:t>
+      </w:r>
+      <w:r>
+        <w:t>。扩散模型则在生成任务中形成另一条主线，</w:t>
+      </w:r>
+      <w:r>
+        <w:t xml:space="preserve">DDPM </w:t>
+      </w:r>
+      <w:r>
+        <w:t>通过逐步去噪实现高质量生成</w:t>
+      </w:r>
+      <w:r>
+        <w:rPr>
+          <w:sz w:val="18"/>
+          <w:vertAlign w:val="superscript"/>
+        </w:rPr>
+        <w:t>[12]</w:t>
+      </w:r>
+      <w:r>
+        <w:t>，</w:t>
+      </w:r>
+      <w:r>
+        <w:t xml:space="preserve">DiT </w:t>
+      </w:r>
+      <w:r>
+        <w:t>又把</w:t>
+      </w:r>
+      <w:r>
+        <w:t xml:space="preserve"> Transformer </w:t>
+      </w:r>
+      <w:r>
+        <w:t>引入扩散模型主干，进一步说明</w:t>
+      </w:r>
+      <w:r>
+        <w:t xml:space="preserve"> token </w:t>
+      </w:r>
+      <w:r>
+        <w:t>化和注意力结构正在成为多模态建模的通用接口</w:t>
+      </w:r>
+      <w:r>
+        <w:rPr>
+          <w:sz w:val="18"/>
+          <w:vertAlign w:val="superscript"/>
+        </w:rPr>
+        <w:t>[13]</w:t>
+      </w:r>
+      <w:r>
+        <w:t>。</w:t>
+      </w:r>
+    </w:p>
+    <w:tbl>
+      <w:tblPr>
+        <w:tblStyle w:val="af"/>
+        <w:tblW w:w="0" w:type="auto"/>
+        <w:jc w:val="center"/>
+        <w:tblLook w:val="04A0" w:firstRow="1" w:lastRow="0" w:firstColumn="1" w:lastColumn="0" w:noHBand="0" w:noVBand="1"/>
+      </w:tblPr>
+      <w:tblGrid>
+        <w:gridCol w:w="2181"/>
+        <w:gridCol w:w="2180"/>
+        <w:gridCol w:w="2180"/>
+        <w:gridCol w:w="2180"/>
+      </w:tblGrid>
+      <w:tr>
+        <w:trPr>
+          <w:jc w:val="center"/>
+        </w:trPr>
+        <w:tc>
+          <w:tcPr>
+            <w:tcW w:w="2183" w:type="dxa"/>
+            <w:shd w:val="clear" w:color="auto" w:fill="D9EAF7"/>
+            <w:vAlign w:val="center"/>
+          </w:tcPr>
+          <w:p>
+            <w:pPr>
+              <w:jc w:val="center"/>
+            </w:pPr>
+            <w:r>
+              <w:rPr>
+                <w:b/>
+              </w:rPr>
+              <w:t>阶段</w:t>
+            </w:r>
+          </w:p>
+        </w:tc>
+        <w:tc>
+          <w:tcPr>
+            <w:tcW w:w="2183" w:type="dxa"/>
+            <w:shd w:val="clear" w:color="auto" w:fill="D9EAF7"/>
+            <w:vAlign w:val="center"/>
+          </w:tcPr>
+          <w:p>
+            <w:pPr>
+              <w:jc w:val="center"/>
+            </w:pPr>
+            <w:r>
+              <w:rPr>
+                <w:b/>
+              </w:rPr>
+              <w:t>主要结构</w:t>
+            </w:r>
+          </w:p>
+        </w:tc>
+        <w:tc>
+          <w:tcPr>
+            <w:tcW w:w="2183" w:type="dxa"/>
+            <w:shd w:val="clear" w:color="auto" w:fill="D9EAF7"/>
+            <w:vAlign w:val="center"/>
+          </w:tcPr>
+          <w:p>
+            <w:pPr>
+              <w:jc w:val="center"/>
+            </w:pPr>
+            <w:r>
+              <w:rPr>
+                <w:b/>
+              </w:rPr>
+              <w:t>解决的瓶颈</w:t>
+            </w:r>
+          </w:p>
+        </w:tc>
+        <w:tc>
+          <w:tcPr>
+            <w:tcW w:w="2183" w:type="dxa"/>
+            <w:shd w:val="clear" w:color="auto" w:fill="D9EAF7"/>
+            <w:vAlign w:val="center"/>
+          </w:tcPr>
+          <w:p>
+            <w:pPr>
+              <w:jc w:val="center"/>
+            </w:pPr>
+            <w:r>
+              <w:rPr>
+                <w:b/>
+              </w:rPr>
+              <w:t>新问题</w:t>
+            </w:r>
+          </w:p>
+        </w:tc>
+      </w:tr>
+      <w:tr>
+        <w:trPr>
+          <w:jc w:val="center"/>
+        </w:trPr>
+        <w:tc>
+          <w:tcPr>
+            <w:tcW w:w="2183" w:type="dxa"/>
+            <w:vAlign w:val="center"/>
+          </w:tcPr>
+          <w:p>
+            <w:pPr>
+              <w:jc w:val="center"/>
+            </w:pPr>
+            <w:r>
+              <w:rPr>
+                <w:sz w:val="20"/>
+              </w:rPr>
+              <w:t>感知机</w:t>
+            </w:r>
+            <w:r>
+              <w:rPr>
+                <w:sz w:val="20"/>
+              </w:rPr>
+              <w:t>/</w:t>
+            </w:r>
+            <w:r>
+              <w:rPr>
+                <w:sz w:val="20"/>
+              </w:rPr>
+              <w:t>浅层网络</w:t>
+            </w:r>
+          </w:p>
+        </w:tc>
+        <w:tc>
+          <w:tcPr>
+            <w:tcW w:w="2183" w:type="dxa"/>
+            <w:vAlign w:val="center"/>
+          </w:tcPr>
+          <w:p>
+            <w:pPr>
+              <w:jc w:val="center"/>
+            </w:pPr>
+            <w:r>
+              <w:rPr>
+                <w:sz w:val="20"/>
+              </w:rPr>
+              <w:t>线性分类器、简单神经元</w:t>
+            </w:r>
+          </w:p>
+        </w:tc>
+        <w:tc>
+          <w:tcPr>
+            <w:tcW w:w="2183" w:type="dxa"/>
+            <w:vAlign w:val="center"/>
+          </w:tcPr>
+          <w:p>
+            <w:pPr>
+              <w:jc w:val="center"/>
+            </w:pPr>
+            <w:r>
+              <w:rPr>
+                <w:sz w:val="20"/>
+              </w:rPr>
+              <w:t>从规则到学习</w:t>
+            </w:r>
+          </w:p>
+        </w:tc>
+        <w:tc>
+          <w:tcPr>
+            <w:tcW w:w="2183" w:type="dxa"/>
+            <w:vAlign w:val="center"/>
+          </w:tcPr>
+          <w:p>
+            <w:pPr>
+              <w:jc w:val="center"/>
+            </w:pPr>
+            <w:r>
+              <w:rPr>
+                <w:sz w:val="20"/>
+              </w:rPr>
+              <w:t>表示能力弱</w:t>
+            </w:r>
+          </w:p>
+        </w:tc>
+      </w:tr>
+      <w:tr>
+        <w:trPr>
+          <w:jc w:val="center"/>
+        </w:trPr>
+        <w:tc>
+          <w:tcPr>
+            <w:tcW w:w="2183" w:type="dxa"/>
+            <w:vAlign w:val="center"/>
+          </w:tcPr>
+          <w:p>
+            <w:pPr>
+              <w:jc w:val="center"/>
+            </w:pPr>
+            <w:r>
+              <w:rPr>
+                <w:sz w:val="20"/>
+              </w:rPr>
+              <w:t>CNN/ResNet</w:t>
+            </w:r>
+          </w:p>
+        </w:tc>
+        <w:tc>
+          <w:tcPr>
+            <w:tcW w:w="2183" w:type="dxa"/>
+            <w:vAlign w:val="center"/>
+          </w:tcPr>
+          <w:p>
+            <w:pPr>
+              <w:jc w:val="center"/>
+            </w:pPr>
+            <w:r>
+              <w:rPr>
+                <w:sz w:val="20"/>
+              </w:rPr>
+              <w:t>卷积、残差连接</w:t>
+            </w:r>
+          </w:p>
+        </w:tc>
+        <w:tc>
+          <w:tcPr>
+            <w:tcW w:w="2183" w:type="dxa"/>
+            <w:vAlign w:val="center"/>
+          </w:tcPr>
+          <w:p>
+            <w:pPr>
+              <w:jc w:val="center"/>
+            </w:pPr>
+            <w:r>
+              <w:rPr>
+                <w:sz w:val="20"/>
+              </w:rPr>
+              <w:t>空间层级与深层优化</w:t>
+            </w:r>
+          </w:p>
+        </w:tc>
+        <w:tc>
+          <w:tcPr>
+            <w:tcW w:w="2183" w:type="dxa"/>
+            <w:vAlign w:val="center"/>
+          </w:tcPr>
+          <w:p>
+            <w:pPr>
+              <w:jc w:val="center"/>
+            </w:pPr>
+            <w:r>
+              <w:rPr>
+                <w:sz w:val="20"/>
+              </w:rPr>
+              <w:t>跨模态统一性不足</w:t>
+            </w:r>
+          </w:p>
+        </w:tc>
+      </w:tr>
+      <w:tr>
+        <w:trPr>
+          <w:jc w:val="center"/>
+        </w:trPr>
+        <w:tc>
+          <w:tcPr>
+            <w:tcW w:w="2183" w:type="dxa"/>
+            <w:vAlign w:val="center"/>
+          </w:tcPr>
+          <w:p>
+            <w:pPr>
+              <w:jc w:val="center"/>
+            </w:pPr>
+            <w:r>
+              <w:rPr>
+                <w:sz w:val="20"/>
+              </w:rPr>
+              <w:t>RNN/LSTM</w:t>
+            </w:r>
+          </w:p>
+        </w:tc>
+        <w:tc>
+          <w:tcPr>
+            <w:tcW w:w="2183" w:type="dxa"/>
+            <w:vAlign w:val="center"/>
+          </w:tcPr>
+          <w:p>
+            <w:pPr>
+              <w:jc w:val="center"/>
+            </w:pPr>
+            <w:r>
+              <w:rPr>
+                <w:sz w:val="20"/>
+              </w:rPr>
+              <w:t>循环与门控记忆</w:t>
+            </w:r>
+          </w:p>
+        </w:tc>
+        <w:tc>
+          <w:tcPr>
+            <w:tcW w:w="2183" w:type="dxa"/>
+            <w:vAlign w:val="center"/>
+          </w:tcPr>
+          <w:p>
+            <w:pPr>
+              <w:jc w:val="center"/>
+            </w:pPr>
+            <w:r>
+              <w:rPr>
+                <w:sz w:val="20"/>
+              </w:rPr>
+              <w:t>序列依赖</w:t>
+            </w:r>
+          </w:p>
+        </w:tc>
+        <w:tc>
+          <w:tcPr>
+            <w:tcW w:w="2183" w:type="dxa"/>
+            <w:vAlign w:val="center"/>
+          </w:tcPr>
+          <w:p>
+            <w:pPr>
+              <w:jc w:val="center"/>
+            </w:pPr>
+            <w:r>
+              <w:rPr>
+                <w:sz w:val="20"/>
+              </w:rPr>
+              <w:t>并行效率低</w:t>
+            </w:r>
+          </w:p>
+        </w:tc>
+      </w:tr>
+      <w:tr>
+        <w:trPr>
+          <w:jc w:val="center"/>
+        </w:trPr>
+        <w:tc>
+          <w:tcPr>
+            <w:tcW w:w="2183" w:type="dxa"/>
+            <w:vAlign w:val="center"/>
+          </w:tcPr>
+          <w:p>
+            <w:pPr>
+              <w:jc w:val="center"/>
+            </w:pPr>
+            <w:r>
+              <w:rPr>
+                <w:sz w:val="20"/>
+              </w:rPr>
+              <w:t>Transformer</w:t>
+            </w:r>
+          </w:p>
+        </w:tc>
+        <w:tc>
+          <w:tcPr>
+            <w:tcW w:w="2183" w:type="dxa"/>
+            <w:vAlign w:val="center"/>
+          </w:tcPr>
+          <w:p>
+            <w:pPr>
+              <w:jc w:val="center"/>
+            </w:pPr>
+            <w:r>
+              <w:rPr>
+                <w:sz w:val="20"/>
+              </w:rPr>
+              <w:t>自注意力、残差、归一化</w:t>
+            </w:r>
+          </w:p>
+        </w:tc>
+        <w:tc>
+          <w:tcPr>
+            <w:tcW w:w="2183" w:type="dxa"/>
+            <w:vAlign w:val="center"/>
+          </w:tcPr>
+          <w:p>
+            <w:pPr>
+              <w:jc w:val="center"/>
+            </w:pPr>
+            <w:r>
+              <w:rPr>
+                <w:sz w:val="20"/>
+              </w:rPr>
+              <w:t>全局上下文与并行训练</w:t>
+            </w:r>
+          </w:p>
+        </w:tc>
+        <w:tc>
+          <w:tcPr>
+            <w:tcW w:w="2183" w:type="dxa"/>
+            <w:vAlign w:val="center"/>
+          </w:tcPr>
+          <w:p>
+            <w:pPr>
+              <w:jc w:val="center"/>
+            </w:pPr>
+            <w:r>
+              <w:rPr>
+                <w:sz w:val="20"/>
+              </w:rPr>
+              <w:t>长上下文计算代价高</w:t>
+            </w:r>
+          </w:p>
+        </w:tc>
+      </w:tr>
+      <w:tr>
+        <w:trPr>
+          <w:jc w:val="center"/>
+        </w:trPr>
+        <w:tc>
+          <w:tcPr>
+            <w:tcW w:w="2183" w:type="dxa"/>
+            <w:vAlign w:val="center"/>
+          </w:tcPr>
+          <w:p>
+            <w:pPr>
+              <w:jc w:val="center"/>
+            </w:pPr>
+            <w:r>
+              <w:rPr>
+                <w:sz w:val="20"/>
+              </w:rPr>
+              <w:t>基础模型</w:t>
+            </w:r>
+          </w:p>
+        </w:tc>
+        <w:tc>
+          <w:tcPr>
+            <w:tcW w:w="2183" w:type="dxa"/>
+            <w:vAlign w:val="center"/>
+          </w:tcPr>
+          <w:p>
+            <w:pPr>
+              <w:jc w:val="center"/>
+            </w:pPr>
+            <w:r>
+              <w:rPr>
+                <w:sz w:val="20"/>
+              </w:rPr>
+              <w:t>大规模预训练、提示学习</w:t>
+            </w:r>
+          </w:p>
+        </w:tc>
+        <w:tc>
+          <w:tcPr>
+            <w:tcW w:w="2183" w:type="dxa"/>
+            <w:vAlign w:val="center"/>
+          </w:tcPr>
+          <w:p>
+            <w:pPr>
+              <w:jc w:val="center"/>
+            </w:pPr>
+            <w:r>
+              <w:rPr>
+                <w:sz w:val="20"/>
+              </w:rPr>
+              <w:t>跨任务泛化</w:t>
+            </w:r>
+          </w:p>
+        </w:tc>
+        <w:tc>
+          <w:tcPr>
+            <w:tcW w:w="2183" w:type="dxa"/>
+            <w:vAlign w:val="center"/>
+          </w:tcPr>
+          <w:p>
+            <w:pPr>
+              <w:jc w:val="center"/>
+            </w:pPr>
+            <w:r>
+              <w:rPr>
+                <w:sz w:val="20"/>
+              </w:rPr>
+              <w:t>成本、对齐与可靠性</w:t>
+            </w:r>
+          </w:p>
+        </w:tc>
+      </w:tr>
+    </w:tbl>
+    <w:p/>
+    <w:p>
+      <w:pPr>
+        <w:pStyle w:val="1"/>
+        <w:spacing w:before="240" w:after="120"/>
+        <w:jc w:val="center"/>
+      </w:pPr>
+      <w:bookmarkStart w:id="6" w:name="_Toc232188027"/>
+      <w:r>
+        <w:t>第三章</w:t>
+      </w:r>
+      <w:r>
+        <w:t xml:space="preserve"> </w:t>
+      </w:r>
+      <w:r>
+        <w:t>目前最新的深度学习模型架构</w:t>
+      </w:r>
+      <w:bookmarkEnd w:id="6"/>
+    </w:p>
+    <w:p>
+      <w:pPr>
+        <w:pStyle w:val="21"/>
+        <w:spacing w:before="200" w:after="80"/>
+      </w:pPr>
+      <w:bookmarkStart w:id="7" w:name="_Toc232188028"/>
+      <w:r>
+        <w:t xml:space="preserve">3.1 Dense Transformer </w:t>
+      </w:r>
+      <w:r>
+        <w:t>仍是主干，但不再是唯一答案</w:t>
+      </w:r>
+      <w:bookmarkEnd w:id="7"/>
+    </w:p>
+    <w:p>
+      <w:pPr>
+        <w:spacing w:after="120" w:line="300" w:lineRule="auto"/>
+        <w:ind w:firstLine="420"/>
+      </w:pPr>
+      <w:r>
+        <w:t>截至</w:t>
+      </w:r>
+      <w:r>
+        <w:t xml:space="preserve"> 2026 </w:t>
+      </w:r>
+      <w:r>
+        <w:t>年，</w:t>
+      </w:r>
+      <w:r>
+        <w:t xml:space="preserve">Transformer </w:t>
+      </w:r>
+      <w:r>
+        <w:t>仍然是语言模型、多模态模型和扩散生成模型的核心主干之一。原因很直接：它的自注意力机制通用、并行友好，工程生态成熟，并能与大规模预训练很好结合。但是它的代价也很明显：注意力计算随序列长度增长而变重，大模型全参数激活导致推理成本高，多模态输入和工具调用又进一步放大上下文长度压力。</w:t>
+      </w:r>
+    </w:p>
+    <w:p>
+      <w:pPr>
+        <w:spacing w:after="120" w:line="300" w:lineRule="auto"/>
+        <w:ind w:firstLine="420"/>
+      </w:pPr>
+      <w:r>
+        <w:t>因此，所谓</w:t>
+      </w:r>
+      <w:r>
+        <w:t>“</w:t>
+      </w:r>
+      <w:r>
+        <w:t>最新架构</w:t>
+      </w:r>
+      <w:r>
+        <w:t>”</w:t>
+      </w:r>
+      <w:r>
+        <w:t>更准确地说是后</w:t>
+      </w:r>
+      <w:r>
+        <w:t xml:space="preserve"> Transformer </w:t>
+      </w:r>
+      <w:r>
+        <w:t>时代的架构族群：</w:t>
+      </w:r>
+      <w:r>
+        <w:t xml:space="preserve">Dense Transformer </w:t>
+      </w:r>
+      <w:r>
+        <w:t>作为基线仍在演进；</w:t>
+      </w:r>
+      <w:r>
+        <w:t xml:space="preserve">MoE </w:t>
+      </w:r>
+      <w:r>
+        <w:t>用条件计算提高参数容量与成本比；</w:t>
+      </w:r>
+      <w:r>
+        <w:t xml:space="preserve">SSM/Mamba </w:t>
+      </w:r>
+      <w:r>
+        <w:t>试图用线性时间序列建模改善长上下文效率；多模态基础模型则把视觉、文本、视频、语音和工具使用统一到更复杂的系统中。</w:t>
+      </w:r>
+    </w:p>
+    <w:p>
+      <w:pPr>
+        <w:pStyle w:val="21"/>
+        <w:spacing w:before="200" w:after="80"/>
+      </w:pPr>
+      <w:bookmarkStart w:id="8" w:name="_Toc232188029"/>
+      <w:r>
+        <w:lastRenderedPageBreak/>
+        <w:t>3.2 MoE</w:t>
+      </w:r>
+      <w:r>
+        <w:t>：用稀疏激活换取更大容量</w:t>
+      </w:r>
+      <w:bookmarkEnd w:id="8"/>
+    </w:p>
+    <w:p>
+      <w:pPr>
+        <w:spacing w:after="120" w:line="300" w:lineRule="auto"/>
+        <w:ind w:firstLine="420"/>
+      </w:pPr>
+      <w:r>
+        <w:t xml:space="preserve">Mixture of Experts </w:t>
+      </w:r>
+      <w:r>
+        <w:t>的核心想法是让每个</w:t>
+      </w:r>
+      <w:r>
+        <w:t xml:space="preserve"> token </w:t>
+      </w:r>
+      <w:r>
+        <w:t>只激活部分专家网络，从而在总参数规模很大时控制单次计算成本。</w:t>
+      </w:r>
+      <w:r>
+        <w:t xml:space="preserve">Switch Transformer </w:t>
+      </w:r>
+      <w:r>
+        <w:t>展示了用简单稀疏路由扩展到超大参数规模的可行性</w:t>
+      </w:r>
+      <w:r>
+        <w:rPr>
+          <w:sz w:val="18"/>
+          <w:vertAlign w:val="superscript"/>
+        </w:rPr>
+        <w:t>[14]</w:t>
+      </w:r>
+      <w:r>
+        <w:t>。与稀疏专家路线并行，</w:t>
+      </w:r>
+      <w:r>
+        <w:t xml:space="preserve">Mamba </w:t>
+      </w:r>
+      <w:r>
+        <w:t>和</w:t>
+      </w:r>
+      <w:r>
+        <w:t xml:space="preserve"> Mamba-2 </w:t>
+      </w:r>
+      <w:r>
+        <w:t>又从状态空间模型角度重新讨论长序列效率</w:t>
+      </w:r>
+      <w:r>
+        <w:rPr>
+          <w:sz w:val="18"/>
+          <w:vertAlign w:val="superscript"/>
+        </w:rPr>
+        <w:t>[15-16]</w:t>
+      </w:r>
+      <w:r>
+        <w:t>。到</w:t>
+      </w:r>
+      <w:r>
+        <w:t xml:space="preserve"> DeepSeek-V3 </w:t>
+      </w:r>
+      <w:r>
+        <w:t>这类技术报告中，</w:t>
+      </w:r>
+      <w:r>
+        <w:t xml:space="preserve">MoE </w:t>
+      </w:r>
+      <w:r>
+        <w:t>已经成为前沿大语言模型的重要路线之一，其目标不是简单堆参数，而是提高</w:t>
+      </w:r>
+      <w:r>
+        <w:t>“</w:t>
+      </w:r>
+      <w:r>
+        <w:t>模型容量</w:t>
+      </w:r>
+      <w:r>
+        <w:t>/</w:t>
+      </w:r>
+      <w:r>
+        <w:t>实际计算量</w:t>
+      </w:r>
+      <w:r>
+        <w:t>”</w:t>
+      </w:r>
+      <w:r>
+        <w:t>的比值</w:t>
+      </w:r>
+      <w:r>
+        <w:rPr>
+          <w:sz w:val="18"/>
+          <w:vertAlign w:val="superscript"/>
+        </w:rPr>
+        <w:t>[17]</w:t>
+      </w:r>
+      <w:r>
+        <w:t>。</w:t>
+      </w:r>
+    </w:p>
+    <w:p>
+      <w:pPr>
+        <w:spacing w:after="120" w:line="300" w:lineRule="auto"/>
+        <w:ind w:firstLine="420"/>
+      </w:pPr>
+      <w:r>
+        <w:t>但</w:t>
+      </w:r>
+      <w:r>
+        <w:t xml:space="preserve"> MoE </w:t>
+      </w:r>
+      <w:r>
+        <w:t>也带来新的工程问题：路由负载均衡、专家利用率、通信开销、训练稳定性和推理部署复杂度。我的判断是，</w:t>
+      </w:r>
+      <w:r>
+        <w:t xml:space="preserve">MoE </w:t>
+      </w:r>
+      <w:r>
+        <w:t>更像一种</w:t>
+      </w:r>
+      <w:r>
+        <w:t>“</w:t>
+      </w:r>
+      <w:r>
+        <w:t>系统架构</w:t>
+      </w:r>
+      <w:r>
+        <w:t>”</w:t>
+      </w:r>
+      <w:r>
+        <w:t>而不是单纯</w:t>
+      </w:r>
+      <w:r>
+        <w:t>“</w:t>
+      </w:r>
+      <w:r>
+        <w:t>网络层结构</w:t>
+      </w:r>
+      <w:r>
+        <w:t>”</w:t>
+      </w:r>
+      <w:r>
+        <w:t>：它把模型质量问题部分转化为调度、通信和并行计算问题。未来能否继续扩展，取决于硬件互联、编译器、推理框架和训练算法能否一起进步。</w:t>
+      </w:r>
+    </w:p>
+    <w:p>
+      <w:pPr>
+        <w:pStyle w:val="21"/>
+        <w:spacing w:before="200" w:after="80"/>
+      </w:pPr>
+      <w:bookmarkStart w:id="9" w:name="_Toc232188030"/>
+      <w:r>
+        <w:t>3.3 SSM/Mamba</w:t>
+      </w:r>
+      <w:r>
+        <w:t>：重新思考长序列效率</w:t>
+      </w:r>
+      <w:bookmarkEnd w:id="9"/>
+    </w:p>
+    <w:p>
+      <w:pPr>
+        <w:spacing w:after="120" w:line="300" w:lineRule="auto"/>
+        <w:ind w:firstLine="420"/>
+      </w:pPr>
+      <w:r>
+        <w:t>状态空间模型路线关注的是长序列建模效率。</w:t>
+      </w:r>
+      <w:r>
+        <w:t xml:space="preserve">Mamba </w:t>
+      </w:r>
+      <w:r>
+        <w:t>将选择性状态空间模型整合成端到端序列主干，强调线性时间扩展和硬件友好实现</w:t>
+      </w:r>
+      <w:r>
+        <w:rPr>
+          <w:sz w:val="18"/>
+          <w:vertAlign w:val="superscript"/>
+        </w:rPr>
+        <w:t>[15]</w:t>
+      </w:r>
+      <w:r>
+        <w:t>。</w:t>
+      </w:r>
+      <w:r>
+        <w:t xml:space="preserve">Mamba-2 </w:t>
+      </w:r>
+      <w:r>
+        <w:t>进一步从结构化状态空间对偶角度建立</w:t>
+      </w:r>
+      <w:r>
+        <w:t xml:space="preserve"> SSM </w:t>
+      </w:r>
+      <w:r>
+        <w:t>与注意力之间的联系，并报告更高效的算法设计</w:t>
+      </w:r>
+      <w:r>
+        <w:rPr>
+          <w:sz w:val="18"/>
+          <w:vertAlign w:val="superscript"/>
+        </w:rPr>
+        <w:t>[16]</w:t>
+      </w:r>
+      <w:r>
+        <w:t>。这条路线的重要性在于，它没有把</w:t>
+      </w:r>
+      <w:r>
+        <w:t xml:space="preserve"> Transformer </w:t>
+      </w:r>
+      <w:r>
+        <w:t>视为不可替代的终点，而是追问：长上下文建模到底需要完整二次注意力，还是可以用选择性状态传播实现更高性价比。</w:t>
+      </w:r>
+    </w:p>
+    <w:p>
+      <w:pPr>
+        <w:spacing w:after="120" w:line="300" w:lineRule="auto"/>
+        <w:ind w:firstLine="420"/>
+      </w:pPr>
+      <w:r>
+        <w:t>我认为</w:t>
+      </w:r>
+      <w:r>
+        <w:t xml:space="preserve"> SSM/Mamba </w:t>
+      </w:r>
+      <w:r>
+        <w:t>的未来价值不一定是完全取代</w:t>
+      </w:r>
+      <w:r>
+        <w:t xml:space="preserve"> Transformer</w:t>
+      </w:r>
+      <w:r>
+        <w:t>，而可能是形成混合架构。例如局部高频信息用状态扫描处理，关键跨段关系仍用注意力或检索机制补充。对于长视频、长文档、基因序列、日志序列和持续交互式智能体，这类结构的吸引力会越来越强。</w:t>
+      </w:r>
+    </w:p>
+    <w:p>
+      <w:pPr>
+        <w:pStyle w:val="21"/>
+        <w:spacing w:before="200" w:after="80"/>
+      </w:pPr>
+      <w:bookmarkStart w:id="10" w:name="_Toc232188031"/>
+      <w:r>
+        <w:t xml:space="preserve">3.4 </w:t>
+      </w:r>
+      <w:r>
+        <w:t>多模态基础模型：从</w:t>
+      </w:r>
+      <w:r>
+        <w:t>“</w:t>
+      </w:r>
+      <w:r>
+        <w:t>模型</w:t>
+      </w:r>
+      <w:r>
+        <w:t>”</w:t>
+      </w:r>
+      <w:r>
+        <w:t>走向</w:t>
+      </w:r>
+      <w:r>
+        <w:t>“</w:t>
+      </w:r>
+      <w:r>
+        <w:t>系统</w:t>
+      </w:r>
+      <w:r>
+        <w:t>”</w:t>
+      </w:r>
+      <w:bookmarkEnd w:id="10"/>
+    </w:p>
+    <w:p>
+      <w:pPr>
+        <w:spacing w:after="120" w:line="300" w:lineRule="auto"/>
+        <w:ind w:firstLine="420"/>
+      </w:pPr>
+      <w:r>
+        <w:t>最新深度学习架构的另一条主线是多模态基础模型。</w:t>
+      </w:r>
+      <w:r>
+        <w:t xml:space="preserve">Qwen3 </w:t>
+      </w:r>
+      <w:r>
+        <w:t>报告展示了</w:t>
+      </w:r>
+      <w:r>
+        <w:t xml:space="preserve"> dense </w:t>
+      </w:r>
+      <w:r>
+        <w:t>与</w:t>
+      </w:r>
+      <w:r>
+        <w:t xml:space="preserve"> MoE </w:t>
+      </w:r>
+      <w:r>
+        <w:t>等不同模型形态下的能力扩展</w:t>
+      </w:r>
+      <w:r>
+        <w:rPr>
+          <w:sz w:val="18"/>
+          <w:vertAlign w:val="superscript"/>
+        </w:rPr>
+        <w:t>[18]</w:t>
+      </w:r>
+      <w:r>
+        <w:t>；</w:t>
+      </w:r>
+      <w:r>
+        <w:t xml:space="preserve">Qwen3-VL </w:t>
+      </w:r>
+      <w:r>
+        <w:t>则将文本、图像和视频统一到视觉语言模型中，并支持长上下文、多图像和视频理解等能力</w:t>
+      </w:r>
+      <w:r>
+        <w:rPr>
+          <w:sz w:val="18"/>
+          <w:vertAlign w:val="superscript"/>
+        </w:rPr>
+        <w:t>[19]</w:t>
+      </w:r>
+      <w:r>
+        <w:t>。这说明前沿模型正在从</w:t>
+      </w:r>
+      <w:r>
+        <w:t>“</w:t>
+      </w:r>
+      <w:r>
+        <w:t>单一输入、单一输出</w:t>
+      </w:r>
+      <w:r>
+        <w:t>”</w:t>
+      </w:r>
+      <w:r>
+        <w:t>的网络，转向</w:t>
+      </w:r>
+      <w:r>
+        <w:t>“</w:t>
+      </w:r>
+      <w:r>
+        <w:t>多模态编码、跨模态对齐、长上下文记忆、工具调用和安全对齐</w:t>
+      </w:r>
+      <w:r>
+        <w:t>”</w:t>
+      </w:r>
+      <w:r>
+        <w:t>的系统。</w:t>
+      </w:r>
+    </w:p>
+    <w:p>
+      <w:pPr>
+        <w:spacing w:after="120" w:line="300" w:lineRule="auto"/>
+        <w:ind w:firstLine="420"/>
+      </w:pPr>
+      <w:r>
+        <w:t xml:space="preserve">2026 </w:t>
+      </w:r>
+      <w:r>
+        <w:t>年</w:t>
+      </w:r>
+      <w:r>
+        <w:t xml:space="preserve"> AI Index </w:t>
+      </w:r>
+      <w:r>
+        <w:t>也显示，前沿</w:t>
+      </w:r>
+      <w:r>
+        <w:t xml:space="preserve"> AI </w:t>
+      </w:r>
+      <w:r>
+        <w:t>能力仍在加速，产业界贡献了大多数</w:t>
+      </w:r>
+      <w:r>
+        <w:t xml:space="preserve"> notable frontier models</w:t>
+      </w:r>
+      <w:r>
+        <w:t>，模型在多模态推理、科学问题和代码任务上持续提升，但负责任</w:t>
+      </w:r>
+      <w:r>
+        <w:t xml:space="preserve"> AI </w:t>
+      </w:r>
+      <w:r>
+        <w:t>测量、基础设施能耗和治理能力仍然落后于能力增长</w:t>
+      </w:r>
+      <w:r>
+        <w:rPr>
+          <w:sz w:val="18"/>
+          <w:vertAlign w:val="superscript"/>
+        </w:rPr>
+        <w:t>[20]</w:t>
+      </w:r>
+      <w:r>
+        <w:t>。这提醒我们：最新架构不是只看</w:t>
+      </w:r>
+      <w:r>
+        <w:t xml:space="preserve"> benchmark </w:t>
+      </w:r>
+      <w:r>
+        <w:t>分数，还要看成本、透明度、可靠性和社会部署条件。</w:t>
+      </w:r>
+    </w:p>
+    <w:p>
+      <w:pPr>
+        <w:spacing w:before="120"/>
+        <w:jc w:val="center"/>
+      </w:pPr>
+      <w:r>
+        <w:rPr>
+          <w:noProof/>
+        </w:rPr>
+        <w:lastRenderedPageBreak/>
+        <w:drawing>
+          <wp:inline distT="0" distB="0" distL="0" distR="0" wp14:anchorId="615DA28E" wp14:editId="60320B62">
+            <wp:extent cx="4968000" cy="2795986"/>
+            <wp:effectExtent l="0" t="0" r="0" b="0"/>
+            <wp:docPr id="2" name="Picture 2"/>
+            <wp:cNvGraphicFramePr>
+              <a:graphicFrameLocks xmlns:a="http://schemas.openxmlformats.org/drawingml/2006/main" noChangeAspect="1"/>
+            </wp:cNvGraphicFramePr>
+            <a:graphic xmlns:a="http://schemas.openxmlformats.org/drawingml/2006/main">
+              <a:graphicData uri="http://schemas.openxmlformats.org/drawingml/2006/picture">
+                <pic:pic xmlns:pic="http://schemas.openxmlformats.org/drawingml/2006/picture">
+                  <pic:nvPicPr>
+                    <pic:cNvPr id="0" name="ai-current-architecture-landscape.png"/>
                     <pic:cNvPicPr/>
                   </pic:nvPicPr>
                   <pic:blipFill>
@@ -2647,10 +3854,16 @@
         <w:t>图</w:t>
       </w:r>
       <w:r>
-        <w:t xml:space="preserve">2.1 </w:t>
-      </w:r>
-      <w:r>
-        <w:t>深度学习模型架构演化概念图</w:t>
+        <w:t xml:space="preserve">3.1 </w:t>
+      </w:r>
+      <w:r>
+        <w:t>后</w:t>
+      </w:r>
+      <w:r>
+        <w:t xml:space="preserve"> Transformer </w:t>
+      </w:r>
+      <w:r>
+        <w:t>时代主要架构方向概念图</w:t>
       </w:r>
     </w:p>
     <w:p>
@@ -2659,1144 +3872,31 @@
         <w:ind w:firstLine="420"/>
       </w:pPr>
       <w:r>
-        <w:t>图中将深度学习模型演化概括为八个阶段。它不是严格的历史年表，而是强调每个阶段解决</w:t>
-      </w:r>
-      <w:r>
-        <w:lastRenderedPageBreak/>
-        <w:t>的主要问题：从可学习分类器，到可训练深层网络，再到空间层级、序列记忆、并行注意力、基础模型、稀疏路由和长上下文效率。</w:t>
-      </w:r>
-    </w:p>
-    <w:p>
-      <w:pPr>
-        <w:pStyle w:val="21"/>
-        <w:spacing w:before="200" w:after="80"/>
-      </w:pPr>
-      <w:bookmarkStart w:id="5" w:name="_Toc232187413"/>
-      <w:r>
-        <w:t xml:space="preserve">2.4 Transformer </w:t>
-      </w:r>
-      <w:r>
-        <w:t>与预训练范式</w:t>
-      </w:r>
-      <w:bookmarkEnd w:id="5"/>
-    </w:p>
-    <w:p>
-      <w:pPr>
-        <w:spacing w:after="120" w:line="300" w:lineRule="auto"/>
-        <w:ind w:firstLine="420"/>
-      </w:pPr>
-      <w:r>
-        <w:t xml:space="preserve">Transformer </w:t>
-      </w:r>
-      <w:r>
-        <w:t>的突破在于用自注意力取代循环结构，使序列建模可以更充分地并行化，并让模型直接学习任意</w:t>
-      </w:r>
-      <w:r>
-        <w:t xml:space="preserve"> token </w:t>
-      </w:r>
-      <w:r>
-        <w:t>之间的依赖关系</w:t>
-      </w:r>
-      <w:r>
-        <w:rPr>
-          <w:sz w:val="18"/>
-          <w:vertAlign w:val="superscript"/>
-        </w:rPr>
-        <w:t>[8]</w:t>
-      </w:r>
-      <w:r>
-        <w:t>。</w:t>
-      </w:r>
-      <w:r>
-        <w:t xml:space="preserve">BERT </w:t>
-      </w:r>
-      <w:r>
-        <w:t>展示了大规模无监督预训练加下游微调的有效性，强调双向上下文表示</w:t>
-      </w:r>
-      <w:r>
-        <w:rPr>
-          <w:sz w:val="18"/>
-          <w:vertAlign w:val="superscript"/>
-        </w:rPr>
-        <w:t>[9]</w:t>
-      </w:r>
-      <w:r>
-        <w:t>；</w:t>
-      </w:r>
-      <w:r>
-        <w:t xml:space="preserve">GPT-3 </w:t>
-      </w:r>
-      <w:r>
-        <w:t>则进一步展示了规模化语言模型在少样本提示下的泛化能力</w:t>
-      </w:r>
-      <w:r>
-        <w:rPr>
-          <w:sz w:val="18"/>
-          <w:vertAlign w:val="superscript"/>
-        </w:rPr>
-        <w:t>[10]</w:t>
-      </w:r>
-      <w:r>
-        <w:t>。这一阶段的变化非常关键：模型不再只是为某个单一任务从零训练，而是先在大规模数据上形成通用表示，再通过提示、微调或对齐服务不同任务。</w:t>
-      </w:r>
-    </w:p>
-    <w:p>
-      <w:pPr>
-        <w:spacing w:after="120" w:line="300" w:lineRule="auto"/>
-        <w:ind w:firstLine="420"/>
-      </w:pPr>
-      <w:r>
-        <w:t xml:space="preserve">Transformer </w:t>
-      </w:r>
-      <w:r>
-        <w:t>也跨出了语言领域。</w:t>
-      </w:r>
-      <w:r>
-        <w:t xml:space="preserve">Vision Transformer </w:t>
-      </w:r>
-      <w:r>
-        <w:t>将图像切成</w:t>
-      </w:r>
-      <w:r>
-        <w:t xml:space="preserve"> patch</w:t>
-      </w:r>
-      <w:r>
-        <w:t>，并把视觉问题转换成</w:t>
-      </w:r>
-      <w:r>
-        <w:t xml:space="preserve"> token </w:t>
-      </w:r>
-      <w:r>
-        <w:t>序列建模问题</w:t>
-      </w:r>
-      <w:r>
-        <w:rPr>
-          <w:sz w:val="18"/>
-          <w:vertAlign w:val="superscript"/>
-        </w:rPr>
-        <w:t>[11]</w:t>
-      </w:r>
-      <w:r>
-        <w:t>。扩散模型则在生成任务中形成另一条主线，</w:t>
-      </w:r>
-      <w:r>
-        <w:t xml:space="preserve">DDPM </w:t>
-      </w:r>
-      <w:r>
-        <w:t>通过逐步去噪实现高质量生成</w:t>
-      </w:r>
-      <w:r>
-        <w:rPr>
-          <w:sz w:val="18"/>
-          <w:vertAlign w:val="superscript"/>
-        </w:rPr>
-        <w:t>[12]</w:t>
-      </w:r>
-      <w:r>
-        <w:t>，</w:t>
-      </w:r>
-      <w:r>
-        <w:t xml:space="preserve">DiT </w:t>
-      </w:r>
-      <w:r>
-        <w:t>又把</w:t>
+        <w:t>这张图把后</w:t>
       </w:r>
       <w:r>
         <w:t xml:space="preserve"> Transformer </w:t>
       </w:r>
       <w:r>
-        <w:t>引入扩散模型主干，进一步说明</w:t>
-      </w:r>
-      <w:r>
-        <w:t xml:space="preserve"> token </w:t>
-      </w:r>
-      <w:r>
-        <w:t>化和注意力结构正在成为多模态建模的通用接口</w:t>
-      </w:r>
-      <w:r>
-        <w:rPr>
-          <w:sz w:val="18"/>
-          <w:vertAlign w:val="superscript"/>
-        </w:rPr>
-        <w:t>[13]</w:t>
-      </w:r>
-      <w:r>
-        <w:t>。</w:t>
-      </w:r>
-    </w:p>
-    <w:tbl>
-      <w:tblPr>
-        <w:tblStyle w:val="af"/>
-        <w:tblW w:w="0" w:type="auto"/>
-        <w:jc w:val="center"/>
-        <w:tblLook w:val="04A0" w:firstRow="1" w:lastRow="0" w:firstColumn="1" w:lastColumn="0" w:noHBand="0" w:noVBand="1"/>
-      </w:tblPr>
-      <w:tblGrid>
-        <w:gridCol w:w="2181"/>
-        <w:gridCol w:w="2180"/>
-        <w:gridCol w:w="2180"/>
-        <w:gridCol w:w="2180"/>
-      </w:tblGrid>
-      <w:tr>
-        <w:trPr>
-          <w:jc w:val="center"/>
-        </w:trPr>
-        <w:tc>
-          <w:tcPr>
-            <w:tcW w:w="2183" w:type="dxa"/>
-            <w:shd w:val="clear" w:color="auto" w:fill="D9EAF7"/>
-            <w:vAlign w:val="center"/>
-          </w:tcPr>
-          <w:p>
-            <w:pPr>
-              <w:jc w:val="center"/>
-            </w:pPr>
-            <w:r>
-              <w:rPr>
-                <w:b/>
-              </w:rPr>
-              <w:t>阶段</w:t>
-            </w:r>
-          </w:p>
-        </w:tc>
-        <w:tc>
-          <w:tcPr>
-            <w:tcW w:w="2183" w:type="dxa"/>
-            <w:shd w:val="clear" w:color="auto" w:fill="D9EAF7"/>
-            <w:vAlign w:val="center"/>
-          </w:tcPr>
-          <w:p>
-            <w:pPr>
-              <w:jc w:val="center"/>
-            </w:pPr>
-            <w:r>
-              <w:rPr>
-                <w:b/>
-              </w:rPr>
-              <w:t>主要结构</w:t>
-            </w:r>
-          </w:p>
-        </w:tc>
-        <w:tc>
-          <w:tcPr>
-            <w:tcW w:w="2183" w:type="dxa"/>
-            <w:shd w:val="clear" w:color="auto" w:fill="D9EAF7"/>
-            <w:vAlign w:val="center"/>
-          </w:tcPr>
-          <w:p>
-            <w:pPr>
-              <w:jc w:val="center"/>
-            </w:pPr>
-            <w:r>
-              <w:rPr>
-                <w:b/>
-              </w:rPr>
-              <w:t>解决的瓶颈</w:t>
-            </w:r>
-          </w:p>
-        </w:tc>
-        <w:tc>
-          <w:tcPr>
-            <w:tcW w:w="2183" w:type="dxa"/>
-            <w:shd w:val="clear" w:color="auto" w:fill="D9EAF7"/>
-            <w:vAlign w:val="center"/>
-          </w:tcPr>
-          <w:p>
-            <w:pPr>
-              <w:jc w:val="center"/>
-            </w:pPr>
-            <w:r>
-              <w:rPr>
-                <w:b/>
-              </w:rPr>
-              <w:t>新问题</w:t>
-            </w:r>
-          </w:p>
-        </w:tc>
-      </w:tr>
-      <w:tr>
-        <w:trPr>
-          <w:jc w:val="center"/>
-        </w:trPr>
-        <w:tc>
-          <w:tcPr>
-            <w:tcW w:w="2183" w:type="dxa"/>
-            <w:vAlign w:val="center"/>
-          </w:tcPr>
-          <w:p>
-            <w:pPr>
-              <w:jc w:val="center"/>
-            </w:pPr>
-            <w:r>
-              <w:rPr>
-                <w:sz w:val="20"/>
-              </w:rPr>
-              <w:t>感知机</w:t>
-            </w:r>
-            <w:r>
-              <w:rPr>
-                <w:sz w:val="20"/>
-              </w:rPr>
-              <w:t>/</w:t>
-            </w:r>
-            <w:r>
-              <w:rPr>
-                <w:sz w:val="20"/>
-              </w:rPr>
-              <w:t>浅层网络</w:t>
-            </w:r>
-          </w:p>
-        </w:tc>
-        <w:tc>
-          <w:tcPr>
-            <w:tcW w:w="2183" w:type="dxa"/>
-            <w:vAlign w:val="center"/>
-          </w:tcPr>
-          <w:p>
-            <w:pPr>
-              <w:jc w:val="center"/>
-            </w:pPr>
-            <w:r>
-              <w:rPr>
-                <w:sz w:val="20"/>
-              </w:rPr>
-              <w:t>线性分类器、简单神经元</w:t>
-            </w:r>
-          </w:p>
-        </w:tc>
-        <w:tc>
-          <w:tcPr>
-            <w:tcW w:w="2183" w:type="dxa"/>
-            <w:vAlign w:val="center"/>
-          </w:tcPr>
-          <w:p>
-            <w:pPr>
-              <w:jc w:val="center"/>
-            </w:pPr>
-            <w:r>
-              <w:rPr>
-                <w:sz w:val="20"/>
-              </w:rPr>
-              <w:t>从规则到学习</w:t>
-            </w:r>
-          </w:p>
-        </w:tc>
-        <w:tc>
-          <w:tcPr>
-            <w:tcW w:w="2183" w:type="dxa"/>
-            <w:vAlign w:val="center"/>
-          </w:tcPr>
-          <w:p>
-            <w:pPr>
-              <w:jc w:val="center"/>
-            </w:pPr>
-            <w:r>
-              <w:rPr>
-                <w:sz w:val="20"/>
-              </w:rPr>
-              <w:t>表示能力弱</w:t>
-            </w:r>
-          </w:p>
-        </w:tc>
-      </w:tr>
-      <w:tr>
-        <w:trPr>
-          <w:jc w:val="center"/>
-        </w:trPr>
-        <w:tc>
-          <w:tcPr>
-            <w:tcW w:w="2183" w:type="dxa"/>
-            <w:vAlign w:val="center"/>
-          </w:tcPr>
-          <w:p>
-            <w:pPr>
-              <w:jc w:val="center"/>
-            </w:pPr>
-            <w:r>
-              <w:rPr>
-                <w:sz w:val="20"/>
-              </w:rPr>
-              <w:t>CNN/ResNet</w:t>
-            </w:r>
-          </w:p>
-        </w:tc>
-        <w:tc>
-          <w:tcPr>
-            <w:tcW w:w="2183" w:type="dxa"/>
-            <w:vAlign w:val="center"/>
-          </w:tcPr>
-          <w:p>
-            <w:pPr>
-              <w:jc w:val="center"/>
-            </w:pPr>
-            <w:r>
-              <w:rPr>
-                <w:sz w:val="20"/>
-              </w:rPr>
-              <w:t>卷积、残差连接</w:t>
-            </w:r>
-          </w:p>
-        </w:tc>
-        <w:tc>
-          <w:tcPr>
-            <w:tcW w:w="2183" w:type="dxa"/>
-            <w:vAlign w:val="center"/>
-          </w:tcPr>
-          <w:p>
-            <w:pPr>
-              <w:jc w:val="center"/>
-            </w:pPr>
-            <w:r>
-              <w:rPr>
-                <w:sz w:val="20"/>
-              </w:rPr>
-              <w:t>空间层级与深层优化</w:t>
-            </w:r>
-          </w:p>
-        </w:tc>
-        <w:tc>
-          <w:tcPr>
-            <w:tcW w:w="2183" w:type="dxa"/>
-            <w:vAlign w:val="center"/>
-          </w:tcPr>
-          <w:p>
-            <w:pPr>
-              <w:jc w:val="center"/>
-            </w:pPr>
-            <w:r>
-              <w:rPr>
-                <w:sz w:val="20"/>
-              </w:rPr>
-              <w:t>跨模态统一性不足</w:t>
-            </w:r>
-          </w:p>
-        </w:tc>
-      </w:tr>
-      <w:tr>
-        <w:trPr>
-          <w:jc w:val="center"/>
-        </w:trPr>
-        <w:tc>
-          <w:tcPr>
-            <w:tcW w:w="2183" w:type="dxa"/>
-            <w:vAlign w:val="center"/>
-          </w:tcPr>
-          <w:p>
-            <w:pPr>
-              <w:jc w:val="center"/>
-            </w:pPr>
-            <w:r>
-              <w:rPr>
-                <w:sz w:val="20"/>
-              </w:rPr>
-              <w:t>RNN/LSTM</w:t>
-            </w:r>
-          </w:p>
-        </w:tc>
-        <w:tc>
-          <w:tcPr>
-            <w:tcW w:w="2183" w:type="dxa"/>
-            <w:vAlign w:val="center"/>
-          </w:tcPr>
-          <w:p>
-            <w:pPr>
-              <w:jc w:val="center"/>
-            </w:pPr>
-            <w:r>
-              <w:rPr>
-                <w:sz w:val="20"/>
-              </w:rPr>
-              <w:t>循环与门控记忆</w:t>
-            </w:r>
-          </w:p>
-        </w:tc>
-        <w:tc>
-          <w:tcPr>
-            <w:tcW w:w="2183" w:type="dxa"/>
-            <w:vAlign w:val="center"/>
-          </w:tcPr>
-          <w:p>
-            <w:pPr>
-              <w:jc w:val="center"/>
-            </w:pPr>
-            <w:r>
-              <w:rPr>
-                <w:sz w:val="20"/>
-              </w:rPr>
-              <w:t>序列依赖</w:t>
-            </w:r>
-          </w:p>
-        </w:tc>
-        <w:tc>
-          <w:tcPr>
-            <w:tcW w:w="2183" w:type="dxa"/>
-            <w:vAlign w:val="center"/>
-          </w:tcPr>
-          <w:p>
-            <w:pPr>
-              <w:jc w:val="center"/>
-            </w:pPr>
-            <w:r>
-              <w:rPr>
-                <w:sz w:val="20"/>
-              </w:rPr>
-              <w:t>并行效率低</w:t>
-            </w:r>
-          </w:p>
-        </w:tc>
-      </w:tr>
-      <w:tr>
-        <w:trPr>
-          <w:jc w:val="center"/>
-        </w:trPr>
-        <w:tc>
-          <w:tcPr>
-            <w:tcW w:w="2183" w:type="dxa"/>
-            <w:vAlign w:val="center"/>
-          </w:tcPr>
-          <w:p>
-            <w:pPr>
-              <w:jc w:val="center"/>
-            </w:pPr>
-            <w:r>
-              <w:rPr>
-                <w:sz w:val="20"/>
-              </w:rPr>
-              <w:t>Transformer</w:t>
-            </w:r>
-          </w:p>
-        </w:tc>
-        <w:tc>
-          <w:tcPr>
-            <w:tcW w:w="2183" w:type="dxa"/>
-            <w:vAlign w:val="center"/>
-          </w:tcPr>
-          <w:p>
-            <w:pPr>
-              <w:jc w:val="center"/>
-            </w:pPr>
-            <w:r>
-              <w:rPr>
-                <w:sz w:val="20"/>
-              </w:rPr>
-              <w:t>自注意力、残差、归一化</w:t>
-            </w:r>
-          </w:p>
-        </w:tc>
-        <w:tc>
-          <w:tcPr>
-            <w:tcW w:w="2183" w:type="dxa"/>
-            <w:vAlign w:val="center"/>
-          </w:tcPr>
-          <w:p>
-            <w:pPr>
-              <w:jc w:val="center"/>
-            </w:pPr>
-            <w:r>
-              <w:rPr>
-                <w:sz w:val="20"/>
-              </w:rPr>
-              <w:t>全局上下文与并行训练</w:t>
-            </w:r>
-          </w:p>
-        </w:tc>
-        <w:tc>
-          <w:tcPr>
-            <w:tcW w:w="2183" w:type="dxa"/>
-            <w:vAlign w:val="center"/>
-          </w:tcPr>
-          <w:p>
-            <w:pPr>
-              <w:jc w:val="center"/>
-            </w:pPr>
-            <w:r>
-              <w:rPr>
-                <w:sz w:val="20"/>
-              </w:rPr>
-              <w:t>长上下文计算代价高</w:t>
-            </w:r>
-          </w:p>
-        </w:tc>
-      </w:tr>
-      <w:tr>
-        <w:trPr>
-          <w:jc w:val="center"/>
-        </w:trPr>
-        <w:tc>
-          <w:tcPr>
-            <w:tcW w:w="2183" w:type="dxa"/>
-            <w:vAlign w:val="center"/>
-          </w:tcPr>
-          <w:p>
-            <w:pPr>
-              <w:jc w:val="center"/>
-            </w:pPr>
-            <w:r>
-              <w:rPr>
-                <w:sz w:val="20"/>
-              </w:rPr>
-              <w:t>基础模型</w:t>
-            </w:r>
-          </w:p>
-        </w:tc>
-        <w:tc>
-          <w:tcPr>
-            <w:tcW w:w="2183" w:type="dxa"/>
-            <w:vAlign w:val="center"/>
-          </w:tcPr>
-          <w:p>
-            <w:pPr>
-              <w:jc w:val="center"/>
-            </w:pPr>
-            <w:r>
-              <w:rPr>
-                <w:sz w:val="20"/>
-              </w:rPr>
-              <w:t>大规模预训练、提示学习</w:t>
-            </w:r>
-          </w:p>
-        </w:tc>
-        <w:tc>
-          <w:tcPr>
-            <w:tcW w:w="2183" w:type="dxa"/>
-            <w:vAlign w:val="center"/>
-          </w:tcPr>
-          <w:p>
-            <w:pPr>
-              <w:jc w:val="center"/>
-            </w:pPr>
-            <w:r>
-              <w:rPr>
-                <w:sz w:val="20"/>
-              </w:rPr>
-              <w:t>跨任务泛化</w:t>
-            </w:r>
-          </w:p>
-        </w:tc>
-        <w:tc>
-          <w:tcPr>
-            <w:tcW w:w="2183" w:type="dxa"/>
-            <w:vAlign w:val="center"/>
-          </w:tcPr>
-          <w:p>
-            <w:pPr>
-              <w:jc w:val="center"/>
-            </w:pPr>
-            <w:r>
-              <w:rPr>
-                <w:sz w:val="20"/>
-              </w:rPr>
-              <w:t>成本、对齐与可靠性</w:t>
-            </w:r>
-          </w:p>
-        </w:tc>
-      </w:tr>
-    </w:tbl>
-    <w:p/>
-    <w:p>
-      <w:pPr>
-        <w:pStyle w:val="1"/>
-        <w:spacing w:before="240" w:after="120"/>
-        <w:jc w:val="center"/>
-      </w:pPr>
-      <w:bookmarkStart w:id="6" w:name="_Toc232187414"/>
-      <w:r>
-        <w:t>第三章</w:t>
-      </w:r>
-      <w:r>
-        <w:t xml:space="preserve"> </w:t>
-      </w:r>
-      <w:r>
-        <w:t>目前最新的深度学习模型架构</w:t>
-      </w:r>
-      <w:bookmarkEnd w:id="6"/>
-    </w:p>
-    <w:p>
-      <w:pPr>
-        <w:pStyle w:val="21"/>
-        <w:spacing w:before="200" w:after="80"/>
-      </w:pPr>
-      <w:bookmarkStart w:id="7" w:name="_Toc232187415"/>
-      <w:r>
-        <w:t xml:space="preserve">3.1 Dense Transformer </w:t>
-      </w:r>
-      <w:r>
-        <w:t>仍是主干，但不再是唯一答案</w:t>
-      </w:r>
-      <w:bookmarkEnd w:id="7"/>
-    </w:p>
-    <w:p>
-      <w:pPr>
-        <w:spacing w:after="120" w:line="300" w:lineRule="auto"/>
-        <w:ind w:firstLine="420"/>
-      </w:pPr>
-      <w:r>
-        <w:t>截至</w:t>
-      </w:r>
-      <w:r>
-        <w:t xml:space="preserve"> 2026 </w:t>
-      </w:r>
-      <w:r>
-        <w:t>年，</w:t>
-      </w:r>
-      <w:r>
-        <w:t xml:space="preserve">Transformer </w:t>
-      </w:r>
-      <w:r>
-        <w:t>仍然是语言模型、多模态模型和扩散生成模型的核心主干之一。原因很直接：它的自注意力机制通用、并行友好，工程生态成熟，并能与大规模预训练很好结合。但是它的代价也很明显：注意力计算随序列长度增长而变重，大模型全参数激活导致推理成本高，多模态输入和工具调用又进一步放大上下文长度压力。</w:t>
-      </w:r>
-    </w:p>
-    <w:p>
-      <w:pPr>
-        <w:spacing w:after="120" w:line="300" w:lineRule="auto"/>
-        <w:ind w:firstLine="420"/>
-      </w:pPr>
-      <w:r>
-        <w:t>因此，所谓</w:t>
-      </w:r>
-      <w:r>
-        <w:t>“</w:t>
-      </w:r>
-      <w:r>
-        <w:t>最新架构</w:t>
-      </w:r>
-      <w:r>
-        <w:t>”</w:t>
-      </w:r>
-      <w:r>
-        <w:t>更准确地说是后</w:t>
-      </w:r>
-      <w:r>
-        <w:t xml:space="preserve"> Transformer </w:t>
-      </w:r>
-      <w:r>
-        <w:t>时代的架构族群：</w:t>
+        <w:t>时代的架构方向概括为四条并行路线：</w:t>
       </w:r>
       <w:r>
         <w:t xml:space="preserve">Dense Transformer </w:t>
       </w:r>
       <w:r>
-        <w:t>作为基线仍在演进；</w:t>
+        <w:t>保持通用性，</w:t>
       </w:r>
       <w:r>
         <w:t xml:space="preserve">MoE </w:t>
       </w:r>
       <w:r>
-        <w:t>用条件计算提高参数容量与成本比；</w:t>
+        <w:t>追求稀疏激活，</w:t>
       </w:r>
       <w:r>
         <w:t xml:space="preserve">SSM/Mamba </w:t>
       </w:r>
       <w:r>
-        <w:t>试图用线性时间序列建模改善长上下文效率；多模态基础模型则把视觉、文本、视频、语音和工具使用统一到更复杂的系统中。</w:t>
-      </w:r>
-    </w:p>
-    <w:p>
-      <w:pPr>
-        <w:pStyle w:val="21"/>
-        <w:spacing w:before="200" w:after="80"/>
-      </w:pPr>
-      <w:bookmarkStart w:id="8" w:name="_Toc232187416"/>
-      <w:r>
-        <w:lastRenderedPageBreak/>
-        <w:t>3.2 MoE</w:t>
-      </w:r>
-      <w:r>
-        <w:t>：用稀疏激活换取更大容量</w:t>
-      </w:r>
-      <w:bookmarkEnd w:id="8"/>
-    </w:p>
-    <w:p>
-      <w:pPr>
-        <w:spacing w:after="120" w:line="300" w:lineRule="auto"/>
-        <w:ind w:firstLine="420"/>
-      </w:pPr>
-      <w:r>
-        <w:t xml:space="preserve">Mixture of Experts </w:t>
-      </w:r>
-      <w:r>
-        <w:t>的核心想法是让每个</w:t>
-      </w:r>
-      <w:r>
-        <w:t xml:space="preserve"> token </w:t>
-      </w:r>
-      <w:r>
-        <w:t>只激活部分专家网络，从而在总参数规模很大时控制单次计算成本。</w:t>
-      </w:r>
-      <w:r>
-        <w:t xml:space="preserve">Switch Transformer </w:t>
-      </w:r>
-      <w:r>
-        <w:t>展示了用简单稀疏路由扩展到超大参数规模的可行性</w:t>
-      </w:r>
-      <w:r>
-        <w:rPr>
-          <w:sz w:val="18"/>
-          <w:vertAlign w:val="superscript"/>
-        </w:rPr>
-        <w:t>[14]</w:t>
-      </w:r>
-      <w:r>
-        <w:t>。与稀疏专家路线并行，</w:t>
-      </w:r>
-      <w:r>
-        <w:t xml:space="preserve">Mamba </w:t>
-      </w:r>
-      <w:r>
-        <w:t>和</w:t>
-      </w:r>
-      <w:r>
-        <w:t xml:space="preserve"> Mamba-2 </w:t>
-      </w:r>
-      <w:r>
-        <w:t>又从状态空间模型角度重新讨论长序列效率</w:t>
-      </w:r>
-      <w:r>
-        <w:rPr>
-          <w:sz w:val="18"/>
-          <w:vertAlign w:val="superscript"/>
-        </w:rPr>
-        <w:t>[15-16]</w:t>
-      </w:r>
-      <w:r>
-        <w:t>。到</w:t>
-      </w:r>
-      <w:r>
-        <w:t xml:space="preserve"> DeepSeek-V3 </w:t>
-      </w:r>
-      <w:r>
-        <w:t>这类技术报告中，</w:t>
-      </w:r>
-      <w:r>
-        <w:t xml:space="preserve">MoE </w:t>
-      </w:r>
-      <w:r>
-        <w:t>已经成为前沿大语言模型的重要路线之一，其目标不是简单堆参数，而是提高</w:t>
-      </w:r>
-      <w:r>
-        <w:t>“</w:t>
-      </w:r>
-      <w:r>
-        <w:t>模型容量</w:t>
-      </w:r>
-      <w:r>
-        <w:t>/</w:t>
-      </w:r>
-      <w:r>
-        <w:t>实际计算量</w:t>
-      </w:r>
-      <w:r>
-        <w:t>”</w:t>
-      </w:r>
-      <w:r>
-        <w:t>的比值</w:t>
-      </w:r>
-      <w:r>
-        <w:rPr>
-          <w:sz w:val="18"/>
-          <w:vertAlign w:val="superscript"/>
-        </w:rPr>
-        <w:t>[17]</w:t>
-      </w:r>
-      <w:r>
-        <w:t>。</w:t>
-      </w:r>
-    </w:p>
-    <w:p>
-      <w:pPr>
-        <w:spacing w:after="120" w:line="300" w:lineRule="auto"/>
-        <w:ind w:firstLine="420"/>
-      </w:pPr>
-      <w:r>
-        <w:t>但</w:t>
-      </w:r>
-      <w:r>
-        <w:t xml:space="preserve"> MoE </w:t>
-      </w:r>
-      <w:r>
-        <w:t>也带来新的工程问题：路由负载均衡、专家利用率、通信开销、训练稳定性和推理部署复杂度。我的判断是，</w:t>
-      </w:r>
-      <w:r>
-        <w:t xml:space="preserve">MoE </w:t>
-      </w:r>
-      <w:r>
-        <w:t>更像一种</w:t>
-      </w:r>
-      <w:r>
-        <w:t>“</w:t>
-      </w:r>
-      <w:r>
-        <w:t>系统架构</w:t>
-      </w:r>
-      <w:r>
-        <w:t>”</w:t>
-      </w:r>
-      <w:r>
-        <w:t>而不是单纯</w:t>
-      </w:r>
-      <w:r>
-        <w:t>“</w:t>
-      </w:r>
-      <w:r>
-        <w:t>网络层结构</w:t>
-      </w:r>
-      <w:r>
-        <w:t>”</w:t>
-      </w:r>
-      <w:r>
-        <w:t>：它把模型质量问题部分转化为调度、通信和并行计算问题。未来能否继续扩展，取决于硬件互联、编译器、推理框架和训练算法能否一起进步。</w:t>
-      </w:r>
-    </w:p>
-    <w:p>
-      <w:pPr>
-        <w:pStyle w:val="21"/>
-        <w:spacing w:before="200" w:after="80"/>
-      </w:pPr>
-      <w:bookmarkStart w:id="9" w:name="_Toc232187417"/>
-      <w:r>
-        <w:t>3.3 SSM/Mamba</w:t>
-      </w:r>
-      <w:r>
-        <w:t>：重新思考长序列效率</w:t>
-      </w:r>
-      <w:bookmarkEnd w:id="9"/>
-    </w:p>
-    <w:p>
-      <w:pPr>
-        <w:spacing w:after="120" w:line="300" w:lineRule="auto"/>
-        <w:ind w:firstLine="420"/>
-      </w:pPr>
-      <w:r>
-        <w:t>状态空间模型路线关注的是长序列建模效率。</w:t>
-      </w:r>
-      <w:r>
-        <w:t xml:space="preserve">Mamba </w:t>
-      </w:r>
-      <w:r>
-        <w:t>将选择性状态空间模型整合成端到端序列主干，强调线性时间扩展和硬件友好实现</w:t>
-      </w:r>
-      <w:r>
-        <w:rPr>
-          <w:sz w:val="18"/>
-          <w:vertAlign w:val="superscript"/>
-        </w:rPr>
-        <w:t>[15]</w:t>
-      </w:r>
-      <w:r>
-        <w:t>。</w:t>
-      </w:r>
-      <w:r>
-        <w:t xml:space="preserve">Mamba-2 </w:t>
-      </w:r>
-      <w:r>
-        <w:t>进一步从结构化状态空间对偶角度建立</w:t>
-      </w:r>
-      <w:r>
-        <w:t xml:space="preserve"> SSM </w:t>
-      </w:r>
-      <w:r>
-        <w:t>与注意力之间的联系，并报告更高效的算法设计</w:t>
-      </w:r>
-      <w:r>
-        <w:rPr>
-          <w:sz w:val="18"/>
-          <w:vertAlign w:val="superscript"/>
-        </w:rPr>
-        <w:t>[16]</w:t>
-      </w:r>
-      <w:r>
-        <w:t>。这条路线的重要性在于，它没有把</w:t>
-      </w:r>
-      <w:r>
-        <w:t xml:space="preserve"> Transformer </w:t>
-      </w:r>
-      <w:r>
-        <w:t>视为不可替代的终点，而是追问：长上下文建模到底需要完整二次注意力，还是可以用选择性状态传播实现更高性价比。</w:t>
-      </w:r>
-    </w:p>
-    <w:p>
-      <w:pPr>
-        <w:spacing w:after="120" w:line="300" w:lineRule="auto"/>
-        <w:ind w:firstLine="420"/>
-      </w:pPr>
-      <w:r>
-        <w:t>我认为</w:t>
-      </w:r>
-      <w:r>
-        <w:t xml:space="preserve"> SSM/Mamba </w:t>
-      </w:r>
-      <w:r>
-        <w:t>的未来价值不一定是完全取代</w:t>
-      </w:r>
-      <w:r>
-        <w:t xml:space="preserve"> Transformer</w:t>
-      </w:r>
-      <w:r>
-        <w:t>，而可能是形成混合架构。例如局部高频信息用状态扫描处理，关键跨段关系仍用注意力或检索机制补充。对于长视频、长文档、基因序列、日志序列和持续交互式智能体，这类结构的吸引力会越来越强。</w:t>
-      </w:r>
-    </w:p>
-    <w:p>
-      <w:pPr>
-        <w:pStyle w:val="21"/>
-        <w:spacing w:before="200" w:after="80"/>
-      </w:pPr>
-      <w:bookmarkStart w:id="10" w:name="_Toc232187418"/>
-      <w:r>
-        <w:t xml:space="preserve">3.4 </w:t>
-      </w:r>
-      <w:r>
-        <w:t>多模态基础模型：从</w:t>
-      </w:r>
-      <w:r>
-        <w:t>“</w:t>
-      </w:r>
-      <w:r>
-        <w:t>模型</w:t>
-      </w:r>
-      <w:r>
-        <w:t>”</w:t>
-      </w:r>
-      <w:r>
-        <w:t>走向</w:t>
-      </w:r>
-      <w:r>
-        <w:t>“</w:t>
-      </w:r>
-      <w:r>
-        <w:t>系统</w:t>
-      </w:r>
-      <w:r>
-        <w:t>”</w:t>
-      </w:r>
-      <w:bookmarkEnd w:id="10"/>
-    </w:p>
-    <w:p>
-      <w:pPr>
-        <w:spacing w:after="120" w:line="300" w:lineRule="auto"/>
-        <w:ind w:firstLine="420"/>
-      </w:pPr>
-      <w:r>
-        <w:t>最新深度学习架构的另一条主线是多模态基础模型。</w:t>
-      </w:r>
-      <w:r>
-        <w:t xml:space="preserve">Qwen3 </w:t>
-      </w:r>
-      <w:r>
-        <w:t>报告展示了</w:t>
-      </w:r>
-      <w:r>
-        <w:t xml:space="preserve"> dense </w:t>
-      </w:r>
-      <w:r>
-        <w:t>与</w:t>
-      </w:r>
-      <w:r>
-        <w:t xml:space="preserve"> MoE </w:t>
-      </w:r>
-      <w:r>
-        <w:t>等不同模型形态下的能力扩展</w:t>
-      </w:r>
-      <w:r>
-        <w:rPr>
-          <w:sz w:val="18"/>
-          <w:vertAlign w:val="superscript"/>
-        </w:rPr>
-        <w:t>[18]</w:t>
-      </w:r>
-      <w:r>
-        <w:t>；</w:t>
-      </w:r>
-      <w:r>
-        <w:t xml:space="preserve">Qwen3-VL </w:t>
-      </w:r>
-      <w:r>
-        <w:t>则将文本、图像和视频统一到视觉语言模型中，并支持长上下文、多图像和视频理解等能力</w:t>
-      </w:r>
-      <w:r>
-        <w:rPr>
-          <w:sz w:val="18"/>
-          <w:vertAlign w:val="superscript"/>
-        </w:rPr>
-        <w:t>[19]</w:t>
-      </w:r>
-      <w:r>
-        <w:t>。这说明前沿模型正在从</w:t>
-      </w:r>
-      <w:r>
-        <w:t>“</w:t>
-      </w:r>
-      <w:r>
-        <w:t>单一输入、单一输出</w:t>
-      </w:r>
-      <w:r>
-        <w:t>”</w:t>
-      </w:r>
-      <w:r>
-        <w:t>的网络，转向</w:t>
-      </w:r>
-      <w:r>
-        <w:t>“</w:t>
-      </w:r>
-      <w:r>
-        <w:t>多模态编码、跨模态对齐、长上下文记忆、工具调用和安全对齐</w:t>
-      </w:r>
-      <w:r>
-        <w:t>”</w:t>
-      </w:r>
-      <w:r>
-        <w:t>的系统。</w:t>
-      </w:r>
-    </w:p>
-    <w:p>
-      <w:pPr>
-        <w:spacing w:after="120" w:line="300" w:lineRule="auto"/>
-        <w:ind w:firstLine="420"/>
-      </w:pPr>
-      <w:r>
-        <w:t xml:space="preserve">2026 </w:t>
-      </w:r>
-      <w:r>
-        <w:t>年</w:t>
-      </w:r>
-      <w:r>
-        <w:t xml:space="preserve"> AI Index </w:t>
-      </w:r>
-      <w:r>
-        <w:t>也显示，前沿</w:t>
-      </w:r>
-      <w:r>
-        <w:t xml:space="preserve"> AI </w:t>
-      </w:r>
-      <w:r>
-        <w:t>能力仍在加速，产业界贡献了大多数</w:t>
-      </w:r>
-      <w:r>
-        <w:t xml:space="preserve"> notable frontier models</w:t>
-      </w:r>
-      <w:r>
-        <w:t>，模型在多模态推理、科学问题和代码任务上持续提升，但负责任</w:t>
-      </w:r>
-      <w:r>
-        <w:t xml:space="preserve"> AI </w:t>
-      </w:r>
-      <w:r>
-        <w:t>测量、基础设施能耗和治理能力仍然落后于能力增长</w:t>
-      </w:r>
-      <w:r>
-        <w:rPr>
-          <w:sz w:val="18"/>
-          <w:vertAlign w:val="superscript"/>
-        </w:rPr>
-        <w:t>[20]</w:t>
-      </w:r>
-      <w:r>
-        <w:t>。这提醒我们：最新架构不是只看</w:t>
-      </w:r>
-      <w:r>
-        <w:t xml:space="preserve"> benchmark </w:t>
-      </w:r>
-      <w:r>
-        <w:t>分数，还要看成本、透明度、可靠性和社会部署条件。</w:t>
+        <w:t>追求长序列效率，多模态基础模型追求跨模态统一。图中的检索、工具与安全对齐提醒我们，现代深度学习已经越来越像一个端到端系统，而不是孤立的神经网络层堆叠。</w:t>
       </w:r>
     </w:p>
     <w:p>
@@ -3808,109 +3908,8 @@
         <w:rPr>
           <w:noProof/>
         </w:rPr>
-        <w:lastRenderedPageBreak/>
         <w:drawing>
-          <wp:inline distT="0" distB="0" distL="0" distR="0" wp14:anchorId="733472C0" wp14:editId="3E2333ED">
-            <wp:extent cx="4968000" cy="2795986"/>
-            <wp:effectExtent l="0" t="0" r="0" b="0"/>
-            <wp:docPr id="2" name="Picture 2"/>
-            <wp:cNvGraphicFramePr>
-              <a:graphicFrameLocks xmlns:a="http://schemas.openxmlformats.org/drawingml/2006/main" noChangeAspect="1"/>
-            </wp:cNvGraphicFramePr>
-            <a:graphic xmlns:a="http://schemas.openxmlformats.org/drawingml/2006/main">
-              <a:graphicData uri="http://schemas.openxmlformats.org/drawingml/2006/picture">
-                <pic:pic xmlns:pic="http://schemas.openxmlformats.org/drawingml/2006/picture">
-                  <pic:nvPicPr>
-                    <pic:cNvPr id="0" name="ai-current-architecture-landscape.png"/>
-                    <pic:cNvPicPr/>
-                  </pic:nvPicPr>
-                  <pic:blipFill>
-                    <a:blip r:embed="rId10"/>
-                    <a:stretch>
-                      <a:fillRect/>
-                    </a:stretch>
-                  </pic:blipFill>
-                  <pic:spPr>
-                    <a:xfrm>
-                      <a:off x="0" y="0"/>
-                      <a:ext cx="4968000" cy="2795986"/>
-                    </a:xfrm>
-                    <a:prstGeom prst="rect">
-                      <a:avLst/>
-                    </a:prstGeom>
-                  </pic:spPr>
-                </pic:pic>
-              </a:graphicData>
-            </a:graphic>
-          </wp:inline>
-        </w:drawing>
-      </w:r>
-    </w:p>
-    <w:p>
-      <w:pPr>
-        <w:spacing w:after="120"/>
-        <w:jc w:val="center"/>
-      </w:pPr>
-      <w:r>
-        <w:t>图</w:t>
-      </w:r>
-      <w:r>
-        <w:t xml:space="preserve">3.1 </w:t>
-      </w:r>
-      <w:r>
-        <w:t>后</w:t>
-      </w:r>
-      <w:r>
-        <w:t xml:space="preserve"> Transformer </w:t>
-      </w:r>
-      <w:r>
-        <w:t>时代主要架构方向概念图</w:t>
-      </w:r>
-    </w:p>
-    <w:p>
-      <w:pPr>
-        <w:spacing w:after="120" w:line="300" w:lineRule="auto"/>
-        <w:ind w:firstLine="420"/>
-      </w:pPr>
-      <w:r>
-        <w:t>这张图把后</w:t>
-      </w:r>
-      <w:r>
-        <w:t xml:space="preserve"> Transformer </w:t>
-      </w:r>
-      <w:r>
-        <w:t>时代的架构方向概括为四条并行路线：</w:t>
-      </w:r>
-      <w:r>
-        <w:t xml:space="preserve">Dense Transformer </w:t>
-      </w:r>
-      <w:r>
-        <w:t>保持通用性，</w:t>
-      </w:r>
-      <w:r>
-        <w:t xml:space="preserve">MoE </w:t>
-      </w:r>
-      <w:r>
-        <w:t>追求稀疏激活，</w:t>
-      </w:r>
-      <w:r>
-        <w:t xml:space="preserve">SSM/Mamba </w:t>
-      </w:r>
-      <w:r>
-        <w:t>追求长序列效率，多模态基础模型追求跨模态统一。图中的检索、工具与安全对齐提醒我们，现代深度学习已经越来越像一个端到端系统，而不是孤立的神经网络层堆叠。</w:t>
-      </w:r>
-    </w:p>
-    <w:p>
-      <w:pPr>
-        <w:spacing w:before="120"/>
-        <w:jc w:val="center"/>
-      </w:pPr>
-      <w:r>
-        <w:rPr>
-          <w:noProof/>
-        </w:rPr>
-        <w:drawing>
-          <wp:inline distT="0" distB="0" distL="0" distR="0" wp14:anchorId="678BCE75" wp14:editId="797C43A7">
+          <wp:inline distT="0" distB="0" distL="0" distR="0" wp14:anchorId="7AEBA62F" wp14:editId="3D535561">
             <wp:extent cx="4752000" cy="2645443"/>
             <wp:effectExtent l="0" t="0" r="0" b="0"/>
             <wp:docPr id="3" name="Picture 3"/>
@@ -3925,7 +3924,7 @@
                     <pic:cNvPicPr/>
                   </pic:nvPicPr>
                   <pic:blipFill>
-                    <a:blip r:embed="rId11"/>
+                    <a:blip r:embed="rId10"/>
                     <a:stretch>
                       <a:fillRect/>
                     </a:stretch>
@@ -4449,7 +4448,7 @@
         <w:spacing w:before="240" w:after="120"/>
         <w:jc w:val="center"/>
       </w:pPr>
-      <w:bookmarkStart w:id="11" w:name="_Toc232187419"/>
+      <w:bookmarkStart w:id="11" w:name="_Toc232188032"/>
       <w:r>
         <w:t>第四章</w:t>
       </w:r>
@@ -4466,7 +4465,7 @@
         <w:pStyle w:val="21"/>
         <w:spacing w:before="200" w:after="80"/>
       </w:pPr>
-      <w:bookmarkStart w:id="12" w:name="_Toc232187420"/>
+      <w:bookmarkStart w:id="12" w:name="_Toc232188033"/>
       <w:r>
         <w:t xml:space="preserve">4.1 </w:t>
       </w:r>
@@ -4534,7 +4533,7 @@
         <w:pStyle w:val="21"/>
         <w:spacing w:before="200" w:after="80"/>
       </w:pPr>
-      <w:bookmarkStart w:id="13" w:name="_Toc232187421"/>
+      <w:bookmarkStart w:id="13" w:name="_Toc232188034"/>
       <w:r>
         <w:t xml:space="preserve">4.2 </w:t>
       </w:r>
@@ -4602,7 +4601,7 @@
         <w:pStyle w:val="21"/>
         <w:spacing w:before="200" w:after="80"/>
       </w:pPr>
-      <w:bookmarkStart w:id="14" w:name="_Toc232187422"/>
+      <w:bookmarkStart w:id="14" w:name="_Toc232188035"/>
       <w:r>
         <w:t xml:space="preserve">4.3 </w:t>
       </w:r>
@@ -5151,7 +5150,7 @@
         <w:spacing w:before="240" w:after="120"/>
         <w:jc w:val="center"/>
       </w:pPr>
-      <w:bookmarkStart w:id="15" w:name="_Toc232187423"/>
+      <w:bookmarkStart w:id="15" w:name="_Toc232188036"/>
       <w:r>
         <w:t>第五章</w:t>
       </w:r>
@@ -5240,7 +5239,7 @@
         <w:spacing w:before="240" w:after="120"/>
         <w:jc w:val="center"/>
       </w:pPr>
-      <w:bookmarkStart w:id="16" w:name="_Toc232187424"/>
+      <w:bookmarkStart w:id="16" w:name="_Toc232188037"/>
       <w:r>
         <w:lastRenderedPageBreak/>
         <w:t>参考文献</w:t>
@@ -5268,13 +5267,7 @@
         <w:rPr>
           <w:sz w:val="20"/>
         </w:rPr>
-        <w:t xml:space="preserve">[2] Rosenblatt F. The </w:t>
-      </w:r>
-      <w:r>
-        <w:rPr>
-          <w:sz w:val="20"/>
-        </w:rPr>
-        <w:t>perceptron: A probabilistic model for information storage and organization in the brain[J]. Psychological Review, 1958, 65(6): 386-408. DOI: 10.1037/h0042519.</w:t>
+        <w:t>[2] Rosenblatt F. The perceptron: A probabilistic model for information storage and organization in the brain[J]. Psychological Review, 1958, 65(6): 386-408. DOI: 10.1037/h0042519.</w:t>
       </w:r>
     </w:p>
     <w:p>
@@ -5298,7 +5291,13 @@
         <w:rPr>
           <w:sz w:val="20"/>
         </w:rPr>
-        <w:t>[4] LeCun Y, Bottou L, Bengio Y, et al. Gradient-based learning applied to document recognition[J]. Proceedings of the IEEE, 1998, 86(11): 2278-2324. DOI: 10.1109/5.726791.</w:t>
+        <w:t xml:space="preserve">[4] LeCun Y, Bottou L, Bengio Y, et al. Gradient-based learning applied to </w:t>
+      </w:r>
+      <w:r>
+        <w:rPr>
+          <w:sz w:val="20"/>
+        </w:rPr>
+        <w:t>document recognition[J]. Proceedings of the IEEE, 1998, 86(11): 2278-2324. DOI: 10.1109/5.726791.</w:t>
       </w:r>
     </w:p>
     <w:p>
@@ -5346,7 +5345,13 @@
         <w:rPr>
           <w:sz w:val="20"/>
         </w:rPr>
-        <w:t>[8] Vaswani A, Shazeer N, Parmar N, et al. Attention is all you need[R/OL]. arXiv:1706.03762, 2017[2026-06-12]. DOI: 10.48550/arXiv.1706.03762.</w:t>
+        <w:t xml:space="preserve">[8] Vaswani A, Shazeer N, Parmar N, et al. Attention is all you need[R/OL]. </w:t>
+      </w:r>
+      <w:r>
+        <w:rPr>
+          <w:sz w:val="20"/>
+        </w:rPr>
+        <w:t>arXiv:1706.03762, 2017[2026-06-12]. DOI: 10.48550/arXiv.1706.03762.</w:t>
       </w:r>
     </w:p>
     <w:p>
@@ -5495,6 +5500,7 @@
       </w:r>
     </w:p>
     <w:sectPr>
+      <w:footerReference w:type="default" r:id="rId11"/>
       <w:pgSz w:w="11906" w:h="16838"/>
       <w:pgMar w:top="1440" w:right="1474" w:bottom="1440" w:left="1701" w:header="851" w:footer="992" w:gutter="0"/>
       <w:pgNumType w:start="1"/>
@@ -5526,58 +5532,31 @@
 
 <file path=word/footer1.xml><?xml version="1.0" encoding="utf-8"?>
 <w:ftr xmlns:wpc="http://schemas.microsoft.com/office/word/2010/wordprocessingCanvas" xmlns:cx="http://schemas.microsoft.com/office/drawing/2014/chartex" xmlns:cx1="http://schemas.microsoft.com/office/drawing/2015/9/8/chartex" xmlns:cx2="http://schemas.microsoft.com/office/drawing/2015/10/21/chartex" xmlns:cx3="http://schemas.microsoft.com/office/drawing/2016/5/9/chartex" xmlns:cx4="http://schemas.microsoft.com/office/drawing/2016/5/10/chartex" xmlns:cx5="http://schemas.microsoft.com/office/drawing/2016/5/11/chartex" xmlns:cx6="http://schemas.microsoft.com/office/drawing/2016/5/12/chartex" xmlns:cx7="http://schemas.microsoft.com/office/drawing/2016/5/13/chartex" xmlns:cx8="http://schemas.microsoft.com/office/drawing/2016/5/14/chartex" xmlns:mc="http://schemas.openxmlformats.org/markup-compatibility/2006" xmlns:aink="http://schemas.microsoft.com/office/drawing/2016/ink" xmlns:am3d="http://schemas.microsoft.com/office/drawing/2017/model3d" xmlns:o="urn:schemas-microsoft-com:office:office" xmlns:oel="http://schemas.microsoft.com/office/2019/extlst" xmlns:r="http://schemas.openxmlformats.org/officeDocument/2006/relationships" xmlns:m="http://schemas.openxmlformats.org/officeDocument/2006/math" xmlns:v="urn:schemas-microsoft-com:vml" xmlns:wp14="http://schemas.microsoft.com/office/word/2010/wordprocessingDrawing" xmlns:wp="http://schemas.openxmlformats.org/drawingml/2006/wordprocessingDrawing" xmlns:w10="urn:schemas-microsoft-com:office:word" xmlns:w="http://schemas.openxmlformats.org/wordprocessingml/2006/main" xmlns:w14="http://schemas.microsoft.com/office/word/2010/wordml" xmlns:w15="http://schemas.microsoft.com/office/word/2012/wordml" xmlns:w16cex="http://schemas.microsoft.com/office/word/2018/wordml/cex" xmlns:w16cid="http://schemas.microsoft.com/office/word/2016/wordml/cid" xmlns:w16="http://schemas.microsoft.com/office/word/2018/wordml" xmlns:w16sdtdh="http://schemas.microsoft.com/office/word/2020/wordml/sdtdatahash" xmlns:w16se="http://schemas.microsoft.com/office/word/2015/wordml/symex" xmlns:wpg="http://schemas.microsoft.com/office/word/2010/wordprocessingGroup" xmlns:wpi="http://schemas.microsoft.com/office/word/2010/wordprocessingInk" xmlns:wne="http://schemas.microsoft.com/office/word/2006/wordml" xmlns:wps="http://schemas.microsoft.com/office/word/2010/wordprocessingShape" mc:Ignorable="w14 w15 w16se w16cid w16 w16cex w16sdtdh wp14">
-  <w:p>
-    <w:pPr>
-      <w:pStyle w:val="a9"/>
-      <w:jc w:val="center"/>
-    </w:pPr>
-  </w:p>
-  <w:p>
-    <w:pPr>
-      <w:pStyle w:val="a9"/>
-    </w:pPr>
-  </w:p>
+  <w:p/>
 </w:ftr>
 </file>
 
 <file path=word/footer2.xml><?xml version="1.0" encoding="utf-8"?>
 <w:ftr xmlns:wpc="http://schemas.microsoft.com/office/word/2010/wordprocessingCanvas" xmlns:cx="http://schemas.microsoft.com/office/drawing/2014/chartex" xmlns:cx1="http://schemas.microsoft.com/office/drawing/2015/9/8/chartex" xmlns:cx2="http://schemas.microsoft.com/office/drawing/2015/10/21/chartex" xmlns:cx3="http://schemas.microsoft.com/office/drawing/2016/5/9/chartex" xmlns:cx4="http://schemas.microsoft.com/office/drawing/2016/5/10/chartex" xmlns:cx5="http://schemas.microsoft.com/office/drawing/2016/5/11/chartex" xmlns:cx6="http://schemas.microsoft.com/office/drawing/2016/5/12/chartex" xmlns:cx7="http://schemas.microsoft.com/office/drawing/2016/5/13/chartex" xmlns:cx8="http://schemas.microsoft.com/office/drawing/2016/5/14/chartex" xmlns:mc="http://schemas.openxmlformats.org/markup-compatibility/2006" xmlns:aink="http://schemas.microsoft.com/office/drawing/2016/ink" xmlns:am3d="http://schemas.microsoft.com/office/drawing/2017/model3d" xmlns:o="urn:schemas-microsoft-com:office:office" xmlns:oel="http://schemas.microsoft.com/office/2019/extlst" xmlns:r="http://schemas.openxmlformats.org/officeDocument/2006/relationships" xmlns:m="http://schemas.openxmlformats.org/officeDocument/2006/math" xmlns:v="urn:schemas-microsoft-com:vml" xmlns:wp14="http://schemas.microsoft.com/office/word/2010/wordprocessingDrawing" xmlns:wp="http://schemas.openxmlformats.org/drawingml/2006/wordprocessingDrawing" xmlns:w10="urn:schemas-microsoft-com:office:word" xmlns:w="http://schemas.openxmlformats.org/wordprocessingml/2006/main" xmlns:w14="http://schemas.microsoft.com/office/word/2010/wordml" xmlns:w15="http://schemas.microsoft.com/office/word/2012/wordml" xmlns:w16cex="http://schemas.microsoft.com/office/word/2018/wordml/cex" xmlns:w16cid="http://schemas.microsoft.com/office/word/2016/wordml/cid" xmlns:w16="http://schemas.microsoft.com/office/word/2018/wordml" xmlns:w16sdtdh="http://schemas.microsoft.com/office/word/2020/wordml/sdtdatahash" xmlns:w16se="http://schemas.microsoft.com/office/word/2015/wordml/symex" xmlns:wpg="http://schemas.microsoft.com/office/word/2010/wordprocessingGroup" xmlns:wpi="http://schemas.microsoft.com/office/word/2010/wordprocessingInk" xmlns:wne="http://schemas.microsoft.com/office/word/2006/wordml" xmlns:wps="http://schemas.microsoft.com/office/word/2010/wordprocessingShape" mc:Ignorable="w14 w15 w16se w16cid w16 w16cex w16sdtdh wp14">
-  <w:sdt>
-    <w:sdtPr>
-      <w:id w:val="1427305444"/>
-    </w:sdtPr>
-    <w:sdtEndPr/>
-    <w:sdtContent>
-      <w:p>
-        <w:pPr>
-          <w:pStyle w:val="a9"/>
-          <w:jc w:val="center"/>
-        </w:pPr>
-        <w:r>
-          <w:fldChar w:fldCharType="begin"/>
-        </w:r>
-        <w:r>
-          <w:instrText>PAGE   \* MERGEFORMAT</w:instrText>
-        </w:r>
-        <w:r>
-          <w:fldChar w:fldCharType="separate"/>
-        </w:r>
-        <w:r>
-          <w:rPr>
-            <w:lang w:val="zh-CN"/>
-          </w:rPr>
-          <w:t>2</w:t>
-        </w:r>
-        <w:r>
-          <w:fldChar w:fldCharType="end"/>
-        </w:r>
-      </w:p>
-    </w:sdtContent>
-  </w:sdt>
   <w:p>
     <w:pPr>
-      <w:pStyle w:val="a9"/>
+      <w:jc w:val="center"/>
     </w:pPr>
+    <w:r>
+      <w:fldChar w:fldCharType="begin"/>
+    </w:r>
+    <w:r>
+      <w:instrText>PAGE</w:instrText>
+    </w:r>
+    <w:r>
+      <w:fldChar w:fldCharType="separate"/>
+    </w:r>
+    <w:r>
+      <w:t>1</w:t>
+    </w:r>
+    <w:r>
+      <w:fldChar w:fldCharType="end"/>
+    </w:r>
   </w:p>
 </w:ftr>
 </file>

</xml_diff>